<commit_message>
Phase 2: Data Structures (7 topics)
List, Tuple, Set, Dict, String, comparison, shallow vs deep copy

Co-Authored-By: Claude Fable 5 <noreply@anthropic.com>
Claude-Session: https://claude.ai/code/session_01Vm8nqoCZNTvUn3BNmW1Tgz
</commit_message>
<xml_diff>
--- a/Python_Interview_Theory.docx
+++ b/Python_Interview_Theory.docx
@@ -1237,6 +1237,1393 @@
           <w:szCs w:val="18"/>
         </w:rPr>
         <w:t xml:space="preserve">Implicit casting is done by Python, like int to float in mixed maths. Explicit casting is done by us with int(), str(), list() and so on. Bad conversions raise ValueError, so I always guard casts on outside data with try/except.</w:t>
+      </w:r>
+    </w:p>
+    <w:p>
+      <w:pPr>
+        <w:spacing w:before="200" w:after="60" w:line="230" w:lineRule="auto"/>
+      </w:pPr>
+      <w:r>
+        <w:rPr>
+          <w:b/>
+          <w:color w:val="1F4E79"/>
+          <w:sz w:val="26"/>
+          <w:szCs w:val="26"/>
+        </w:rPr>
+        <w:t xml:space="preserve">Phase 2 - Data Structures</w:t>
+      </w:r>
+    </w:p>
+    <w:p>
+      <w:pPr>
+        <w:spacing w:before="140" w:after="40" w:line="230" w:lineRule="auto"/>
+      </w:pPr>
+      <w:r>
+        <w:rPr>
+          <w:b/>
+          <w:sz w:val="21"/>
+          <w:szCs w:val="21"/>
+        </w:rPr>
+        <w:t xml:space="preserve">2.1  List</w:t>
+      </w:r>
+    </w:p>
+    <w:p>
+      <w:pPr>
+        <w:spacing w:before="0" w:after="40" w:line="230" w:lineRule="auto"/>
+      </w:pPr>
+      <w:r>
+        <w:rPr>
+          <w:b/>
+          <w:sz w:val="18"/>
+          <w:szCs w:val="18"/>
+        </w:rPr>
+        <w:t xml:space="preserve">What it is:  </w:t>
+      </w:r>
+      <w:r>
+        <w:rPr>
+          <w:sz w:val="18"/>
+          <w:szCs w:val="18"/>
+        </w:rPr>
+        <w:t xml:space="preserve">A list is an ordered, changeable collection that can hold any type of items.</w:t>
+      </w:r>
+    </w:p>
+    <w:p>
+      <w:pPr>
+        <w:ind w:left="260" w:hanging="200"/>
+        <w:spacing w:before="0" w:after="25" w:line="230" w:lineRule="auto"/>
+      </w:pPr>
+      <w:r>
+        <w:rPr>
+          <w:sz w:val="18"/>
+          <w:szCs w:val="18"/>
+        </w:rPr>
+        <w:t xml:space="preserve">•   </w:t>
+      </w:r>
+      <w:r>
+        <w:rPr>
+          <w:sz w:val="18"/>
+          <w:szCs w:val="18"/>
+        </w:rPr>
+        <w:t xml:space="preserve">Ordered: items keep the position we gave them, and we can reach any item by index, like items[0].</w:t>
+      </w:r>
+    </w:p>
+    <w:p>
+      <w:pPr>
+        <w:ind w:left="260" w:hanging="200"/>
+        <w:spacing w:before="0" w:after="25" w:line="230" w:lineRule="auto"/>
+      </w:pPr>
+      <w:r>
+        <w:rPr>
+          <w:sz w:val="18"/>
+          <w:szCs w:val="18"/>
+        </w:rPr>
+        <w:t xml:space="preserve">•   </w:t>
+      </w:r>
+      <w:r>
+        <w:rPr>
+          <w:sz w:val="18"/>
+          <w:szCs w:val="18"/>
+        </w:rPr>
+        <w:t xml:space="preserve">Mutable: we can add, remove or change items after the list is made.</w:t>
+      </w:r>
+    </w:p>
+    <w:p>
+      <w:pPr>
+        <w:ind w:left="260" w:hanging="200"/>
+        <w:spacing w:before="0" w:after="25" w:line="230" w:lineRule="auto"/>
+      </w:pPr>
+      <w:r>
+        <w:rPr>
+          <w:sz w:val="18"/>
+          <w:szCs w:val="18"/>
+        </w:rPr>
+        <w:t xml:space="preserve">•   </w:t>
+      </w:r>
+      <w:r>
+        <w:rPr>
+          <w:sz w:val="18"/>
+          <w:szCs w:val="18"/>
+        </w:rPr>
+        <w:t xml:space="preserve">It can mix types: [1, "two", 3.0, [4]] is valid, though mixing is not a good habit.</w:t>
+      </w:r>
+    </w:p>
+    <w:p>
+      <w:pPr>
+        <w:ind w:left="260" w:hanging="200"/>
+        <w:spacing w:before="0" w:after="25" w:line="230" w:lineRule="auto"/>
+      </w:pPr>
+      <w:r>
+        <w:rPr>
+          <w:sz w:val="18"/>
+          <w:szCs w:val="18"/>
+        </w:rPr>
+        <w:t xml:space="preserve">•   </w:t>
+      </w:r>
+      <w:r>
+        <w:rPr>
+          <w:sz w:val="18"/>
+          <w:szCs w:val="18"/>
+        </w:rPr>
+        <w:t xml:space="preserve">Common methods: append (add at end), insert (add at position), extend (join another list), remove (by value), pop (by index, returns the item), sort, reverse.</w:t>
+      </w:r>
+    </w:p>
+    <w:p>
+      <w:pPr>
+        <w:ind w:left="260" w:hanging="200"/>
+        <w:spacing w:before="0" w:after="25" w:line="230" w:lineRule="auto"/>
+      </w:pPr>
+      <w:r>
+        <w:rPr>
+          <w:sz w:val="18"/>
+          <w:szCs w:val="18"/>
+        </w:rPr>
+        <w:t xml:space="preserve">•   </w:t>
+      </w:r>
+      <w:r>
+        <w:rPr>
+          <w:sz w:val="18"/>
+          <w:szCs w:val="18"/>
+        </w:rPr>
+        <w:t xml:space="preserve">Under the hood it is a dynamic array. Reading by index is O(1). append at the end is fast. insert or remove at the front is slow, O(n), because all items shift.</w:t>
+      </w:r>
+    </w:p>
+    <w:p>
+      <w:pPr>
+        <w:ind w:left="260" w:hanging="200"/>
+        <w:spacing w:before="0" w:after="25" w:line="230" w:lineRule="auto"/>
+      </w:pPr>
+      <w:r>
+        <w:rPr>
+          <w:sz w:val="18"/>
+          <w:szCs w:val="18"/>
+        </w:rPr>
+        <w:t xml:space="preserve">•   </w:t>
+      </w:r>
+      <w:r>
+        <w:rPr>
+          <w:sz w:val="18"/>
+          <w:szCs w:val="18"/>
+        </w:rPr>
+        <w:t xml:space="preserve">Slicing gives a new list: items[1:4], items[::-1] for reverse copy.</w:t>
+      </w:r>
+    </w:p>
+    <w:p>
+      <w:pPr>
+        <w:ind w:left="260" w:hanging="200"/>
+        <w:spacing w:before="0" w:after="25" w:line="230" w:lineRule="auto"/>
+      </w:pPr>
+      <w:r>
+        <w:rPr>
+          <w:sz w:val="18"/>
+          <w:szCs w:val="18"/>
+        </w:rPr>
+        <w:t xml:space="preserve">•   </w:t>
+      </w:r>
+      <w:r>
+        <w:rPr>
+          <w:sz w:val="18"/>
+          <w:szCs w:val="18"/>
+        </w:rPr>
+        <w:t xml:space="preserve">For heavy adding and removing at both ends, collections.deque is faster than a list.</w:t>
+      </w:r>
+    </w:p>
+    <w:p>
+      <w:pPr>
+        <w:ind w:left="120" w:hanging="0"/>
+        <w:spacing w:before="50" w:after="110" w:line="230" w:lineRule="auto"/>
+        <w:pBdr>
+          <w:left w:val="single" w:sz="12" w:space="4" w:color="2E5E1F"/>
+        </w:pBdr>
+      </w:pPr>
+      <w:r>
+        <w:rPr>
+          <w:b/>
+          <w:color w:val="2E5E1F"/>
+          <w:sz w:val="18"/>
+          <w:szCs w:val="18"/>
+        </w:rPr>
+        <w:t xml:space="preserve">Interview answer:  </w:t>
+      </w:r>
+      <w:r>
+        <w:rPr>
+          <w:i/>
+          <w:sz w:val="18"/>
+          <w:szCs w:val="18"/>
+        </w:rPr>
+        <w:t xml:space="preserve">A list is Python's ordered, mutable collection, backed by a dynamic array. Index access and append are fast, but inserting at the front is O(n). I use it when order matters and the data will change.</w:t>
+      </w:r>
+    </w:p>
+    <w:p>
+      <w:pPr>
+        <w:spacing w:before="140" w:after="40" w:line="230" w:lineRule="auto"/>
+      </w:pPr>
+      <w:r>
+        <w:rPr>
+          <w:b/>
+          <w:sz w:val="21"/>
+          <w:szCs w:val="21"/>
+        </w:rPr>
+        <w:t xml:space="preserve">2.2  Tuple</w:t>
+      </w:r>
+    </w:p>
+    <w:p>
+      <w:pPr>
+        <w:spacing w:before="0" w:after="40" w:line="230" w:lineRule="auto"/>
+      </w:pPr>
+      <w:r>
+        <w:rPr>
+          <w:b/>
+          <w:sz w:val="18"/>
+          <w:szCs w:val="18"/>
+        </w:rPr>
+        <w:t xml:space="preserve">What it is:  </w:t>
+      </w:r>
+      <w:r>
+        <w:rPr>
+          <w:sz w:val="18"/>
+          <w:szCs w:val="18"/>
+        </w:rPr>
+        <w:t xml:space="preserve">A tuple is an ordered collection like a list, but it cannot be changed after creation.</w:t>
+      </w:r>
+    </w:p>
+    <w:p>
+      <w:pPr>
+        <w:ind w:left="260" w:hanging="200"/>
+        <w:spacing w:before="0" w:after="25" w:line="230" w:lineRule="auto"/>
+      </w:pPr>
+      <w:r>
+        <w:rPr>
+          <w:sz w:val="18"/>
+          <w:szCs w:val="18"/>
+        </w:rPr>
+        <w:t xml:space="preserve">•   </w:t>
+      </w:r>
+      <w:r>
+        <w:rPr>
+          <w:sz w:val="18"/>
+          <w:szCs w:val="18"/>
+        </w:rPr>
+        <w:t xml:space="preserve">Immutable: no append, no remove, no item assignment. Any "change" needs a new tuple.</w:t>
+      </w:r>
+    </w:p>
+    <w:p>
+      <w:pPr>
+        <w:ind w:left="260" w:hanging="200"/>
+        <w:spacing w:before="0" w:after="25" w:line="230" w:lineRule="auto"/>
+      </w:pPr>
+      <w:r>
+        <w:rPr>
+          <w:sz w:val="18"/>
+          <w:szCs w:val="18"/>
+        </w:rPr>
+        <w:t xml:space="preserve">•   </w:t>
+      </w:r>
+      <w:r>
+        <w:rPr>
+          <w:sz w:val="18"/>
+          <w:szCs w:val="18"/>
+        </w:rPr>
+        <w:t xml:space="preserve">Written with round brackets: (1, 2, 3). A single item tuple needs a comma: (5,).</w:t>
+      </w:r>
+    </w:p>
+    <w:p>
+      <w:pPr>
+        <w:ind w:left="260" w:hanging="200"/>
+        <w:spacing w:before="0" w:after="25" w:line="230" w:lineRule="auto"/>
+      </w:pPr>
+      <w:r>
+        <w:rPr>
+          <w:sz w:val="18"/>
+          <w:szCs w:val="18"/>
+        </w:rPr>
+        <w:t xml:space="preserve">•   </w:t>
+      </w:r>
+      <w:r>
+        <w:rPr>
+          <w:sz w:val="18"/>
+          <w:szCs w:val="18"/>
+        </w:rPr>
+        <w:t xml:space="preserve">Because it is immutable, a tuple can be a dictionary key or a set member. A list cannot.</w:t>
+      </w:r>
+    </w:p>
+    <w:p>
+      <w:pPr>
+        <w:ind w:left="260" w:hanging="200"/>
+        <w:spacing w:before="0" w:after="25" w:line="230" w:lineRule="auto"/>
+      </w:pPr>
+      <w:r>
+        <w:rPr>
+          <w:sz w:val="18"/>
+          <w:szCs w:val="18"/>
+        </w:rPr>
+        <w:t xml:space="preserve">•   </w:t>
+      </w:r>
+      <w:r>
+        <w:rPr>
+          <w:sz w:val="18"/>
+          <w:szCs w:val="18"/>
+        </w:rPr>
+        <w:t xml:space="preserve">It is a little faster and uses a little less memory than a list of the same items.</w:t>
+      </w:r>
+    </w:p>
+    <w:p>
+      <w:pPr>
+        <w:ind w:left="260" w:hanging="200"/>
+        <w:spacing w:before="0" w:after="25" w:line="230" w:lineRule="auto"/>
+      </w:pPr>
+      <w:r>
+        <w:rPr>
+          <w:sz w:val="18"/>
+          <w:szCs w:val="18"/>
+        </w:rPr>
+        <w:t xml:space="preserve">•   </w:t>
+      </w:r>
+      <w:r>
+        <w:rPr>
+          <w:sz w:val="18"/>
+          <w:szCs w:val="18"/>
+        </w:rPr>
+        <w:t xml:space="preserve">Great for fixed records, like a point (x, y) or a database row, where position has meaning.</w:t>
+      </w:r>
+    </w:p>
+    <w:p>
+      <w:pPr>
+        <w:ind w:left="260" w:hanging="200"/>
+        <w:spacing w:before="0" w:after="25" w:line="230" w:lineRule="auto"/>
+      </w:pPr>
+      <w:r>
+        <w:rPr>
+          <w:sz w:val="18"/>
+          <w:szCs w:val="18"/>
+        </w:rPr>
+        <w:t xml:space="preserve">•   </w:t>
+      </w:r>
+      <w:r>
+        <w:rPr>
+          <w:sz w:val="18"/>
+          <w:szCs w:val="18"/>
+        </w:rPr>
+        <w:t xml:space="preserve">Tuple unpacking is common: x, y = point, or a, b = b, a to swap values.</w:t>
+      </w:r>
+    </w:p>
+    <w:p>
+      <w:pPr>
+        <w:ind w:left="260" w:hanging="200"/>
+        <w:spacing w:before="0" w:after="25" w:line="230" w:lineRule="auto"/>
+      </w:pPr>
+      <w:r>
+        <w:rPr>
+          <w:sz w:val="18"/>
+          <w:szCs w:val="18"/>
+        </w:rPr>
+        <w:t xml:space="preserve">•   </w:t>
+      </w:r>
+      <w:r>
+        <w:rPr>
+          <w:sz w:val="18"/>
+          <w:szCs w:val="18"/>
+        </w:rPr>
+        <w:t xml:space="preserve">Note: if a tuple holds a list inside, that inner list can still change. The tuple only fixes which objects it holds, not their inner state.</w:t>
+      </w:r>
+    </w:p>
+    <w:p>
+      <w:pPr>
+        <w:ind w:left="120" w:hanging="0"/>
+        <w:spacing w:before="50" w:after="110" w:line="230" w:lineRule="auto"/>
+        <w:pBdr>
+          <w:left w:val="single" w:sz="12" w:space="4" w:color="2E5E1F"/>
+        </w:pBdr>
+      </w:pPr>
+      <w:r>
+        <w:rPr>
+          <w:b/>
+          <w:color w:val="2E5E1F"/>
+          <w:sz w:val="18"/>
+          <w:szCs w:val="18"/>
+        </w:rPr>
+        <w:t xml:space="preserve">Interview answer:  </w:t>
+      </w:r>
+      <w:r>
+        <w:rPr>
+          <w:i/>
+          <w:sz w:val="18"/>
+          <w:szCs w:val="18"/>
+        </w:rPr>
+        <w:t xml:space="preserve">A tuple is an immutable ordered collection. It is hashable, so it can be a dict key, it is slightly faster than a list, and it is best for fixed data like coordinates or records. I use a list when data changes and a tuple when it should not.</w:t>
+      </w:r>
+    </w:p>
+    <w:p>
+      <w:pPr>
+        <w:spacing w:before="140" w:after="40" w:line="230" w:lineRule="auto"/>
+      </w:pPr>
+      <w:r>
+        <w:rPr>
+          <w:b/>
+          <w:sz w:val="21"/>
+          <w:szCs w:val="21"/>
+        </w:rPr>
+        <w:t xml:space="preserve">2.3  Set</w:t>
+      </w:r>
+    </w:p>
+    <w:p>
+      <w:pPr>
+        <w:spacing w:before="0" w:after="40" w:line="230" w:lineRule="auto"/>
+      </w:pPr>
+      <w:r>
+        <w:rPr>
+          <w:b/>
+          <w:sz w:val="18"/>
+          <w:szCs w:val="18"/>
+        </w:rPr>
+        <w:t xml:space="preserve">What it is:  </w:t>
+      </w:r>
+      <w:r>
+        <w:rPr>
+          <w:sz w:val="18"/>
+          <w:szCs w:val="18"/>
+        </w:rPr>
+        <w:t xml:space="preserve">A set is an unordered collection of unique items.</w:t>
+      </w:r>
+    </w:p>
+    <w:p>
+      <w:pPr>
+        <w:ind w:left="260" w:hanging="200"/>
+        <w:spacing w:before="0" w:after="25" w:line="230" w:lineRule="auto"/>
+      </w:pPr>
+      <w:r>
+        <w:rPr>
+          <w:sz w:val="18"/>
+          <w:szCs w:val="18"/>
+        </w:rPr>
+        <w:t xml:space="preserve">•   </w:t>
+      </w:r>
+      <w:r>
+        <w:rPr>
+          <w:sz w:val="18"/>
+          <w:szCs w:val="18"/>
+        </w:rPr>
+        <w:t xml:space="preserve">Duplicates are removed automatically: set([1, 1, 2]) becomes {1, 2}.</w:t>
+      </w:r>
+    </w:p>
+    <w:p>
+      <w:pPr>
+        <w:ind w:left="260" w:hanging="200"/>
+        <w:spacing w:before="0" w:after="25" w:line="230" w:lineRule="auto"/>
+      </w:pPr>
+      <w:r>
+        <w:rPr>
+          <w:sz w:val="18"/>
+          <w:szCs w:val="18"/>
+        </w:rPr>
+        <w:t xml:space="preserve">•   </w:t>
+      </w:r>
+      <w:r>
+        <w:rPr>
+          <w:sz w:val="18"/>
+          <w:szCs w:val="18"/>
+        </w:rPr>
+        <w:t xml:space="preserve">Unordered: there is no index. We cannot ask for s[0].</w:t>
+      </w:r>
+    </w:p>
+    <w:p>
+      <w:pPr>
+        <w:ind w:left="260" w:hanging="200"/>
+        <w:spacing w:before="0" w:after="25" w:line="230" w:lineRule="auto"/>
+      </w:pPr>
+      <w:r>
+        <w:rPr>
+          <w:sz w:val="18"/>
+          <w:szCs w:val="18"/>
+        </w:rPr>
+        <w:t xml:space="preserve">•   </w:t>
+      </w:r>
+      <w:r>
+        <w:rPr>
+          <w:sz w:val="18"/>
+          <w:szCs w:val="18"/>
+        </w:rPr>
+        <w:t xml:space="preserve">Very fast membership test: "x in my_set" is O(1) on average, because a set uses a hash table. The same test on a list is O(n).</w:t>
+      </w:r>
+    </w:p>
+    <w:p>
+      <w:pPr>
+        <w:ind w:left="260" w:hanging="200"/>
+        <w:spacing w:before="0" w:after="25" w:line="230" w:lineRule="auto"/>
+      </w:pPr>
+      <w:r>
+        <w:rPr>
+          <w:sz w:val="18"/>
+          <w:szCs w:val="18"/>
+        </w:rPr>
+        <w:t xml:space="preserve">•   </w:t>
+      </w:r>
+      <w:r>
+        <w:rPr>
+          <w:sz w:val="18"/>
+          <w:szCs w:val="18"/>
+        </w:rPr>
+        <w:t xml:space="preserve">Set maths is built in: union (|), intersection (&amp;), difference (-), symmetric difference (^).</w:t>
+      </w:r>
+    </w:p>
+    <w:p>
+      <w:pPr>
+        <w:ind w:left="260" w:hanging="200"/>
+        <w:spacing w:before="0" w:after="25" w:line="230" w:lineRule="auto"/>
+      </w:pPr>
+      <w:r>
+        <w:rPr>
+          <w:sz w:val="18"/>
+          <w:szCs w:val="18"/>
+        </w:rPr>
+        <w:t xml:space="preserve">•   </w:t>
+      </w:r>
+      <w:r>
+        <w:rPr>
+          <w:sz w:val="18"/>
+          <w:szCs w:val="18"/>
+        </w:rPr>
+        <w:t xml:space="preserve">Items must be hashable, so a list cannot go inside a set, but a tuple can.</w:t>
+      </w:r>
+    </w:p>
+    <w:p>
+      <w:pPr>
+        <w:ind w:left="260" w:hanging="200"/>
+        <w:spacing w:before="0" w:after="25" w:line="230" w:lineRule="auto"/>
+      </w:pPr>
+      <w:r>
+        <w:rPr>
+          <w:sz w:val="18"/>
+          <w:szCs w:val="18"/>
+        </w:rPr>
+        <w:t xml:space="preserve">•   </w:t>
+      </w:r>
+      <w:r>
+        <w:rPr>
+          <w:sz w:val="18"/>
+          <w:szCs w:val="18"/>
+        </w:rPr>
+        <w:t xml:space="preserve">frozenset is the immutable version, useful as a dict key.</w:t>
+      </w:r>
+    </w:p>
+    <w:p>
+      <w:pPr>
+        <w:ind w:left="260" w:hanging="200"/>
+        <w:spacing w:before="0" w:after="25" w:line="230" w:lineRule="auto"/>
+      </w:pPr>
+      <w:r>
+        <w:rPr>
+          <w:sz w:val="18"/>
+          <w:szCs w:val="18"/>
+        </w:rPr>
+        <w:t xml:space="preserve">•   </w:t>
+      </w:r>
+      <w:r>
+        <w:rPr>
+          <w:sz w:val="18"/>
+          <w:szCs w:val="18"/>
+        </w:rPr>
+        <w:t xml:space="preserve">Common uses: removing duplicates from a list, and fast "already seen?" checks.</w:t>
+      </w:r>
+    </w:p>
+    <w:p>
+      <w:pPr>
+        <w:ind w:left="120" w:hanging="0"/>
+        <w:spacing w:before="50" w:after="110" w:line="230" w:lineRule="auto"/>
+        <w:pBdr>
+          <w:left w:val="single" w:sz="12" w:space="4" w:color="2E5E1F"/>
+        </w:pBdr>
+      </w:pPr>
+      <w:r>
+        <w:rPr>
+          <w:b/>
+          <w:color w:val="2E5E1F"/>
+          <w:sz w:val="18"/>
+          <w:szCs w:val="18"/>
+        </w:rPr>
+        <w:t xml:space="preserve">Interview answer:  </w:t>
+      </w:r>
+      <w:r>
+        <w:rPr>
+          <w:i/>
+          <w:sz w:val="18"/>
+          <w:szCs w:val="18"/>
+        </w:rPr>
+        <w:t xml:space="preserve">A set stores unique items in a hash table, so lookups and duplicate removal are O(1) on average. It has no order and no index. I use it for membership checks and set maths like union and intersection.</w:t>
+      </w:r>
+    </w:p>
+    <w:p>
+      <w:pPr>
+        <w:spacing w:before="140" w:after="40" w:line="230" w:lineRule="auto"/>
+      </w:pPr>
+      <w:r>
+        <w:rPr>
+          <w:b/>
+          <w:sz w:val="21"/>
+          <w:szCs w:val="21"/>
+        </w:rPr>
+        <w:t xml:space="preserve">2.4  Dictionary</w:t>
+      </w:r>
+    </w:p>
+    <w:p>
+      <w:pPr>
+        <w:spacing w:before="0" w:after="40" w:line="230" w:lineRule="auto"/>
+      </w:pPr>
+      <w:r>
+        <w:rPr>
+          <w:b/>
+          <w:sz w:val="18"/>
+          <w:szCs w:val="18"/>
+        </w:rPr>
+        <w:t xml:space="preserve">What it is:  </w:t>
+      </w:r>
+      <w:r>
+        <w:rPr>
+          <w:sz w:val="18"/>
+          <w:szCs w:val="18"/>
+        </w:rPr>
+        <w:t xml:space="preserve">A dictionary stores data as key and value pairs, and finds a value by its key very fast.</w:t>
+      </w:r>
+    </w:p>
+    <w:p>
+      <w:pPr>
+        <w:ind w:left="260" w:hanging="200"/>
+        <w:spacing w:before="0" w:after="25" w:line="230" w:lineRule="auto"/>
+      </w:pPr>
+      <w:r>
+        <w:rPr>
+          <w:sz w:val="18"/>
+          <w:szCs w:val="18"/>
+        </w:rPr>
+        <w:t xml:space="preserve">•   </w:t>
+      </w:r>
+      <w:r>
+        <w:rPr>
+          <w:sz w:val="18"/>
+          <w:szCs w:val="18"/>
+        </w:rPr>
+        <w:t xml:space="preserve">Written as {"name": "Sanket", "city": "Surat"}. Lookup is d["name"].</w:t>
+      </w:r>
+    </w:p>
+    <w:p>
+      <w:pPr>
+        <w:ind w:left="260" w:hanging="200"/>
+        <w:spacing w:before="0" w:after="25" w:line="230" w:lineRule="auto"/>
+      </w:pPr>
+      <w:r>
+        <w:rPr>
+          <w:sz w:val="18"/>
+          <w:szCs w:val="18"/>
+        </w:rPr>
+        <w:t xml:space="preserve">•   </w:t>
+      </w:r>
+      <w:r>
+        <w:rPr>
+          <w:sz w:val="18"/>
+          <w:szCs w:val="18"/>
+        </w:rPr>
+        <w:t xml:space="preserve">Keys must be unique and hashable (str, int, tuple). Values can be anything.</w:t>
+      </w:r>
+    </w:p>
+    <w:p>
+      <w:pPr>
+        <w:ind w:left="260" w:hanging="200"/>
+        <w:spacing w:before="0" w:after="25" w:line="230" w:lineRule="auto"/>
+      </w:pPr>
+      <w:r>
+        <w:rPr>
+          <w:sz w:val="18"/>
+          <w:szCs w:val="18"/>
+        </w:rPr>
+        <w:t xml:space="preserve">•   </w:t>
+      </w:r>
+      <w:r>
+        <w:rPr>
+          <w:sz w:val="18"/>
+          <w:szCs w:val="18"/>
+        </w:rPr>
+        <w:t xml:space="preserve">It is a hash table inside, so get, set and delete are O(1) on average.</w:t>
+      </w:r>
+    </w:p>
+    <w:p>
+      <w:pPr>
+        <w:ind w:left="260" w:hanging="200"/>
+        <w:spacing w:before="0" w:after="25" w:line="230" w:lineRule="auto"/>
+      </w:pPr>
+      <w:r>
+        <w:rPr>
+          <w:sz w:val="18"/>
+          <w:szCs w:val="18"/>
+        </w:rPr>
+        <w:t xml:space="preserve">•   </w:t>
+      </w:r>
+      <w:r>
+        <w:rPr>
+          <w:sz w:val="18"/>
+          <w:szCs w:val="18"/>
+        </w:rPr>
+        <w:t xml:space="preserve">Since Python 3.7, a dict keeps insertion order.</w:t>
+      </w:r>
+    </w:p>
+    <w:p>
+      <w:pPr>
+        <w:ind w:left="260" w:hanging="200"/>
+        <w:spacing w:before="0" w:after="25" w:line="230" w:lineRule="auto"/>
+      </w:pPr>
+      <w:r>
+        <w:rPr>
+          <w:sz w:val="18"/>
+          <w:szCs w:val="18"/>
+        </w:rPr>
+        <w:t xml:space="preserve">•   </w:t>
+      </w:r>
+      <w:r>
+        <w:rPr>
+          <w:sz w:val="18"/>
+          <w:szCs w:val="18"/>
+        </w:rPr>
+        <w:t xml:space="preserve">d["missing"] raises KeyError. d.get("missing", default) returns the default safely.</w:t>
+      </w:r>
+    </w:p>
+    <w:p>
+      <w:pPr>
+        <w:ind w:left="260" w:hanging="200"/>
+        <w:spacing w:before="0" w:after="25" w:line="230" w:lineRule="auto"/>
+      </w:pPr>
+      <w:r>
+        <w:rPr>
+          <w:sz w:val="18"/>
+          <w:szCs w:val="18"/>
+        </w:rPr>
+        <w:t xml:space="preserve">•   </w:t>
+      </w:r>
+      <w:r>
+        <w:rPr>
+          <w:sz w:val="18"/>
+          <w:szCs w:val="18"/>
+        </w:rPr>
+        <w:t xml:space="preserve">Useful methods: keys(), values(), items() for looping, update() to merge, pop() to remove.</w:t>
+      </w:r>
+    </w:p>
+    <w:p>
+      <w:pPr>
+        <w:ind w:left="260" w:hanging="200"/>
+        <w:spacing w:before="0" w:after="25" w:line="230" w:lineRule="auto"/>
+      </w:pPr>
+      <w:r>
+        <w:rPr>
+          <w:sz w:val="18"/>
+          <w:szCs w:val="18"/>
+        </w:rPr>
+        <w:t xml:space="preserve">•   </w:t>
+      </w:r>
+      <w:r>
+        <w:rPr>
+          <w:sz w:val="18"/>
+          <w:szCs w:val="18"/>
+        </w:rPr>
+        <w:t xml:space="preserve">defaultdict gives an automatic default value, Counter counts items - both from the collections module.</w:t>
+      </w:r>
+    </w:p>
+    <w:p>
+      <w:pPr>
+        <w:ind w:left="260" w:hanging="200"/>
+        <w:spacing w:before="0" w:after="25" w:line="230" w:lineRule="auto"/>
+      </w:pPr>
+      <w:r>
+        <w:rPr>
+          <w:sz w:val="18"/>
+          <w:szCs w:val="18"/>
+        </w:rPr>
+        <w:t xml:space="preserve">•   </w:t>
+      </w:r>
+      <w:r>
+        <w:rPr>
+          <w:sz w:val="18"/>
+          <w:szCs w:val="18"/>
+        </w:rPr>
+        <w:t xml:space="preserve">Dict comprehension: {k: v * 2 for k, v in d.items()}.</w:t>
+      </w:r>
+    </w:p>
+    <w:p>
+      <w:pPr>
+        <w:ind w:left="120" w:hanging="0"/>
+        <w:spacing w:before="50" w:after="110" w:line="230" w:lineRule="auto"/>
+        <w:pBdr>
+          <w:left w:val="single" w:sz="12" w:space="4" w:color="2E5E1F"/>
+        </w:pBdr>
+      </w:pPr>
+      <w:r>
+        <w:rPr>
+          <w:b/>
+          <w:color w:val="2E5E1F"/>
+          <w:sz w:val="18"/>
+          <w:szCs w:val="18"/>
+        </w:rPr>
+        <w:t xml:space="preserve">Interview answer:  </w:t>
+      </w:r>
+      <w:r>
+        <w:rPr>
+          <w:i/>
+          <w:sz w:val="18"/>
+          <w:szCs w:val="18"/>
+        </w:rPr>
+        <w:t xml:space="preserve">A dict is a hash table of key-value pairs with O(1) average lookup. Keys must be hashable and unique, and since Python 3.7 insertion order is kept. I use get() to avoid KeyError, and defaultdict or Counter for counting patterns.</w:t>
+      </w:r>
+    </w:p>
+    <w:p>
+      <w:pPr>
+        <w:spacing w:before="140" w:after="40" w:line="230" w:lineRule="auto"/>
+      </w:pPr>
+      <w:r>
+        <w:rPr>
+          <w:b/>
+          <w:sz w:val="21"/>
+          <w:szCs w:val="21"/>
+        </w:rPr>
+        <w:t xml:space="preserve">2.5  String</w:t>
+      </w:r>
+    </w:p>
+    <w:p>
+      <w:pPr>
+        <w:spacing w:before="0" w:after="40" w:line="230" w:lineRule="auto"/>
+      </w:pPr>
+      <w:r>
+        <w:rPr>
+          <w:b/>
+          <w:sz w:val="18"/>
+          <w:szCs w:val="18"/>
+        </w:rPr>
+        <w:t xml:space="preserve">What it is:  </w:t>
+      </w:r>
+      <w:r>
+        <w:rPr>
+          <w:sz w:val="18"/>
+          <w:szCs w:val="18"/>
+        </w:rPr>
+        <w:t xml:space="preserve">A string is an immutable sequence of Unicode characters.</w:t>
+      </w:r>
+    </w:p>
+    <w:p>
+      <w:pPr>
+        <w:ind w:left="260" w:hanging="200"/>
+        <w:spacing w:before="0" w:after="25" w:line="230" w:lineRule="auto"/>
+      </w:pPr>
+      <w:r>
+        <w:rPr>
+          <w:sz w:val="18"/>
+          <w:szCs w:val="18"/>
+        </w:rPr>
+        <w:t xml:space="preserve">•   </w:t>
+      </w:r>
+      <w:r>
+        <w:rPr>
+          <w:sz w:val="18"/>
+          <w:szCs w:val="18"/>
+        </w:rPr>
+        <w:t xml:space="preserve">Immutable: s[0] = "x" is an error. Every edit, like replace or upper, returns a new string.</w:t>
+      </w:r>
+    </w:p>
+    <w:p>
+      <w:pPr>
+        <w:ind w:left="260" w:hanging="200"/>
+        <w:spacing w:before="0" w:after="25" w:line="230" w:lineRule="auto"/>
+      </w:pPr>
+      <w:r>
+        <w:rPr>
+          <w:sz w:val="18"/>
+          <w:szCs w:val="18"/>
+        </w:rPr>
+        <w:t xml:space="preserve">•   </w:t>
+      </w:r>
+      <w:r>
+        <w:rPr>
+          <w:sz w:val="18"/>
+          <w:szCs w:val="18"/>
+        </w:rPr>
+        <w:t xml:space="preserve">It is a sequence, so indexing and slicing work: s[0], s[-1], s[2:5], s[::-1] to reverse.</w:t>
+      </w:r>
+    </w:p>
+    <w:p>
+      <w:pPr>
+        <w:ind w:left="260" w:hanging="200"/>
+        <w:spacing w:before="0" w:after="25" w:line="230" w:lineRule="auto"/>
+      </w:pPr>
+      <w:r>
+        <w:rPr>
+          <w:sz w:val="18"/>
+          <w:szCs w:val="18"/>
+        </w:rPr>
+        <w:t xml:space="preserve">•   </w:t>
+      </w:r>
+      <w:r>
+        <w:rPr>
+          <w:sz w:val="18"/>
+          <w:szCs w:val="18"/>
+        </w:rPr>
+        <w:t xml:space="preserve">Common methods: strip, split, join, replace, upper, lower, startswith, endswith, find, format.</w:t>
+      </w:r>
+    </w:p>
+    <w:p>
+      <w:pPr>
+        <w:ind w:left="260" w:hanging="200"/>
+        <w:spacing w:before="0" w:after="25" w:line="230" w:lineRule="auto"/>
+      </w:pPr>
+      <w:r>
+        <w:rPr>
+          <w:sz w:val="18"/>
+          <w:szCs w:val="18"/>
+        </w:rPr>
+        <w:t xml:space="preserve">•   </w:t>
+      </w:r>
+      <w:r>
+        <w:rPr>
+          <w:sz w:val="18"/>
+          <w:szCs w:val="18"/>
+        </w:rPr>
+        <w:t xml:space="preserve">join is the right way to combine many pieces: ",".join(parts). Adding strings in a loop with + is slow because each + makes a new string.</w:t>
+      </w:r>
+    </w:p>
+    <w:p>
+      <w:pPr>
+        <w:ind w:left="260" w:hanging="200"/>
+        <w:spacing w:before="0" w:after="25" w:line="230" w:lineRule="auto"/>
+      </w:pPr>
+      <w:r>
+        <w:rPr>
+          <w:sz w:val="18"/>
+          <w:szCs w:val="18"/>
+        </w:rPr>
+        <w:t xml:space="preserve">•   </w:t>
+      </w:r>
+      <w:r>
+        <w:rPr>
+          <w:sz w:val="18"/>
+          <w:szCs w:val="18"/>
+        </w:rPr>
+        <w:t xml:space="preserve">f-strings are the modern way to format: f"Hello {name}". Clear and fast.</w:t>
+      </w:r>
+    </w:p>
+    <w:p>
+      <w:pPr>
+        <w:ind w:left="260" w:hanging="200"/>
+        <w:spacing w:before="0" w:after="25" w:line="230" w:lineRule="auto"/>
+      </w:pPr>
+      <w:r>
+        <w:rPr>
+          <w:sz w:val="18"/>
+          <w:szCs w:val="18"/>
+        </w:rPr>
+        <w:t xml:space="preserve">•   </w:t>
+      </w:r>
+      <w:r>
+        <w:rPr>
+          <w:sz w:val="18"/>
+          <w:szCs w:val="18"/>
+        </w:rPr>
+        <w:t xml:space="preserve">in checks substrings: "py" in "python" is True.</w:t>
+      </w:r>
+    </w:p>
+    <w:p>
+      <w:pPr>
+        <w:ind w:left="260" w:hanging="200"/>
+        <w:spacing w:before="0" w:after="25" w:line="230" w:lineRule="auto"/>
+      </w:pPr>
+      <w:r>
+        <w:rPr>
+          <w:sz w:val="18"/>
+          <w:szCs w:val="18"/>
+        </w:rPr>
+        <w:t xml:space="preserve">•   </w:t>
+      </w:r>
+      <w:r>
+        <w:rPr>
+          <w:sz w:val="18"/>
+          <w:szCs w:val="18"/>
+        </w:rPr>
+        <w:t xml:space="preserve">encode() turns str into bytes, decode() turns bytes into str - needed for files and networks.</w:t>
+      </w:r>
+    </w:p>
+    <w:p>
+      <w:pPr>
+        <w:ind w:left="120" w:hanging="0"/>
+        <w:spacing w:before="50" w:after="110" w:line="230" w:lineRule="auto"/>
+        <w:pBdr>
+          <w:left w:val="single" w:sz="12" w:space="4" w:color="2E5E1F"/>
+        </w:pBdr>
+      </w:pPr>
+      <w:r>
+        <w:rPr>
+          <w:b/>
+          <w:color w:val="2E5E1F"/>
+          <w:sz w:val="18"/>
+          <w:szCs w:val="18"/>
+        </w:rPr>
+        <w:t xml:space="preserve">Interview answer:  </w:t>
+      </w:r>
+      <w:r>
+        <w:rPr>
+          <w:i/>
+          <w:sz w:val="18"/>
+          <w:szCs w:val="18"/>
+        </w:rPr>
+        <w:t xml:space="preserve">Strings are immutable Unicode sequences, so every change makes a new object. I format with f-strings, combine many parts with join instead of + in a loop, and use encode/decode when working with bytes.</w:t>
+      </w:r>
+    </w:p>
+    <w:p>
+      <w:pPr>
+        <w:spacing w:before="140" w:after="40" w:line="230" w:lineRule="auto"/>
+      </w:pPr>
+      <w:r>
+        <w:rPr>
+          <w:b/>
+          <w:sz w:val="21"/>
+          <w:szCs w:val="21"/>
+        </w:rPr>
+        <w:t xml:space="preserve">2.6  List vs Tuple vs Set vs Dict</w:t>
+      </w:r>
+    </w:p>
+    <w:p>
+      <w:pPr>
+        <w:spacing w:before="0" w:after="40" w:line="230" w:lineRule="auto"/>
+      </w:pPr>
+      <w:r>
+        <w:rPr>
+          <w:b/>
+          <w:sz w:val="18"/>
+          <w:szCs w:val="18"/>
+        </w:rPr>
+        <w:t xml:space="preserve">What it is:  </w:t>
+      </w:r>
+      <w:r>
+        <w:rPr>
+          <w:sz w:val="18"/>
+          <w:szCs w:val="18"/>
+        </w:rPr>
+        <w:t xml:space="preserve">Choosing the right collection is about order, uniqueness, mutability and lookup speed.</w:t>
+      </w:r>
+    </w:p>
+    <w:p>
+      <w:pPr>
+        <w:ind w:left="260" w:hanging="200"/>
+        <w:spacing w:before="0" w:after="25" w:line="230" w:lineRule="auto"/>
+      </w:pPr>
+      <w:r>
+        <w:rPr>
+          <w:sz w:val="18"/>
+          <w:szCs w:val="18"/>
+        </w:rPr>
+        <w:t xml:space="preserve">•   </w:t>
+      </w:r>
+      <w:r>
+        <w:rPr>
+          <w:sz w:val="18"/>
+          <w:szCs w:val="18"/>
+        </w:rPr>
+        <w:t xml:space="preserve">List: ordered, mutable, allows duplicates, index access. Use for a changing sequence.</w:t>
+      </w:r>
+    </w:p>
+    <w:p>
+      <w:pPr>
+        <w:ind w:left="260" w:hanging="200"/>
+        <w:spacing w:before="0" w:after="25" w:line="230" w:lineRule="auto"/>
+      </w:pPr>
+      <w:r>
+        <w:rPr>
+          <w:sz w:val="18"/>
+          <w:szCs w:val="18"/>
+        </w:rPr>
+        <w:t xml:space="preserve">•   </w:t>
+      </w:r>
+      <w:r>
+        <w:rPr>
+          <w:sz w:val="18"/>
+          <w:szCs w:val="18"/>
+        </w:rPr>
+        <w:t xml:space="preserve">Tuple: ordered, immutable, allows duplicates, index access, hashable. Use for fixed records and dict keys.</w:t>
+      </w:r>
+    </w:p>
+    <w:p>
+      <w:pPr>
+        <w:ind w:left="260" w:hanging="200"/>
+        <w:spacing w:before="0" w:after="25" w:line="230" w:lineRule="auto"/>
+      </w:pPr>
+      <w:r>
+        <w:rPr>
+          <w:sz w:val="18"/>
+          <w:szCs w:val="18"/>
+        </w:rPr>
+        <w:t xml:space="preserve">•   </w:t>
+      </w:r>
+      <w:r>
+        <w:rPr>
+          <w:sz w:val="18"/>
+          <w:szCs w:val="18"/>
+        </w:rPr>
+        <w:t xml:space="preserve">Set: no order, mutable, unique items only, no index, O(1) membership. Use for uniqueness and fast "in" checks.</w:t>
+      </w:r>
+    </w:p>
+    <w:p>
+      <w:pPr>
+        <w:ind w:left="260" w:hanging="200"/>
+        <w:spacing w:before="0" w:after="25" w:line="230" w:lineRule="auto"/>
+      </w:pPr>
+      <w:r>
+        <w:rPr>
+          <w:sz w:val="18"/>
+          <w:szCs w:val="18"/>
+        </w:rPr>
+        <w:t xml:space="preserve">•   </w:t>
+      </w:r>
+      <w:r>
+        <w:rPr>
+          <w:sz w:val="18"/>
+          <w:szCs w:val="18"/>
+        </w:rPr>
+        <w:t xml:space="preserve">Dict: key to value mapping, keys unique, O(1) lookup by key, keeps insertion order. Use for lookups by name or id.</w:t>
+      </w:r>
+    </w:p>
+    <w:p>
+      <w:pPr>
+        <w:ind w:left="260" w:hanging="200"/>
+        <w:spacing w:before="0" w:after="25" w:line="230" w:lineRule="auto"/>
+      </w:pPr>
+      <w:r>
+        <w:rPr>
+          <w:sz w:val="18"/>
+          <w:szCs w:val="18"/>
+        </w:rPr>
+        <w:t xml:space="preserve">•   </w:t>
+      </w:r>
+      <w:r>
+        <w:rPr>
+          <w:sz w:val="18"/>
+          <w:szCs w:val="18"/>
+        </w:rPr>
+        <w:t xml:space="preserve">Speed of "x in c": list and tuple O(n); set and dict O(1) average.</w:t>
+      </w:r>
+    </w:p>
+    <w:p>
+      <w:pPr>
+        <w:ind w:left="260" w:hanging="200"/>
+        <w:spacing w:before="0" w:after="25" w:line="230" w:lineRule="auto"/>
+      </w:pPr>
+      <w:r>
+        <w:rPr>
+          <w:sz w:val="18"/>
+          <w:szCs w:val="18"/>
+        </w:rPr>
+        <w:t xml:space="preserve">•   </w:t>
+      </w:r>
+      <w:r>
+        <w:rPr>
+          <w:sz w:val="18"/>
+          <w:szCs w:val="18"/>
+        </w:rPr>
+        <w:t xml:space="preserve">Memory: tuple is the lightest; set and dict cost more because of the hash table.</w:t>
+      </w:r>
+    </w:p>
+    <w:p>
+      <w:pPr>
+        <w:ind w:left="120" w:hanging="0"/>
+        <w:spacing w:before="50" w:after="110" w:line="230" w:lineRule="auto"/>
+        <w:pBdr>
+          <w:left w:val="single" w:sz="12" w:space="4" w:color="2E5E1F"/>
+        </w:pBdr>
+      </w:pPr>
+      <w:r>
+        <w:rPr>
+          <w:b/>
+          <w:color w:val="2E5E1F"/>
+          <w:sz w:val="18"/>
+          <w:szCs w:val="18"/>
+        </w:rPr>
+        <w:t xml:space="preserve">Interview answer:  </w:t>
+      </w:r>
+      <w:r>
+        <w:rPr>
+          <w:i/>
+          <w:sz w:val="18"/>
+          <w:szCs w:val="18"/>
+        </w:rPr>
+        <w:t xml:space="preserve">I pick by need: list for an ordered changing sequence, tuple for fixed data that may be a dict key, set for uniqueness and fast membership, dict for key-value lookup. Sets and dicts give O(1) search, lists and tuples give O(n).</w:t>
+      </w:r>
+    </w:p>
+    <w:p>
+      <w:pPr>
+        <w:spacing w:before="140" w:after="40" w:line="230" w:lineRule="auto"/>
+      </w:pPr>
+      <w:r>
+        <w:rPr>
+          <w:b/>
+          <w:sz w:val="21"/>
+          <w:szCs w:val="21"/>
+        </w:rPr>
+        <w:t xml:space="preserve">2.7  Shallow Copy vs Deep Copy</w:t>
+      </w:r>
+    </w:p>
+    <w:p>
+      <w:pPr>
+        <w:spacing w:before="0" w:after="40" w:line="230" w:lineRule="auto"/>
+      </w:pPr>
+      <w:r>
+        <w:rPr>
+          <w:b/>
+          <w:sz w:val="18"/>
+          <w:szCs w:val="18"/>
+        </w:rPr>
+        <w:t xml:space="preserve">What it is:  </w:t>
+      </w:r>
+      <w:r>
+        <w:rPr>
+          <w:sz w:val="18"/>
+          <w:szCs w:val="18"/>
+        </w:rPr>
+        <w:t xml:space="preserve">A shallow copy copies only the outer object. A deep copy copies the outer object and everything inside it.</w:t>
+      </w:r>
+    </w:p>
+    <w:p>
+      <w:pPr>
+        <w:ind w:left="260" w:hanging="200"/>
+        <w:spacing w:before="0" w:after="25" w:line="230" w:lineRule="auto"/>
+      </w:pPr>
+      <w:r>
+        <w:rPr>
+          <w:sz w:val="18"/>
+          <w:szCs w:val="18"/>
+        </w:rPr>
+        <w:t xml:space="preserve">•   </w:t>
+      </w:r>
+      <w:r>
+        <w:rPr>
+          <w:sz w:val="18"/>
+          <w:szCs w:val="18"/>
+        </w:rPr>
+        <w:t xml:space="preserve">Plain assignment (b = a) copies nothing. Both names point to the same object.</w:t>
+      </w:r>
+    </w:p>
+    <w:p>
+      <w:pPr>
+        <w:ind w:left="260" w:hanging="200"/>
+        <w:spacing w:before="0" w:after="25" w:line="230" w:lineRule="auto"/>
+      </w:pPr>
+      <w:r>
+        <w:rPr>
+          <w:sz w:val="18"/>
+          <w:szCs w:val="18"/>
+        </w:rPr>
+        <w:t xml:space="preserve">•   </w:t>
+      </w:r>
+      <w:r>
+        <w:rPr>
+          <w:sz w:val="18"/>
+          <w:szCs w:val="18"/>
+        </w:rPr>
+        <w:t xml:space="preserve">Shallow copy: copy.copy(a), a.copy(), a[:] or list(a). It makes a new outer list, but the inner objects are still shared.</w:t>
+      </w:r>
+    </w:p>
+    <w:p>
+      <w:pPr>
+        <w:ind w:left="260" w:hanging="200"/>
+        <w:spacing w:before="0" w:after="25" w:line="230" w:lineRule="auto"/>
+      </w:pPr>
+      <w:r>
+        <w:rPr>
+          <w:sz w:val="18"/>
+          <w:szCs w:val="18"/>
+        </w:rPr>
+        <w:t xml:space="preserve">•   </w:t>
+      </w:r>
+      <w:r>
+        <w:rPr>
+          <w:sz w:val="18"/>
+          <w:szCs w:val="18"/>
+        </w:rPr>
+        <w:t xml:space="preserve">So after a shallow copy, changing an inner list in the copy also changes it in the original. This is a classic interview trap.</w:t>
+      </w:r>
+    </w:p>
+    <w:p>
+      <w:pPr>
+        <w:ind w:left="260" w:hanging="200"/>
+        <w:spacing w:before="0" w:after="25" w:line="230" w:lineRule="auto"/>
+      </w:pPr>
+      <w:r>
+        <w:rPr>
+          <w:sz w:val="18"/>
+          <w:szCs w:val="18"/>
+        </w:rPr>
+        <w:t xml:space="preserve">•   </w:t>
+      </w:r>
+      <w:r>
+        <w:rPr>
+          <w:sz w:val="18"/>
+          <w:szCs w:val="18"/>
+        </w:rPr>
+        <w:t xml:space="preserve">Deep copy: copy.deepcopy(a). It walks the whole structure and copies every level. Nothing is shared.</w:t>
+      </w:r>
+    </w:p>
+    <w:p>
+      <w:pPr>
+        <w:ind w:left="260" w:hanging="200"/>
+        <w:spacing w:before="0" w:after="25" w:line="230" w:lineRule="auto"/>
+      </w:pPr>
+      <w:r>
+        <w:rPr>
+          <w:sz w:val="18"/>
+          <w:szCs w:val="18"/>
+        </w:rPr>
+        <w:t xml:space="preserve">•   </w:t>
+      </w:r>
+      <w:r>
+        <w:rPr>
+          <w:sz w:val="18"/>
+          <w:szCs w:val="18"/>
+        </w:rPr>
+        <w:t xml:space="preserve">Deep copy is slower and uses more memory, so use it only when the data is nested and both sides must be fully independent.</w:t>
+      </w:r>
+    </w:p>
+    <w:p>
+      <w:pPr>
+        <w:ind w:left="260" w:hanging="200"/>
+        <w:spacing w:before="0" w:after="25" w:line="230" w:lineRule="auto"/>
+      </w:pPr>
+      <w:r>
+        <w:rPr>
+          <w:sz w:val="18"/>
+          <w:szCs w:val="18"/>
+        </w:rPr>
+        <w:t xml:space="preserve">•   </w:t>
+      </w:r>
+      <w:r>
+        <w:rPr>
+          <w:sz w:val="18"/>
+          <w:szCs w:val="18"/>
+        </w:rPr>
+        <w:t xml:space="preserve">For flat lists of numbers or strings, a shallow copy is enough, because those items are immutable anyway.</w:t>
+      </w:r>
+    </w:p>
+    <w:p>
+      <w:pPr>
+        <w:ind w:left="120" w:hanging="0"/>
+        <w:spacing w:before="50" w:after="110" w:line="230" w:lineRule="auto"/>
+        <w:pBdr>
+          <w:left w:val="single" w:sz="12" w:space="4" w:color="2E5E1F"/>
+        </w:pBdr>
+      </w:pPr>
+      <w:r>
+        <w:rPr>
+          <w:b/>
+          <w:color w:val="2E5E1F"/>
+          <w:sz w:val="18"/>
+          <w:szCs w:val="18"/>
+        </w:rPr>
+        <w:t xml:space="preserve">Interview answer:  </w:t>
+      </w:r>
+      <w:r>
+        <w:rPr>
+          <w:i/>
+          <w:sz w:val="18"/>
+          <w:szCs w:val="18"/>
+        </w:rPr>
+        <w:t xml:space="preserve">Assignment shares the same object, shallow copy makes a new outer container but shares the inner objects, and deep copy copies every level so nothing is shared. For nested data that must be independent, I use copy.deepcopy().</w:t>
       </w:r>
     </w:p>
     <w:sectPr>

</xml_diff>

<commit_message>
Phase 3: Functions (9 topics)
Basics, args/kwargs, default trap, LEGB, lambda, map/filter/reduce,
closure, decorator, recursion

Co-Authored-By: Claude Fable 5 <noreply@anthropic.com>
Claude-Session: https://claude.ai/code/session_01Vm8nqoCZNTvUn3BNmW1Tgz
</commit_message>
<xml_diff>
--- a/Python_Interview_Theory.docx
+++ b/Python_Interview_Theory.docx
@@ -2624,6 +2624,1731 @@
           <w:szCs w:val="18"/>
         </w:rPr>
         <w:t xml:space="preserve">Assignment shares the same object, shallow copy makes a new outer container but shares the inner objects, and deep copy copies every level so nothing is shared. For nested data that must be independent, I use copy.deepcopy().</w:t>
+      </w:r>
+    </w:p>
+    <w:p>
+      <w:pPr>
+        <w:spacing w:before="200" w:after="60" w:line="230" w:lineRule="auto"/>
+      </w:pPr>
+      <w:r>
+        <w:rPr>
+          <w:b/>
+          <w:color w:val="1F4E79"/>
+          <w:sz w:val="26"/>
+          <w:szCs w:val="26"/>
+        </w:rPr>
+        <w:t xml:space="preserve">Phase 3 - Functions</w:t>
+      </w:r>
+    </w:p>
+    <w:p>
+      <w:pPr>
+        <w:spacing w:before="140" w:after="40" w:line="230" w:lineRule="auto"/>
+      </w:pPr>
+      <w:r>
+        <w:rPr>
+          <w:b/>
+          <w:sz w:val="21"/>
+          <w:szCs w:val="21"/>
+        </w:rPr>
+        <w:t xml:space="preserve">3.1  Function Basics and return</w:t>
+      </w:r>
+    </w:p>
+    <w:p>
+      <w:pPr>
+        <w:spacing w:before="0" w:after="40" w:line="230" w:lineRule="auto"/>
+      </w:pPr>
+      <w:r>
+        <w:rPr>
+          <w:b/>
+          <w:sz w:val="18"/>
+          <w:szCs w:val="18"/>
+        </w:rPr>
+        <w:t xml:space="preserve">What it is:  </w:t>
+      </w:r>
+      <w:r>
+        <w:rPr>
+          <w:sz w:val="18"/>
+          <w:szCs w:val="18"/>
+        </w:rPr>
+        <w:t xml:space="preserve">A function is a named, reusable block of code that takes inputs and can return a result.</w:t>
+      </w:r>
+    </w:p>
+    <w:p>
+      <w:pPr>
+        <w:ind w:left="260" w:hanging="200"/>
+        <w:spacing w:before="0" w:after="25" w:line="230" w:lineRule="auto"/>
+      </w:pPr>
+      <w:r>
+        <w:rPr>
+          <w:sz w:val="18"/>
+          <w:szCs w:val="18"/>
+        </w:rPr>
+        <w:t xml:space="preserve">•   </w:t>
+      </w:r>
+      <w:r>
+        <w:rPr>
+          <w:sz w:val="18"/>
+          <w:szCs w:val="18"/>
+        </w:rPr>
+        <w:t xml:space="preserve">Defined with def. It runs only when called, not when defined.</w:t>
+      </w:r>
+    </w:p>
+    <w:p>
+      <w:pPr>
+        <w:ind w:left="260" w:hanging="200"/>
+        <w:spacing w:before="0" w:after="25" w:line="230" w:lineRule="auto"/>
+      </w:pPr>
+      <w:r>
+        <w:rPr>
+          <w:sz w:val="18"/>
+          <w:szCs w:val="18"/>
+        </w:rPr>
+        <w:t xml:space="preserve">•   </w:t>
+      </w:r>
+      <w:r>
+        <w:rPr>
+          <w:sz w:val="18"/>
+          <w:szCs w:val="18"/>
+        </w:rPr>
+        <w:t xml:space="preserve">return sends a value back and stops the function at once. Code after return never runs.</w:t>
+      </w:r>
+    </w:p>
+    <w:p>
+      <w:pPr>
+        <w:ind w:left="260" w:hanging="200"/>
+        <w:spacing w:before="0" w:after="25" w:line="230" w:lineRule="auto"/>
+      </w:pPr>
+      <w:r>
+        <w:rPr>
+          <w:sz w:val="18"/>
+          <w:szCs w:val="18"/>
+        </w:rPr>
+        <w:t xml:space="preserve">•   </w:t>
+      </w:r>
+      <w:r>
+        <w:rPr>
+          <w:sz w:val="18"/>
+          <w:szCs w:val="18"/>
+        </w:rPr>
+        <w:t xml:space="preserve">A function with no return, or a bare return, gives back None.</w:t>
+      </w:r>
+    </w:p>
+    <w:p>
+      <w:pPr>
+        <w:ind w:left="260" w:hanging="200"/>
+        <w:spacing w:before="0" w:after="25" w:line="230" w:lineRule="auto"/>
+      </w:pPr>
+      <w:r>
+        <w:rPr>
+          <w:sz w:val="18"/>
+          <w:szCs w:val="18"/>
+        </w:rPr>
+        <w:t xml:space="preserve">•   </w:t>
+      </w:r>
+      <w:r>
+        <w:rPr>
+          <w:sz w:val="18"/>
+          <w:szCs w:val="18"/>
+        </w:rPr>
+        <w:t xml:space="preserve">Returning many values really returns one tuple: return a, b - and the caller unpacks it: x, y = f().</w:t>
+      </w:r>
+    </w:p>
+    <w:p>
+      <w:pPr>
+        <w:ind w:left="260" w:hanging="200"/>
+        <w:spacing w:before="0" w:after="25" w:line="230" w:lineRule="auto"/>
+      </w:pPr>
+      <w:r>
+        <w:rPr>
+          <w:sz w:val="18"/>
+          <w:szCs w:val="18"/>
+        </w:rPr>
+        <w:t xml:space="preserve">•   </w:t>
+      </w:r>
+      <w:r>
+        <w:rPr>
+          <w:sz w:val="18"/>
+          <w:szCs w:val="18"/>
+        </w:rPr>
+        <w:t xml:space="preserve">In Python, functions are first-class objects: we can store them in variables, pass them to other functions, and return them. This idea powers decorators and callbacks.</w:t>
+      </w:r>
+    </w:p>
+    <w:p>
+      <w:pPr>
+        <w:ind w:left="260" w:hanging="200"/>
+        <w:spacing w:before="0" w:after="25" w:line="230" w:lineRule="auto"/>
+      </w:pPr>
+      <w:r>
+        <w:rPr>
+          <w:sz w:val="18"/>
+          <w:szCs w:val="18"/>
+        </w:rPr>
+        <w:t xml:space="preserve">•   </w:t>
+      </w:r>
+      <w:r>
+        <w:rPr>
+          <w:sz w:val="18"/>
+          <w:szCs w:val="18"/>
+        </w:rPr>
+        <w:t xml:space="preserve">A docstring (a string right under def) explains the function and shows up in help().</w:t>
+      </w:r>
+    </w:p>
+    <w:p>
+      <w:pPr>
+        <w:ind w:left="120" w:hanging="0"/>
+        <w:spacing w:before="50" w:after="110" w:line="230" w:lineRule="auto"/>
+        <w:pBdr>
+          <w:left w:val="single" w:sz="12" w:space="4" w:color="2E5E1F"/>
+        </w:pBdr>
+      </w:pPr>
+      <w:r>
+        <w:rPr>
+          <w:b/>
+          <w:color w:val="2E5E1F"/>
+          <w:sz w:val="18"/>
+          <w:szCs w:val="18"/>
+        </w:rPr>
+        <w:t xml:space="preserve">Interview answer:  </w:t>
+      </w:r>
+      <w:r>
+        <w:rPr>
+          <w:i/>
+          <w:sz w:val="18"/>
+          <w:szCs w:val="18"/>
+        </w:rPr>
+        <w:t xml:space="preserve">A function is a reusable block made with def. return ends it and sends back a value, and without return we get None. Functions are first-class objects in Python, so they can be passed around like data - that is the base of decorators.</w:t>
+      </w:r>
+    </w:p>
+    <w:p>
+      <w:pPr>
+        <w:spacing w:before="140" w:after="40" w:line="230" w:lineRule="auto"/>
+      </w:pPr>
+      <w:r>
+        <w:rPr>
+          <w:b/>
+          <w:sz w:val="21"/>
+          <w:szCs w:val="21"/>
+        </w:rPr>
+        <w:t xml:space="preserve">3.2  *args and **kwargs</w:t>
+      </w:r>
+    </w:p>
+    <w:p>
+      <w:pPr>
+        <w:spacing w:before="0" w:after="40" w:line="230" w:lineRule="auto"/>
+      </w:pPr>
+      <w:r>
+        <w:rPr>
+          <w:b/>
+          <w:sz w:val="18"/>
+          <w:szCs w:val="18"/>
+        </w:rPr>
+        <w:t xml:space="preserve">What it is:  </w:t>
+      </w:r>
+      <w:r>
+        <w:rPr>
+          <w:sz w:val="18"/>
+          <w:szCs w:val="18"/>
+        </w:rPr>
+        <w:t xml:space="preserve">*args collects extra positional arguments into a tuple, and **kwargs collects extra keyword arguments into a dict.</w:t>
+      </w:r>
+    </w:p>
+    <w:p>
+      <w:pPr>
+        <w:ind w:left="260" w:hanging="200"/>
+        <w:spacing w:before="0" w:after="25" w:line="230" w:lineRule="auto"/>
+      </w:pPr>
+      <w:r>
+        <w:rPr>
+          <w:sz w:val="18"/>
+          <w:szCs w:val="18"/>
+        </w:rPr>
+        <w:t xml:space="preserve">•   </w:t>
+      </w:r>
+      <w:r>
+        <w:rPr>
+          <w:sz w:val="18"/>
+          <w:szCs w:val="18"/>
+        </w:rPr>
+        <w:t xml:space="preserve">def f(*args): f(1, 2, 3) makes args = (1, 2, 3), a tuple.</w:t>
+      </w:r>
+    </w:p>
+    <w:p>
+      <w:pPr>
+        <w:ind w:left="260" w:hanging="200"/>
+        <w:spacing w:before="0" w:after="25" w:line="230" w:lineRule="auto"/>
+      </w:pPr>
+      <w:r>
+        <w:rPr>
+          <w:sz w:val="18"/>
+          <w:szCs w:val="18"/>
+        </w:rPr>
+        <w:t xml:space="preserve">•   </w:t>
+      </w:r>
+      <w:r>
+        <w:rPr>
+          <w:sz w:val="18"/>
+          <w:szCs w:val="18"/>
+        </w:rPr>
+        <w:t xml:space="preserve">def f(**kwargs): f(a=1, b=2) makes kwargs = {"a": 1, "b": 2}, a dict.</w:t>
+      </w:r>
+    </w:p>
+    <w:p>
+      <w:pPr>
+        <w:ind w:left="260" w:hanging="200"/>
+        <w:spacing w:before="0" w:after="25" w:line="230" w:lineRule="auto"/>
+      </w:pPr>
+      <w:r>
+        <w:rPr>
+          <w:sz w:val="18"/>
+          <w:szCs w:val="18"/>
+        </w:rPr>
+        <w:t xml:space="preserve">•   </w:t>
+      </w:r>
+      <w:r>
+        <w:rPr>
+          <w:sz w:val="18"/>
+          <w:szCs w:val="18"/>
+        </w:rPr>
+        <w:t xml:space="preserve">They let a function accept any number of inputs, useful for wrappers and flexible APIs.</w:t>
+      </w:r>
+    </w:p>
+    <w:p>
+      <w:pPr>
+        <w:ind w:left="260" w:hanging="200"/>
+        <w:spacing w:before="0" w:after="25" w:line="230" w:lineRule="auto"/>
+      </w:pPr>
+      <w:r>
+        <w:rPr>
+          <w:sz w:val="18"/>
+          <w:szCs w:val="18"/>
+        </w:rPr>
+        <w:t xml:space="preserve">•   </w:t>
+      </w:r>
+      <w:r>
+        <w:rPr>
+          <w:sz w:val="18"/>
+          <w:szCs w:val="18"/>
+        </w:rPr>
+        <w:t xml:space="preserve">Order in the signature: normal params, *args, keyword-only params, **kwargs.</w:t>
+      </w:r>
+    </w:p>
+    <w:p>
+      <w:pPr>
+        <w:ind w:left="260" w:hanging="200"/>
+        <w:spacing w:before="0" w:after="25" w:line="230" w:lineRule="auto"/>
+      </w:pPr>
+      <w:r>
+        <w:rPr>
+          <w:sz w:val="18"/>
+          <w:szCs w:val="18"/>
+        </w:rPr>
+        <w:t xml:space="preserve">•   </w:t>
+      </w:r>
+      <w:r>
+        <w:rPr>
+          <w:sz w:val="18"/>
+          <w:szCs w:val="18"/>
+        </w:rPr>
+        <w:t xml:space="preserve">The names args and kwargs are only a habit. The stars * and ** do the work.</w:t>
+      </w:r>
+    </w:p>
+    <w:p>
+      <w:pPr>
+        <w:ind w:left="260" w:hanging="200"/>
+        <w:spacing w:before="0" w:after="25" w:line="230" w:lineRule="auto"/>
+      </w:pPr>
+      <w:r>
+        <w:rPr>
+          <w:sz w:val="18"/>
+          <w:szCs w:val="18"/>
+        </w:rPr>
+        <w:t xml:space="preserve">•   </w:t>
+      </w:r>
+      <w:r>
+        <w:rPr>
+          <w:sz w:val="18"/>
+          <w:szCs w:val="18"/>
+        </w:rPr>
+        <w:t xml:space="preserve">The same stars also unpack when calling: f(*my_list) spreads a list into positional arguments, f(**my_dict) spreads a dict into keyword arguments.</w:t>
+      </w:r>
+    </w:p>
+    <w:p>
+      <w:pPr>
+        <w:ind w:left="260" w:hanging="200"/>
+        <w:spacing w:before="0" w:after="25" w:line="230" w:lineRule="auto"/>
+      </w:pPr>
+      <w:r>
+        <w:rPr>
+          <w:sz w:val="18"/>
+          <w:szCs w:val="18"/>
+        </w:rPr>
+        <w:t xml:space="preserve">•   </w:t>
+      </w:r>
+      <w:r>
+        <w:rPr>
+          <w:sz w:val="18"/>
+          <w:szCs w:val="18"/>
+        </w:rPr>
+        <w:t xml:space="preserve">Real use: a decorator wrapper is written as def wrapper(*args, **kwargs) so it can wrap any function.</w:t>
+      </w:r>
+    </w:p>
+    <w:p>
+      <w:pPr>
+        <w:ind w:left="120" w:hanging="0"/>
+        <w:spacing w:before="50" w:after="110" w:line="230" w:lineRule="auto"/>
+        <w:pBdr>
+          <w:left w:val="single" w:sz="12" w:space="4" w:color="2E5E1F"/>
+        </w:pBdr>
+      </w:pPr>
+      <w:r>
+        <w:rPr>
+          <w:b/>
+          <w:color w:val="2E5E1F"/>
+          <w:sz w:val="18"/>
+          <w:szCs w:val="18"/>
+        </w:rPr>
+        <w:t xml:space="preserve">Interview answer:  </w:t>
+      </w:r>
+      <w:r>
+        <w:rPr>
+          <w:i/>
+          <w:sz w:val="18"/>
+          <w:szCs w:val="18"/>
+        </w:rPr>
+        <w:t xml:space="preserve">*args packs extra positional arguments into a tuple and **kwargs packs extra keyword arguments into a dict. The same stars also unpack collections when calling. I use them in decorators so the wrapper can accept any function's arguments.</w:t>
+      </w:r>
+    </w:p>
+    <w:p>
+      <w:pPr>
+        <w:spacing w:before="140" w:after="40" w:line="230" w:lineRule="auto"/>
+      </w:pPr>
+      <w:r>
+        <w:rPr>
+          <w:b/>
+          <w:sz w:val="21"/>
+          <w:szCs w:val="21"/>
+        </w:rPr>
+        <w:t xml:space="preserve">3.3  Default Arguments and the Mutable Default Trap</w:t>
+      </w:r>
+    </w:p>
+    <w:p>
+      <w:pPr>
+        <w:spacing w:before="0" w:after="40" w:line="230" w:lineRule="auto"/>
+      </w:pPr>
+      <w:r>
+        <w:rPr>
+          <w:b/>
+          <w:sz w:val="18"/>
+          <w:szCs w:val="18"/>
+        </w:rPr>
+        <w:t xml:space="preserve">What it is:  </w:t>
+      </w:r>
+      <w:r>
+        <w:rPr>
+          <w:sz w:val="18"/>
+          <w:szCs w:val="18"/>
+        </w:rPr>
+        <w:t xml:space="preserve">A default argument gives a parameter a value that is used when the caller does not pass one.</w:t>
+      </w:r>
+    </w:p>
+    <w:p>
+      <w:pPr>
+        <w:ind w:left="260" w:hanging="200"/>
+        <w:spacing w:before="0" w:after="25" w:line="230" w:lineRule="auto"/>
+      </w:pPr>
+      <w:r>
+        <w:rPr>
+          <w:sz w:val="18"/>
+          <w:szCs w:val="18"/>
+        </w:rPr>
+        <w:t xml:space="preserve">•   </w:t>
+      </w:r>
+      <w:r>
+        <w:rPr>
+          <w:sz w:val="18"/>
+          <w:szCs w:val="18"/>
+        </w:rPr>
+        <w:t xml:space="preserve">def greet(name, msg="Hello") - calling greet("Sam") uses "Hello".</w:t>
+      </w:r>
+    </w:p>
+    <w:p>
+      <w:pPr>
+        <w:ind w:left="260" w:hanging="200"/>
+        <w:spacing w:before="0" w:after="25" w:line="230" w:lineRule="auto"/>
+      </w:pPr>
+      <w:r>
+        <w:rPr>
+          <w:sz w:val="18"/>
+          <w:szCs w:val="18"/>
+        </w:rPr>
+        <w:t xml:space="preserve">•   </w:t>
+      </w:r>
+      <w:r>
+        <w:rPr>
+          <w:sz w:val="18"/>
+          <w:szCs w:val="18"/>
+        </w:rPr>
+        <w:t xml:space="preserve">Default values are evaluated once, at function definition time - not on every call. This is the key fact.</w:t>
+      </w:r>
+    </w:p>
+    <w:p>
+      <w:pPr>
+        <w:ind w:left="260" w:hanging="200"/>
+        <w:spacing w:before="0" w:after="25" w:line="230" w:lineRule="auto"/>
+      </w:pPr>
+      <w:r>
+        <w:rPr>
+          <w:sz w:val="18"/>
+          <w:szCs w:val="18"/>
+        </w:rPr>
+        <w:t xml:space="preserve">•   </w:t>
+      </w:r>
+      <w:r>
+        <w:rPr>
+          <w:sz w:val="18"/>
+          <w:szCs w:val="18"/>
+        </w:rPr>
+        <w:t xml:space="preserve">Trap: def add(item, items=[]) - the same one list is shared across all calls, so items grows call after call.</w:t>
+      </w:r>
+    </w:p>
+    <w:p>
+      <w:pPr>
+        <w:ind w:left="260" w:hanging="200"/>
+        <w:spacing w:before="0" w:after="25" w:line="230" w:lineRule="auto"/>
+      </w:pPr>
+      <w:r>
+        <w:rPr>
+          <w:sz w:val="18"/>
+          <w:szCs w:val="18"/>
+        </w:rPr>
+        <w:t xml:space="preserve">•   </w:t>
+      </w:r>
+      <w:r>
+        <w:rPr>
+          <w:sz w:val="18"/>
+          <w:szCs w:val="18"/>
+        </w:rPr>
+        <w:t xml:space="preserve">Fix: use None: def add(item, items=None): if items is None: items = []. Now every call gets a fresh list.</w:t>
+      </w:r>
+    </w:p>
+    <w:p>
+      <w:pPr>
+        <w:ind w:left="260" w:hanging="200"/>
+        <w:spacing w:before="0" w:after="25" w:line="230" w:lineRule="auto"/>
+      </w:pPr>
+      <w:r>
+        <w:rPr>
+          <w:sz w:val="18"/>
+          <w:szCs w:val="18"/>
+        </w:rPr>
+        <w:t xml:space="preserve">•   </w:t>
+      </w:r>
+      <w:r>
+        <w:rPr>
+          <w:sz w:val="18"/>
+          <w:szCs w:val="18"/>
+        </w:rPr>
+        <w:t xml:space="preserve">The trap applies to any mutable default: list, dict, set.</w:t>
+      </w:r>
+    </w:p>
+    <w:p>
+      <w:pPr>
+        <w:ind w:left="260" w:hanging="200"/>
+        <w:spacing w:before="0" w:after="25" w:line="230" w:lineRule="auto"/>
+      </w:pPr>
+      <w:r>
+        <w:rPr>
+          <w:sz w:val="18"/>
+          <w:szCs w:val="18"/>
+        </w:rPr>
+        <w:t xml:space="preserve">•   </w:t>
+      </w:r>
+      <w:r>
+        <w:rPr>
+          <w:sz w:val="18"/>
+          <w:szCs w:val="18"/>
+        </w:rPr>
+        <w:t xml:space="preserve">Parameters with defaults must come after parameters without defaults in the signature.</w:t>
+      </w:r>
+    </w:p>
+    <w:p>
+      <w:pPr>
+        <w:ind w:left="120" w:hanging="0"/>
+        <w:spacing w:before="50" w:after="110" w:line="230" w:lineRule="auto"/>
+        <w:pBdr>
+          <w:left w:val="single" w:sz="12" w:space="4" w:color="2E5E1F"/>
+        </w:pBdr>
+      </w:pPr>
+      <w:r>
+        <w:rPr>
+          <w:b/>
+          <w:color w:val="2E5E1F"/>
+          <w:sz w:val="18"/>
+          <w:szCs w:val="18"/>
+        </w:rPr>
+        <w:t xml:space="preserve">Interview answer:  </w:t>
+      </w:r>
+      <w:r>
+        <w:rPr>
+          <w:i/>
+          <w:sz w:val="18"/>
+          <w:szCs w:val="18"/>
+        </w:rPr>
+        <w:t xml:space="preserve">Defaults are evaluated once at definition time, so a mutable default like items=[] is shared by every call - a classic bug. The fix is items=None and creating a new list inside the function.</w:t>
+      </w:r>
+    </w:p>
+    <w:p>
+      <w:pPr>
+        <w:spacing w:before="140" w:after="40" w:line="230" w:lineRule="auto"/>
+      </w:pPr>
+      <w:r>
+        <w:rPr>
+          <w:b/>
+          <w:sz w:val="21"/>
+          <w:szCs w:val="21"/>
+        </w:rPr>
+        <w:t xml:space="preserve">3.4  Scope - LEGB Rule</w:t>
+      </w:r>
+    </w:p>
+    <w:p>
+      <w:pPr>
+        <w:spacing w:before="0" w:after="40" w:line="230" w:lineRule="auto"/>
+      </w:pPr>
+      <w:r>
+        <w:rPr>
+          <w:b/>
+          <w:sz w:val="18"/>
+          <w:szCs w:val="18"/>
+        </w:rPr>
+        <w:t xml:space="preserve">What it is:  </w:t>
+      </w:r>
+      <w:r>
+        <w:rPr>
+          <w:sz w:val="18"/>
+          <w:szCs w:val="18"/>
+        </w:rPr>
+        <w:t xml:space="preserve">Scope decides where a variable can be seen. Python searches names in LEGB order: Local, Enclosing, Global, Built-in.</w:t>
+      </w:r>
+    </w:p>
+    <w:p>
+      <w:pPr>
+        <w:ind w:left="260" w:hanging="200"/>
+        <w:spacing w:before="0" w:after="25" w:line="230" w:lineRule="auto"/>
+      </w:pPr>
+      <w:r>
+        <w:rPr>
+          <w:sz w:val="18"/>
+          <w:szCs w:val="18"/>
+        </w:rPr>
+        <w:t xml:space="preserve">•   </w:t>
+      </w:r>
+      <w:r>
+        <w:rPr>
+          <w:sz w:val="18"/>
+          <w:szCs w:val="18"/>
+        </w:rPr>
+        <w:t xml:space="preserve">Local: names made inside the current function.</w:t>
+      </w:r>
+    </w:p>
+    <w:p>
+      <w:pPr>
+        <w:ind w:left="260" w:hanging="200"/>
+        <w:spacing w:before="0" w:after="25" w:line="230" w:lineRule="auto"/>
+      </w:pPr>
+      <w:r>
+        <w:rPr>
+          <w:sz w:val="18"/>
+          <w:szCs w:val="18"/>
+        </w:rPr>
+        <w:t xml:space="preserve">•   </w:t>
+      </w:r>
+      <w:r>
+        <w:rPr>
+          <w:sz w:val="18"/>
+          <w:szCs w:val="18"/>
+        </w:rPr>
+        <w:t xml:space="preserve">Enclosing: names of the outer function, when functions are nested.</w:t>
+      </w:r>
+    </w:p>
+    <w:p>
+      <w:pPr>
+        <w:ind w:left="260" w:hanging="200"/>
+        <w:spacing w:before="0" w:after="25" w:line="230" w:lineRule="auto"/>
+      </w:pPr>
+      <w:r>
+        <w:rPr>
+          <w:sz w:val="18"/>
+          <w:szCs w:val="18"/>
+        </w:rPr>
+        <w:t xml:space="preserve">•   </w:t>
+      </w:r>
+      <w:r>
+        <w:rPr>
+          <w:sz w:val="18"/>
+          <w:szCs w:val="18"/>
+        </w:rPr>
+        <w:t xml:space="preserve">Global: names at the top level of the file (module).</w:t>
+      </w:r>
+    </w:p>
+    <w:p>
+      <w:pPr>
+        <w:ind w:left="260" w:hanging="200"/>
+        <w:spacing w:before="0" w:after="25" w:line="230" w:lineRule="auto"/>
+      </w:pPr>
+      <w:r>
+        <w:rPr>
+          <w:sz w:val="18"/>
+          <w:szCs w:val="18"/>
+        </w:rPr>
+        <w:t xml:space="preserve">•   </w:t>
+      </w:r>
+      <w:r>
+        <w:rPr>
+          <w:sz w:val="18"/>
+          <w:szCs w:val="18"/>
+        </w:rPr>
+        <w:t xml:space="preserve">Built-in: names Python ships with, like len, print, sum.</w:t>
+      </w:r>
+    </w:p>
+    <w:p>
+      <w:pPr>
+        <w:ind w:left="260" w:hanging="200"/>
+        <w:spacing w:before="0" w:after="25" w:line="230" w:lineRule="auto"/>
+      </w:pPr>
+      <w:r>
+        <w:rPr>
+          <w:sz w:val="18"/>
+          <w:szCs w:val="18"/>
+        </w:rPr>
+        <w:t xml:space="preserve">•   </w:t>
+      </w:r>
+      <w:r>
+        <w:rPr>
+          <w:sz w:val="18"/>
+          <w:szCs w:val="18"/>
+        </w:rPr>
+        <w:t xml:space="preserve">Python checks in that exact order and uses the first match it finds.</w:t>
+      </w:r>
+    </w:p>
+    <w:p>
+      <w:pPr>
+        <w:ind w:left="260" w:hanging="200"/>
+        <w:spacing w:before="0" w:after="25" w:line="230" w:lineRule="auto"/>
+      </w:pPr>
+      <w:r>
+        <w:rPr>
+          <w:sz w:val="18"/>
+          <w:szCs w:val="18"/>
+        </w:rPr>
+        <w:t xml:space="preserve">•   </w:t>
+      </w:r>
+      <w:r>
+        <w:rPr>
+          <w:sz w:val="18"/>
+          <w:szCs w:val="18"/>
+        </w:rPr>
+        <w:t xml:space="preserve">Assigning inside a function makes a new local name by default, even if a global with the same name exists.</w:t>
+      </w:r>
+    </w:p>
+    <w:p>
+      <w:pPr>
+        <w:ind w:left="260" w:hanging="200"/>
+        <w:spacing w:before="0" w:after="25" w:line="230" w:lineRule="auto"/>
+      </w:pPr>
+      <w:r>
+        <w:rPr>
+          <w:sz w:val="18"/>
+          <w:szCs w:val="18"/>
+        </w:rPr>
+        <w:t xml:space="preserve">•   </w:t>
+      </w:r>
+      <w:r>
+        <w:rPr>
+          <w:sz w:val="18"/>
+          <w:szCs w:val="18"/>
+        </w:rPr>
+        <w:t xml:space="preserve">global keyword lets a function assign to a module-level name. nonlocal lets a nested function assign to its enclosing function's name.</w:t>
+      </w:r>
+    </w:p>
+    <w:p>
+      <w:pPr>
+        <w:ind w:left="260" w:hanging="200"/>
+        <w:spacing w:before="0" w:after="25" w:line="230" w:lineRule="auto"/>
+      </w:pPr>
+      <w:r>
+        <w:rPr>
+          <w:sz w:val="18"/>
+          <w:szCs w:val="18"/>
+        </w:rPr>
+        <w:t xml:space="preserve">•   </w:t>
+      </w:r>
+      <w:r>
+        <w:rPr>
+          <w:sz w:val="18"/>
+          <w:szCs w:val="18"/>
+        </w:rPr>
+        <w:t xml:space="preserve">Too much global use makes code hard to test - better to pass values in and return them out.</w:t>
+      </w:r>
+    </w:p>
+    <w:p>
+      <w:pPr>
+        <w:ind w:left="120" w:hanging="0"/>
+        <w:spacing w:before="50" w:after="110" w:line="230" w:lineRule="auto"/>
+        <w:pBdr>
+          <w:left w:val="single" w:sz="12" w:space="4" w:color="2E5E1F"/>
+        </w:pBdr>
+      </w:pPr>
+      <w:r>
+        <w:rPr>
+          <w:b/>
+          <w:color w:val="2E5E1F"/>
+          <w:sz w:val="18"/>
+          <w:szCs w:val="18"/>
+        </w:rPr>
+        <w:t xml:space="preserve">Interview answer:  </w:t>
+      </w:r>
+      <w:r>
+        <w:rPr>
+          <w:i/>
+          <w:sz w:val="18"/>
+          <w:szCs w:val="18"/>
+        </w:rPr>
+        <w:t xml:space="preserve">Python resolves names with the LEGB rule - Local, Enclosing, Global, Built-in - and stops at the first match. Assignment creates a local name unless I declare global or nonlocal. nonlocal is what makes closures with state possible.</w:t>
+      </w:r>
+    </w:p>
+    <w:p>
+      <w:pPr>
+        <w:spacing w:before="140" w:after="40" w:line="230" w:lineRule="auto"/>
+      </w:pPr>
+      <w:r>
+        <w:rPr>
+          <w:b/>
+          <w:sz w:val="21"/>
+          <w:szCs w:val="21"/>
+        </w:rPr>
+        <w:t xml:space="preserve">3.5  Lambda Function</w:t>
+      </w:r>
+    </w:p>
+    <w:p>
+      <w:pPr>
+        <w:spacing w:before="0" w:after="40" w:line="230" w:lineRule="auto"/>
+      </w:pPr>
+      <w:r>
+        <w:rPr>
+          <w:b/>
+          <w:sz w:val="18"/>
+          <w:szCs w:val="18"/>
+        </w:rPr>
+        <w:t xml:space="preserve">What it is:  </w:t>
+      </w:r>
+      <w:r>
+        <w:rPr>
+          <w:sz w:val="18"/>
+          <w:szCs w:val="18"/>
+        </w:rPr>
+        <w:t xml:space="preserve">A lambda is a small anonymous function written in one line.</w:t>
+      </w:r>
+    </w:p>
+    <w:p>
+      <w:pPr>
+        <w:ind w:left="260" w:hanging="200"/>
+        <w:spacing w:before="0" w:after="25" w:line="230" w:lineRule="auto"/>
+      </w:pPr>
+      <w:r>
+        <w:rPr>
+          <w:sz w:val="18"/>
+          <w:szCs w:val="18"/>
+        </w:rPr>
+        <w:t xml:space="preserve">•   </w:t>
+      </w:r>
+      <w:r>
+        <w:rPr>
+          <w:sz w:val="18"/>
+          <w:szCs w:val="18"/>
+        </w:rPr>
+        <w:t xml:space="preserve">Syntax: lambda arguments: expression. Example: square = lambda x: x * x.</w:t>
+      </w:r>
+    </w:p>
+    <w:p>
+      <w:pPr>
+        <w:ind w:left="260" w:hanging="200"/>
+        <w:spacing w:before="0" w:after="25" w:line="230" w:lineRule="auto"/>
+      </w:pPr>
+      <w:r>
+        <w:rPr>
+          <w:sz w:val="18"/>
+          <w:szCs w:val="18"/>
+        </w:rPr>
+        <w:t xml:space="preserve">•   </w:t>
+      </w:r>
+      <w:r>
+        <w:rPr>
+          <w:sz w:val="18"/>
+          <w:szCs w:val="18"/>
+        </w:rPr>
+        <w:t xml:space="preserve">It can hold only one expression - no statements, no loops, no return keyword. The expression's value is returned automatically.</w:t>
+      </w:r>
+    </w:p>
+    <w:p>
+      <w:pPr>
+        <w:ind w:left="260" w:hanging="200"/>
+        <w:spacing w:before="0" w:after="25" w:line="230" w:lineRule="auto"/>
+      </w:pPr>
+      <w:r>
+        <w:rPr>
+          <w:sz w:val="18"/>
+          <w:szCs w:val="18"/>
+        </w:rPr>
+        <w:t xml:space="preserve">•   </w:t>
+      </w:r>
+      <w:r>
+        <w:rPr>
+          <w:sz w:val="18"/>
+          <w:szCs w:val="18"/>
+        </w:rPr>
+        <w:t xml:space="preserve">Main use: short throwaway functions passed to other functions, like sorted(data, key=lambda x: x["age"]).</w:t>
+      </w:r>
+    </w:p>
+    <w:p>
+      <w:pPr>
+        <w:ind w:left="260" w:hanging="200"/>
+        <w:spacing w:before="0" w:after="25" w:line="230" w:lineRule="auto"/>
+      </w:pPr>
+      <w:r>
+        <w:rPr>
+          <w:sz w:val="18"/>
+          <w:szCs w:val="18"/>
+        </w:rPr>
+        <w:t xml:space="preserve">•   </w:t>
+      </w:r>
+      <w:r>
+        <w:rPr>
+          <w:sz w:val="18"/>
+          <w:szCs w:val="18"/>
+        </w:rPr>
+        <w:t xml:space="preserve">Very common as the key in sorted, min, max, and in map and filter.</w:t>
+      </w:r>
+    </w:p>
+    <w:p>
+      <w:pPr>
+        <w:ind w:left="260" w:hanging="200"/>
+        <w:spacing w:before="0" w:after="25" w:line="230" w:lineRule="auto"/>
+      </w:pPr>
+      <w:r>
+        <w:rPr>
+          <w:sz w:val="18"/>
+          <w:szCs w:val="18"/>
+        </w:rPr>
+        <w:t xml:space="preserve">•   </w:t>
+      </w:r>
+      <w:r>
+        <w:rPr>
+          <w:sz w:val="18"/>
+          <w:szCs w:val="18"/>
+        </w:rPr>
+        <w:t xml:space="preserve">For anything longer than one line, a normal def is clearer and easier to debug.</w:t>
+      </w:r>
+    </w:p>
+    <w:p>
+      <w:pPr>
+        <w:ind w:left="260" w:hanging="200"/>
+        <w:spacing w:before="0" w:after="25" w:line="230" w:lineRule="auto"/>
+      </w:pPr>
+      <w:r>
+        <w:rPr>
+          <w:sz w:val="18"/>
+          <w:szCs w:val="18"/>
+        </w:rPr>
+        <w:t xml:space="preserve">•   </w:t>
+      </w:r>
+      <w:r>
+        <w:rPr>
+          <w:sz w:val="18"/>
+          <w:szCs w:val="18"/>
+        </w:rPr>
+        <w:t xml:space="preserve">A lambda is still a real function object - it just has no name.</w:t>
+      </w:r>
+    </w:p>
+    <w:p>
+      <w:pPr>
+        <w:ind w:left="120" w:hanging="0"/>
+        <w:spacing w:before="50" w:after="110" w:line="230" w:lineRule="auto"/>
+        <w:pBdr>
+          <w:left w:val="single" w:sz="12" w:space="4" w:color="2E5E1F"/>
+        </w:pBdr>
+      </w:pPr>
+      <w:r>
+        <w:rPr>
+          <w:b/>
+          <w:color w:val="2E5E1F"/>
+          <w:sz w:val="18"/>
+          <w:szCs w:val="18"/>
+        </w:rPr>
+        <w:t xml:space="preserve">Interview answer:  </w:t>
+      </w:r>
+      <w:r>
+        <w:rPr>
+          <w:i/>
+          <w:sz w:val="18"/>
+          <w:szCs w:val="18"/>
+        </w:rPr>
+        <w:t xml:space="preserve">A lambda is a one-line anonymous function, limited to a single expression. I mostly use it as a sort key, like sorted(users, key=lambda u: u.age). For anything bigger, a named def is better.</w:t>
+      </w:r>
+    </w:p>
+    <w:p>
+      <w:pPr>
+        <w:spacing w:before="140" w:after="40" w:line="230" w:lineRule="auto"/>
+      </w:pPr>
+      <w:r>
+        <w:rPr>
+          <w:b/>
+          <w:sz w:val="21"/>
+          <w:szCs w:val="21"/>
+        </w:rPr>
+        <w:t xml:space="preserve">3.6  map, filter, reduce</w:t>
+      </w:r>
+    </w:p>
+    <w:p>
+      <w:pPr>
+        <w:spacing w:before="0" w:after="40" w:line="230" w:lineRule="auto"/>
+      </w:pPr>
+      <w:r>
+        <w:rPr>
+          <w:b/>
+          <w:sz w:val="18"/>
+          <w:szCs w:val="18"/>
+        </w:rPr>
+        <w:t xml:space="preserve">What it is:  </w:t>
+      </w:r>
+      <w:r>
+        <w:rPr>
+          <w:sz w:val="18"/>
+          <w:szCs w:val="18"/>
+        </w:rPr>
+        <w:t xml:space="preserve">These three take a function and a collection: map transforms every item, filter keeps some items, reduce folds all items into one value.</w:t>
+      </w:r>
+    </w:p>
+    <w:p>
+      <w:pPr>
+        <w:ind w:left="260" w:hanging="200"/>
+        <w:spacing w:before="0" w:after="25" w:line="230" w:lineRule="auto"/>
+      </w:pPr>
+      <w:r>
+        <w:rPr>
+          <w:sz w:val="18"/>
+          <w:szCs w:val="18"/>
+        </w:rPr>
+        <w:t xml:space="preserve">•   </w:t>
+      </w:r>
+      <w:r>
+        <w:rPr>
+          <w:sz w:val="18"/>
+          <w:szCs w:val="18"/>
+        </w:rPr>
+        <w:t xml:space="preserve">map(func, seq): applies func to every item. map(str.upper, names).</w:t>
+      </w:r>
+    </w:p>
+    <w:p>
+      <w:pPr>
+        <w:ind w:left="260" w:hanging="200"/>
+        <w:spacing w:before="0" w:after="25" w:line="230" w:lineRule="auto"/>
+      </w:pPr>
+      <w:r>
+        <w:rPr>
+          <w:sz w:val="18"/>
+          <w:szCs w:val="18"/>
+        </w:rPr>
+        <w:t xml:space="preserve">•   </w:t>
+      </w:r>
+      <w:r>
+        <w:rPr>
+          <w:sz w:val="18"/>
+          <w:szCs w:val="18"/>
+        </w:rPr>
+        <w:t xml:space="preserve">filter(func, seq): keeps items where func returns True. filter(lambda x: x &gt; 0, nums).</w:t>
+      </w:r>
+    </w:p>
+    <w:p>
+      <w:pPr>
+        <w:ind w:left="260" w:hanging="200"/>
+        <w:spacing w:before="0" w:after="25" w:line="230" w:lineRule="auto"/>
+      </w:pPr>
+      <w:r>
+        <w:rPr>
+          <w:sz w:val="18"/>
+          <w:szCs w:val="18"/>
+        </w:rPr>
+        <w:t xml:space="preserve">•   </w:t>
+      </w:r>
+      <w:r>
+        <w:rPr>
+          <w:sz w:val="18"/>
+          <w:szCs w:val="18"/>
+        </w:rPr>
+        <w:t xml:space="preserve">map and filter return lazy iterators in Python 3, so wrap in list() to see the results.</w:t>
+      </w:r>
+    </w:p>
+    <w:p>
+      <w:pPr>
+        <w:ind w:left="260" w:hanging="200"/>
+        <w:spacing w:before="0" w:after="25" w:line="230" w:lineRule="auto"/>
+      </w:pPr>
+      <w:r>
+        <w:rPr>
+          <w:sz w:val="18"/>
+          <w:szCs w:val="18"/>
+        </w:rPr>
+        <w:t xml:space="preserve">•   </w:t>
+      </w:r>
+      <w:r>
+        <w:rPr>
+          <w:sz w:val="18"/>
+          <w:szCs w:val="18"/>
+        </w:rPr>
+        <w:t xml:space="preserve">reduce(func, seq) is in functools. It combines items step by step: reduce(lambda a, b: a + b, nums) sums the list.</w:t>
+      </w:r>
+    </w:p>
+    <w:p>
+      <w:pPr>
+        <w:ind w:left="260" w:hanging="200"/>
+        <w:spacing w:before="0" w:after="25" w:line="230" w:lineRule="auto"/>
+      </w:pPr>
+      <w:r>
+        <w:rPr>
+          <w:sz w:val="18"/>
+          <w:szCs w:val="18"/>
+        </w:rPr>
+        <w:t xml:space="preserve">•   </w:t>
+      </w:r>
+      <w:r>
+        <w:rPr>
+          <w:sz w:val="18"/>
+          <w:szCs w:val="18"/>
+        </w:rPr>
+        <w:t xml:space="preserve">Pythonic note: list comprehensions often read better - [x * 2 for x in nums if x &gt; 0] does map and filter together.</w:t>
+      </w:r>
+    </w:p>
+    <w:p>
+      <w:pPr>
+        <w:ind w:left="260" w:hanging="200"/>
+        <w:spacing w:before="0" w:after="25" w:line="230" w:lineRule="auto"/>
+      </w:pPr>
+      <w:r>
+        <w:rPr>
+          <w:sz w:val="18"/>
+          <w:szCs w:val="18"/>
+        </w:rPr>
+        <w:t xml:space="preserve">•   </w:t>
+      </w:r>
+      <w:r>
+        <w:rPr>
+          <w:sz w:val="18"/>
+          <w:szCs w:val="18"/>
+        </w:rPr>
+        <w:t xml:space="preserve">For common reduce jobs, built-ins already exist: sum, max, min, any, all.</w:t>
+      </w:r>
+    </w:p>
+    <w:p>
+      <w:pPr>
+        <w:ind w:left="120" w:hanging="0"/>
+        <w:spacing w:before="50" w:after="110" w:line="230" w:lineRule="auto"/>
+        <w:pBdr>
+          <w:left w:val="single" w:sz="12" w:space="4" w:color="2E5E1F"/>
+        </w:pBdr>
+      </w:pPr>
+      <w:r>
+        <w:rPr>
+          <w:b/>
+          <w:color w:val="2E5E1F"/>
+          <w:sz w:val="18"/>
+          <w:szCs w:val="18"/>
+        </w:rPr>
+        <w:t xml:space="preserve">Interview answer:  </w:t>
+      </w:r>
+      <w:r>
+        <w:rPr>
+          <w:i/>
+          <w:sz w:val="18"/>
+          <w:szCs w:val="18"/>
+        </w:rPr>
+        <w:t xml:space="preserve">map transforms each item, filter selects items, and reduce (from functools) combines everything into one value. In Python 3 map and filter are lazy iterators. In practice I often prefer comprehensions for readability, and sum/max/any for common folds.</w:t>
+      </w:r>
+    </w:p>
+    <w:p>
+      <w:pPr>
+        <w:spacing w:before="140" w:after="40" w:line="230" w:lineRule="auto"/>
+      </w:pPr>
+      <w:r>
+        <w:rPr>
+          <w:b/>
+          <w:sz w:val="21"/>
+          <w:szCs w:val="21"/>
+        </w:rPr>
+        <w:t xml:space="preserve">3.7  Closure</w:t>
+      </w:r>
+    </w:p>
+    <w:p>
+      <w:pPr>
+        <w:spacing w:before="0" w:after="40" w:line="230" w:lineRule="auto"/>
+      </w:pPr>
+      <w:r>
+        <w:rPr>
+          <w:b/>
+          <w:sz w:val="18"/>
+          <w:szCs w:val="18"/>
+        </w:rPr>
+        <w:t xml:space="preserve">What it is:  </w:t>
+      </w:r>
+      <w:r>
+        <w:rPr>
+          <w:sz w:val="18"/>
+          <w:szCs w:val="18"/>
+        </w:rPr>
+        <w:t xml:space="preserve">A closure is an inner function that remembers variables from its outer function, even after the outer function has finished.</w:t>
+      </w:r>
+    </w:p>
+    <w:p>
+      <w:pPr>
+        <w:ind w:left="260" w:hanging="200"/>
+        <w:spacing w:before="0" w:after="25" w:line="230" w:lineRule="auto"/>
+      </w:pPr>
+      <w:r>
+        <w:rPr>
+          <w:sz w:val="18"/>
+          <w:szCs w:val="18"/>
+        </w:rPr>
+        <w:t xml:space="preserve">•   </w:t>
+      </w:r>
+      <w:r>
+        <w:rPr>
+          <w:sz w:val="18"/>
+          <w:szCs w:val="18"/>
+        </w:rPr>
+        <w:t xml:space="preserve">Made by defining a function inside a function and returning the inner one.</w:t>
+      </w:r>
+    </w:p>
+    <w:p>
+      <w:pPr>
+        <w:ind w:left="260" w:hanging="200"/>
+        <w:spacing w:before="0" w:after="25" w:line="230" w:lineRule="auto"/>
+      </w:pPr>
+      <w:r>
+        <w:rPr>
+          <w:sz w:val="18"/>
+          <w:szCs w:val="18"/>
+        </w:rPr>
+        <w:t xml:space="preserve">•   </w:t>
+      </w:r>
+      <w:r>
+        <w:rPr>
+          <w:sz w:val="18"/>
+          <w:szCs w:val="18"/>
+        </w:rPr>
+        <w:t xml:space="preserve">Example: def counter(): count = 0; def inc(): nonlocal count; count += 1; return count; return inc.</w:t>
+      </w:r>
+    </w:p>
+    <w:p>
+      <w:pPr>
+        <w:ind w:left="260" w:hanging="200"/>
+        <w:spacing w:before="0" w:after="25" w:line="230" w:lineRule="auto"/>
+      </w:pPr>
+      <w:r>
+        <w:rPr>
+          <w:sz w:val="18"/>
+          <w:szCs w:val="18"/>
+        </w:rPr>
+        <w:t xml:space="preserve">•   </w:t>
+      </w:r>
+      <w:r>
+        <w:rPr>
+          <w:sz w:val="18"/>
+          <w:szCs w:val="18"/>
+        </w:rPr>
+        <w:t xml:space="preserve">The returned inc still holds count - that captured state is the closure.</w:t>
+      </w:r>
+    </w:p>
+    <w:p>
+      <w:pPr>
+        <w:ind w:left="260" w:hanging="200"/>
+        <w:spacing w:before="0" w:after="25" w:line="230" w:lineRule="auto"/>
+      </w:pPr>
+      <w:r>
+        <w:rPr>
+          <w:sz w:val="18"/>
+          <w:szCs w:val="18"/>
+        </w:rPr>
+        <w:t xml:space="preserve">•   </w:t>
+      </w:r>
+      <w:r>
+        <w:rPr>
+          <w:sz w:val="18"/>
+          <w:szCs w:val="18"/>
+        </w:rPr>
+        <w:t xml:space="preserve">Each call of the outer function makes a fresh, independent closure with its own state.</w:t>
+      </w:r>
+    </w:p>
+    <w:p>
+      <w:pPr>
+        <w:ind w:left="260" w:hanging="200"/>
+        <w:spacing w:before="0" w:after="25" w:line="230" w:lineRule="auto"/>
+      </w:pPr>
+      <w:r>
+        <w:rPr>
+          <w:sz w:val="18"/>
+          <w:szCs w:val="18"/>
+        </w:rPr>
+        <w:t xml:space="preserve">•   </w:t>
+      </w:r>
+      <w:r>
+        <w:rPr>
+          <w:sz w:val="18"/>
+          <w:szCs w:val="18"/>
+        </w:rPr>
+        <w:t xml:space="preserve">nonlocal is needed when the inner function wants to reassign the captured variable.</w:t>
+      </w:r>
+    </w:p>
+    <w:p>
+      <w:pPr>
+        <w:ind w:left="260" w:hanging="200"/>
+        <w:spacing w:before="0" w:after="25" w:line="230" w:lineRule="auto"/>
+      </w:pPr>
+      <w:r>
+        <w:rPr>
+          <w:sz w:val="18"/>
+          <w:szCs w:val="18"/>
+        </w:rPr>
+        <w:t xml:space="preserve">•   </w:t>
+      </w:r>
+      <w:r>
+        <w:rPr>
+          <w:sz w:val="18"/>
+          <w:szCs w:val="18"/>
+        </w:rPr>
+        <w:t xml:space="preserve">Closures give private state without writing a class - and they are exactly how decorators remember the function they wrap.</w:t>
+      </w:r>
+    </w:p>
+    <w:p>
+      <w:pPr>
+        <w:ind w:left="120" w:hanging="0"/>
+        <w:spacing w:before="50" w:after="110" w:line="230" w:lineRule="auto"/>
+        <w:pBdr>
+          <w:left w:val="single" w:sz="12" w:space="4" w:color="2E5E1F"/>
+        </w:pBdr>
+      </w:pPr>
+      <w:r>
+        <w:rPr>
+          <w:b/>
+          <w:color w:val="2E5E1F"/>
+          <w:sz w:val="18"/>
+          <w:szCs w:val="18"/>
+        </w:rPr>
+        <w:t xml:space="preserve">Interview answer:  </w:t>
+      </w:r>
+      <w:r>
+        <w:rPr>
+          <w:i/>
+          <w:sz w:val="18"/>
+          <w:szCs w:val="18"/>
+        </w:rPr>
+        <w:t xml:space="preserve">A closure is an inner function that keeps access to its outer function's variables after the outer one returns. It gives private state without a class, and decorators are built on this - the wrapper is a closure holding the original function.</w:t>
+      </w:r>
+    </w:p>
+    <w:p>
+      <w:pPr>
+        <w:spacing w:before="140" w:after="40" w:line="230" w:lineRule="auto"/>
+      </w:pPr>
+      <w:r>
+        <w:rPr>
+          <w:b/>
+          <w:sz w:val="21"/>
+          <w:szCs w:val="21"/>
+        </w:rPr>
+        <w:t xml:space="preserve">3.8  Decorator</w:t>
+      </w:r>
+    </w:p>
+    <w:p>
+      <w:pPr>
+        <w:spacing w:before="0" w:after="40" w:line="230" w:lineRule="auto"/>
+      </w:pPr>
+      <w:r>
+        <w:rPr>
+          <w:b/>
+          <w:sz w:val="18"/>
+          <w:szCs w:val="18"/>
+        </w:rPr>
+        <w:t xml:space="preserve">What it is:  </w:t>
+      </w:r>
+      <w:r>
+        <w:rPr>
+          <w:sz w:val="18"/>
+          <w:szCs w:val="18"/>
+        </w:rPr>
+        <w:t xml:space="preserve">A decorator is a function that takes another function and returns a new function with extra behavior, without changing the original code.</w:t>
+      </w:r>
+    </w:p>
+    <w:p>
+      <w:pPr>
+        <w:ind w:left="260" w:hanging="200"/>
+        <w:spacing w:before="0" w:after="25" w:line="230" w:lineRule="auto"/>
+      </w:pPr>
+      <w:r>
+        <w:rPr>
+          <w:sz w:val="18"/>
+          <w:szCs w:val="18"/>
+        </w:rPr>
+        <w:t xml:space="preserve">•   </w:t>
+      </w:r>
+      <w:r>
+        <w:rPr>
+          <w:sz w:val="18"/>
+          <w:szCs w:val="18"/>
+        </w:rPr>
+        <w:t xml:space="preserve">Base idea: functions are objects, so they can be passed in and returned.</w:t>
+      </w:r>
+    </w:p>
+    <w:p>
+      <w:pPr>
+        <w:ind w:left="260" w:hanging="200"/>
+        <w:spacing w:before="0" w:after="25" w:line="230" w:lineRule="auto"/>
+      </w:pPr>
+      <w:r>
+        <w:rPr>
+          <w:sz w:val="18"/>
+          <w:szCs w:val="18"/>
+        </w:rPr>
+        <w:t xml:space="preserve">•   </w:t>
+      </w:r>
+      <w:r>
+        <w:rPr>
+          <w:sz w:val="18"/>
+          <w:szCs w:val="18"/>
+        </w:rPr>
+        <w:t xml:space="preserve">Shape: def deco(func): def wrapper(*args, **kwargs): ...before...; result = func(*args, **kwargs); ...after...; return result; return wrapper.</w:t>
+      </w:r>
+    </w:p>
+    <w:p>
+      <w:pPr>
+        <w:ind w:left="260" w:hanging="200"/>
+        <w:spacing w:before="0" w:after="25" w:line="230" w:lineRule="auto"/>
+      </w:pPr>
+      <w:r>
+        <w:rPr>
+          <w:sz w:val="18"/>
+          <w:szCs w:val="18"/>
+        </w:rPr>
+        <w:t xml:space="preserve">•   </w:t>
+      </w:r>
+      <w:r>
+        <w:rPr>
+          <w:sz w:val="18"/>
+          <w:szCs w:val="18"/>
+        </w:rPr>
+        <w:t xml:space="preserve">@deco above a function is just short for func = deco(func).</w:t>
+      </w:r>
+    </w:p>
+    <w:p>
+      <w:pPr>
+        <w:ind w:left="260" w:hanging="200"/>
+        <w:spacing w:before="0" w:after="25" w:line="230" w:lineRule="auto"/>
+      </w:pPr>
+      <w:r>
+        <w:rPr>
+          <w:sz w:val="18"/>
+          <w:szCs w:val="18"/>
+        </w:rPr>
+        <w:t xml:space="preserve">•   </w:t>
+      </w:r>
+      <w:r>
+        <w:rPr>
+          <w:sz w:val="18"/>
+          <w:szCs w:val="18"/>
+        </w:rPr>
+        <w:t xml:space="preserve">Real uses: logging, timing, caching, retry, authentication checks - Flask and Django routes (@app.route) are decorators.</w:t>
+      </w:r>
+    </w:p>
+    <w:p>
+      <w:pPr>
+        <w:ind w:left="260" w:hanging="200"/>
+        <w:spacing w:before="0" w:after="25" w:line="230" w:lineRule="auto"/>
+      </w:pPr>
+      <w:r>
+        <w:rPr>
+          <w:sz w:val="18"/>
+          <w:szCs w:val="18"/>
+        </w:rPr>
+        <w:t xml:space="preserve">•   </w:t>
+      </w:r>
+      <w:r>
+        <w:rPr>
+          <w:sz w:val="18"/>
+          <w:szCs w:val="18"/>
+        </w:rPr>
+        <w:t xml:space="preserve">functools.wraps(func) on the wrapper keeps the original name and docstring - always add it.</w:t>
+      </w:r>
+    </w:p>
+    <w:p>
+      <w:pPr>
+        <w:ind w:left="260" w:hanging="200"/>
+        <w:spacing w:before="0" w:after="25" w:line="230" w:lineRule="auto"/>
+      </w:pPr>
+      <w:r>
+        <w:rPr>
+          <w:sz w:val="18"/>
+          <w:szCs w:val="18"/>
+        </w:rPr>
+        <w:t xml:space="preserve">•   </w:t>
+      </w:r>
+      <w:r>
+        <w:rPr>
+          <w:sz w:val="18"/>
+          <w:szCs w:val="18"/>
+        </w:rPr>
+        <w:t xml:space="preserve">A decorator with its own arguments, like @retry(times=3), needs one more outer layer of nesting.</w:t>
+      </w:r>
+    </w:p>
+    <w:p>
+      <w:pPr>
+        <w:ind w:left="260" w:hanging="200"/>
+        <w:spacing w:before="0" w:after="25" w:line="230" w:lineRule="auto"/>
+      </w:pPr>
+      <w:r>
+        <w:rPr>
+          <w:sz w:val="18"/>
+          <w:szCs w:val="18"/>
+        </w:rPr>
+        <w:t xml:space="preserve">•   </w:t>
+      </w:r>
+      <w:r>
+        <w:rPr>
+          <w:sz w:val="18"/>
+          <w:szCs w:val="18"/>
+        </w:rPr>
+        <w:t xml:space="preserve">Built-in useful ones: @staticmethod, @classmethod, @property, functools.lru_cache.</w:t>
+      </w:r>
+    </w:p>
+    <w:p>
+      <w:pPr>
+        <w:ind w:left="120" w:hanging="0"/>
+        <w:spacing w:before="50" w:after="110" w:line="230" w:lineRule="auto"/>
+        <w:pBdr>
+          <w:left w:val="single" w:sz="12" w:space="4" w:color="2E5E1F"/>
+        </w:pBdr>
+      </w:pPr>
+      <w:r>
+        <w:rPr>
+          <w:b/>
+          <w:color w:val="2E5E1F"/>
+          <w:sz w:val="18"/>
+          <w:szCs w:val="18"/>
+        </w:rPr>
+        <w:t xml:space="preserve">Interview answer:  </w:t>
+      </w:r>
+      <w:r>
+        <w:rPr>
+          <w:i/>
+          <w:sz w:val="18"/>
+          <w:szCs w:val="18"/>
+        </w:rPr>
+        <w:t xml:space="preserve">A decorator wraps a function to add behavior like logging, timing or auth, without touching its code. @deco is just func = deco(func) - a closure returns the wrapper. I use functools.wraps to keep the original metadata, and I have used them in Flask routes and for retry logic.</w:t>
+      </w:r>
+    </w:p>
+    <w:p>
+      <w:pPr>
+        <w:spacing w:before="140" w:after="40" w:line="230" w:lineRule="auto"/>
+      </w:pPr>
+      <w:r>
+        <w:rPr>
+          <w:b/>
+          <w:sz w:val="21"/>
+          <w:szCs w:val="21"/>
+        </w:rPr>
+        <w:t xml:space="preserve">3.9  Recursion</w:t>
+      </w:r>
+    </w:p>
+    <w:p>
+      <w:pPr>
+        <w:spacing w:before="0" w:after="40" w:line="230" w:lineRule="auto"/>
+      </w:pPr>
+      <w:r>
+        <w:rPr>
+          <w:b/>
+          <w:sz w:val="18"/>
+          <w:szCs w:val="18"/>
+        </w:rPr>
+        <w:t xml:space="preserve">What it is:  </w:t>
+      </w:r>
+      <w:r>
+        <w:rPr>
+          <w:sz w:val="18"/>
+          <w:szCs w:val="18"/>
+        </w:rPr>
+        <w:t xml:space="preserve">Recursion is when a function calls itself to solve a problem by breaking it into smaller copies of the same problem.</w:t>
+      </w:r>
+    </w:p>
+    <w:p>
+      <w:pPr>
+        <w:ind w:left="260" w:hanging="200"/>
+        <w:spacing w:before="0" w:after="25" w:line="230" w:lineRule="auto"/>
+      </w:pPr>
+      <w:r>
+        <w:rPr>
+          <w:sz w:val="18"/>
+          <w:szCs w:val="18"/>
+        </w:rPr>
+        <w:t xml:space="preserve">•   </w:t>
+      </w:r>
+      <w:r>
+        <w:rPr>
+          <w:sz w:val="18"/>
+          <w:szCs w:val="18"/>
+        </w:rPr>
+        <w:t xml:space="preserve">Every recursion needs two parts: a base case (when to stop) and a recursive case (the self-call on a smaller input).</w:t>
+      </w:r>
+    </w:p>
+    <w:p>
+      <w:pPr>
+        <w:ind w:left="260" w:hanging="200"/>
+        <w:spacing w:before="0" w:after="25" w:line="230" w:lineRule="auto"/>
+      </w:pPr>
+      <w:r>
+        <w:rPr>
+          <w:sz w:val="18"/>
+          <w:szCs w:val="18"/>
+        </w:rPr>
+        <w:t xml:space="preserve">•   </w:t>
+      </w:r>
+      <w:r>
+        <w:rPr>
+          <w:sz w:val="18"/>
+          <w:szCs w:val="18"/>
+        </w:rPr>
+        <w:t xml:space="preserve">Example: factorial(n) = 1 if n &lt;= 1 else n * factorial(n - 1).</w:t>
+      </w:r>
+    </w:p>
+    <w:p>
+      <w:pPr>
+        <w:ind w:left="260" w:hanging="200"/>
+        <w:spacing w:before="0" w:after="25" w:line="230" w:lineRule="auto"/>
+      </w:pPr>
+      <w:r>
+        <w:rPr>
+          <w:sz w:val="18"/>
+          <w:szCs w:val="18"/>
+        </w:rPr>
+        <w:t xml:space="preserve">•   </w:t>
+      </w:r>
+      <w:r>
+        <w:rPr>
+          <w:sz w:val="18"/>
+          <w:szCs w:val="18"/>
+        </w:rPr>
+        <w:t xml:space="preserve">No base case, or a base case never reached, gives RecursionError: maximum recursion depth exceeded.</w:t>
+      </w:r>
+    </w:p>
+    <w:p>
+      <w:pPr>
+        <w:ind w:left="260" w:hanging="200"/>
+        <w:spacing w:before="0" w:after="25" w:line="230" w:lineRule="auto"/>
+      </w:pPr>
+      <w:r>
+        <w:rPr>
+          <w:sz w:val="18"/>
+          <w:szCs w:val="18"/>
+        </w:rPr>
+        <w:t xml:space="preserve">•   </w:t>
+      </w:r>
+      <w:r>
+        <w:rPr>
+          <w:sz w:val="18"/>
+          <w:szCs w:val="18"/>
+        </w:rPr>
+        <w:t xml:space="preserve">Python's default depth limit is about 1000 calls, and Python does not optimize tail calls.</w:t>
+      </w:r>
+    </w:p>
+    <w:p>
+      <w:pPr>
+        <w:ind w:left="260" w:hanging="200"/>
+        <w:spacing w:before="0" w:after="25" w:line="230" w:lineRule="auto"/>
+      </w:pPr>
+      <w:r>
+        <w:rPr>
+          <w:sz w:val="18"/>
+          <w:szCs w:val="18"/>
+        </w:rPr>
+        <w:t xml:space="preserve">•   </w:t>
+      </w:r>
+      <w:r>
+        <w:rPr>
+          <w:sz w:val="18"/>
+          <w:szCs w:val="18"/>
+        </w:rPr>
+        <w:t xml:space="preserve">Each call adds a stack frame, so very deep recursion costs memory - a loop is often safer in Python.</w:t>
+      </w:r>
+    </w:p>
+    <w:p>
+      <w:pPr>
+        <w:ind w:left="260" w:hanging="200"/>
+        <w:spacing w:before="0" w:after="25" w:line="230" w:lineRule="auto"/>
+      </w:pPr>
+      <w:r>
+        <w:rPr>
+          <w:sz w:val="18"/>
+          <w:szCs w:val="18"/>
+        </w:rPr>
+        <w:t xml:space="preserve">•   </w:t>
+      </w:r>
+      <w:r>
+        <w:rPr>
+          <w:sz w:val="18"/>
+          <w:szCs w:val="18"/>
+        </w:rPr>
+        <w:t xml:space="preserve">Best fit: tree-shaped problems - walking folders, nested JSON, tree data structures.</w:t>
+      </w:r>
+    </w:p>
+    <w:p>
+      <w:pPr>
+        <w:ind w:left="260" w:hanging="200"/>
+        <w:spacing w:before="0" w:after="25" w:line="230" w:lineRule="auto"/>
+      </w:pPr>
+      <w:r>
+        <w:rPr>
+          <w:sz w:val="18"/>
+          <w:szCs w:val="18"/>
+        </w:rPr>
+        <w:t xml:space="preserve">•   </w:t>
+      </w:r>
+      <w:r>
+        <w:rPr>
+          <w:sz w:val="18"/>
+          <w:szCs w:val="18"/>
+        </w:rPr>
+        <w:t xml:space="preserve">Repeated sub-problems (like naive fibonacci) become fast with caching: @functools.lru_cache.</w:t>
+      </w:r>
+    </w:p>
+    <w:p>
+      <w:pPr>
+        <w:ind w:left="120" w:hanging="0"/>
+        <w:spacing w:before="50" w:after="110" w:line="230" w:lineRule="auto"/>
+        <w:pBdr>
+          <w:left w:val="single" w:sz="12" w:space="4" w:color="2E5E1F"/>
+        </w:pBdr>
+      </w:pPr>
+      <w:r>
+        <w:rPr>
+          <w:b/>
+          <w:color w:val="2E5E1F"/>
+          <w:sz w:val="18"/>
+          <w:szCs w:val="18"/>
+        </w:rPr>
+        <w:t xml:space="preserve">Interview answer:  </w:t>
+      </w:r>
+      <w:r>
+        <w:rPr>
+          <w:i/>
+          <w:sz w:val="18"/>
+          <w:szCs w:val="18"/>
+        </w:rPr>
+        <w:t xml:space="preserve">Recursion is a function calling itself with a smaller input until a base case stops it. Python has a ~1000 frame limit and no tail-call optimization, so I use recursion for tree-like data and prefer loops for simple linear work, adding lru_cache when sub-problems repeat.</w:t>
       </w:r>
     </w:p>
     <w:sectPr>

</xml_diff>

<commit_message>
Phase 4: OOP (10 topics)
Class/object, __init__/self, four pillars, inheritance+MRO, overloading vs
overriding, method types, dunder methods, @property, abstract class, composition

Co-Authored-By: Claude Fable 5 <noreply@anthropic.com>
Claude-Session: https://claude.ai/code/session_01Vm8nqoCZNTvUn3BNmW1Tgz
</commit_message>
<xml_diff>
--- a/Python_Interview_Theory.docx
+++ b/Python_Interview_Theory.docx
@@ -4349,6 +4349,1850 @@
           <w:szCs w:val="18"/>
         </w:rPr>
         <w:t xml:space="preserve">Recursion is a function calling itself with a smaller input until a base case stops it. Python has a ~1000 frame limit and no tail-call optimization, so I use recursion for tree-like data and prefer loops for simple linear work, adding lru_cache when sub-problems repeat.</w:t>
+      </w:r>
+    </w:p>
+    <w:p>
+      <w:pPr>
+        <w:spacing w:before="200" w:after="60" w:line="230" w:lineRule="auto"/>
+      </w:pPr>
+      <w:r>
+        <w:rPr>
+          <w:b/>
+          <w:color w:val="1F4E79"/>
+          <w:sz w:val="26"/>
+          <w:szCs w:val="26"/>
+        </w:rPr>
+        <w:t xml:space="preserve">Phase 4 - Object Oriented Programming (OOP)</w:t>
+      </w:r>
+    </w:p>
+    <w:p>
+      <w:pPr>
+        <w:spacing w:before="140" w:after="40" w:line="230" w:lineRule="auto"/>
+      </w:pPr>
+      <w:r>
+        <w:rPr>
+          <w:b/>
+          <w:sz w:val="21"/>
+          <w:szCs w:val="21"/>
+        </w:rPr>
+        <w:t xml:space="preserve">4.1  Class and Object</w:t>
+      </w:r>
+    </w:p>
+    <w:p>
+      <w:pPr>
+        <w:spacing w:before="0" w:after="40" w:line="230" w:lineRule="auto"/>
+      </w:pPr>
+      <w:r>
+        <w:rPr>
+          <w:b/>
+          <w:sz w:val="18"/>
+          <w:szCs w:val="18"/>
+        </w:rPr>
+        <w:t xml:space="preserve">What it is:  </w:t>
+      </w:r>
+      <w:r>
+        <w:rPr>
+          <w:sz w:val="18"/>
+          <w:szCs w:val="18"/>
+        </w:rPr>
+        <w:t xml:space="preserve">A class is a blueprint. An object is a real thing built from that blueprint.</w:t>
+      </w:r>
+    </w:p>
+    <w:p>
+      <w:pPr>
+        <w:ind w:left="260" w:hanging="200"/>
+        <w:spacing w:before="0" w:after="25" w:line="230" w:lineRule="auto"/>
+      </w:pPr>
+      <w:r>
+        <w:rPr>
+          <w:sz w:val="18"/>
+          <w:szCs w:val="18"/>
+        </w:rPr>
+        <w:t xml:space="preserve">•   </w:t>
+      </w:r>
+      <w:r>
+        <w:rPr>
+          <w:sz w:val="18"/>
+          <w:szCs w:val="18"/>
+        </w:rPr>
+        <w:t xml:space="preserve">The class defines what data (attributes) and actions (methods) its objects will have.</w:t>
+      </w:r>
+    </w:p>
+    <w:p>
+      <w:pPr>
+        <w:ind w:left="260" w:hanging="200"/>
+        <w:spacing w:before="0" w:after="25" w:line="230" w:lineRule="auto"/>
+      </w:pPr>
+      <w:r>
+        <w:rPr>
+          <w:sz w:val="18"/>
+          <w:szCs w:val="18"/>
+        </w:rPr>
+        <w:t xml:space="preserve">•   </w:t>
+      </w:r>
+      <w:r>
+        <w:rPr>
+          <w:sz w:val="18"/>
+          <w:szCs w:val="18"/>
+        </w:rPr>
+        <w:t xml:space="preserve">An object (instance) is created by calling the class: user = User("Sam"). Each object has its own data.</w:t>
+      </w:r>
+    </w:p>
+    <w:p>
+      <w:pPr>
+        <w:ind w:left="260" w:hanging="200"/>
+        <w:spacing w:before="0" w:after="25" w:line="230" w:lineRule="auto"/>
+      </w:pPr>
+      <w:r>
+        <w:rPr>
+          <w:sz w:val="18"/>
+          <w:szCs w:val="18"/>
+        </w:rPr>
+        <w:t xml:space="preserve">•   </w:t>
+      </w:r>
+      <w:r>
+        <w:rPr>
+          <w:sz w:val="18"/>
+          <w:szCs w:val="18"/>
+        </w:rPr>
+        <w:t xml:space="preserve">Class attribute: shared by all objects, defined directly in the class body.</w:t>
+      </w:r>
+    </w:p>
+    <w:p>
+      <w:pPr>
+        <w:ind w:left="260" w:hanging="200"/>
+        <w:spacing w:before="0" w:after="25" w:line="230" w:lineRule="auto"/>
+      </w:pPr>
+      <w:r>
+        <w:rPr>
+          <w:sz w:val="18"/>
+          <w:szCs w:val="18"/>
+        </w:rPr>
+        <w:t xml:space="preserve">•   </w:t>
+      </w:r>
+      <w:r>
+        <w:rPr>
+          <w:sz w:val="18"/>
+          <w:szCs w:val="18"/>
+        </w:rPr>
+        <w:t xml:space="preserve">Instance attribute: belongs to one object, usually set inside __init__ with self.name = value.</w:t>
+      </w:r>
+    </w:p>
+    <w:p>
+      <w:pPr>
+        <w:ind w:left="260" w:hanging="200"/>
+        <w:spacing w:before="0" w:after="25" w:line="230" w:lineRule="auto"/>
+      </w:pPr>
+      <w:r>
+        <w:rPr>
+          <w:sz w:val="18"/>
+          <w:szCs w:val="18"/>
+        </w:rPr>
+        <w:t xml:space="preserve">•   </w:t>
+      </w:r>
+      <w:r>
+        <w:rPr>
+          <w:sz w:val="18"/>
+          <w:szCs w:val="18"/>
+        </w:rPr>
+        <w:t xml:space="preserve">One class, many objects: User("A") and User("B") are independent.</w:t>
+      </w:r>
+    </w:p>
+    <w:p>
+      <w:pPr>
+        <w:ind w:left="260" w:hanging="200"/>
+        <w:spacing w:before="0" w:after="25" w:line="230" w:lineRule="auto"/>
+      </w:pPr>
+      <w:r>
+        <w:rPr>
+          <w:sz w:val="18"/>
+          <w:szCs w:val="18"/>
+        </w:rPr>
+        <w:t xml:space="preserve">•   </w:t>
+      </w:r>
+      <w:r>
+        <w:rPr>
+          <w:sz w:val="18"/>
+          <w:szCs w:val="18"/>
+        </w:rPr>
+        <w:t xml:space="preserve">Why OOP: it groups data and behavior together, models real things, and makes big code easier to organize and reuse.</w:t>
+      </w:r>
+    </w:p>
+    <w:p>
+      <w:pPr>
+        <w:ind w:left="120" w:hanging="0"/>
+        <w:spacing w:before="50" w:after="110" w:line="230" w:lineRule="auto"/>
+        <w:pBdr>
+          <w:left w:val="single" w:sz="12" w:space="4" w:color="2E5E1F"/>
+        </w:pBdr>
+      </w:pPr>
+      <w:r>
+        <w:rPr>
+          <w:b/>
+          <w:color w:val="2E5E1F"/>
+          <w:sz w:val="18"/>
+          <w:szCs w:val="18"/>
+        </w:rPr>
+        <w:t xml:space="preserve">Interview answer:  </w:t>
+      </w:r>
+      <w:r>
+        <w:rPr>
+          <w:i/>
+          <w:sz w:val="18"/>
+          <w:szCs w:val="18"/>
+        </w:rPr>
+        <w:t xml:space="preserve">A class is a blueprint that defines attributes and methods, and an object is an instance of that class with its own data. Class attributes are shared, instance attributes belong to one object.</w:t>
+      </w:r>
+    </w:p>
+    <w:p>
+      <w:pPr>
+        <w:spacing w:before="140" w:after="40" w:line="230" w:lineRule="auto"/>
+      </w:pPr>
+      <w:r>
+        <w:rPr>
+          <w:b/>
+          <w:sz w:val="21"/>
+          <w:szCs w:val="21"/>
+        </w:rPr>
+        <w:t xml:space="preserve">4.2  __init__ and self</w:t>
+      </w:r>
+    </w:p>
+    <w:p>
+      <w:pPr>
+        <w:spacing w:before="0" w:after="40" w:line="230" w:lineRule="auto"/>
+      </w:pPr>
+      <w:r>
+        <w:rPr>
+          <w:b/>
+          <w:sz w:val="18"/>
+          <w:szCs w:val="18"/>
+        </w:rPr>
+        <w:t xml:space="preserve">What it is:  </w:t>
+      </w:r>
+      <w:r>
+        <w:rPr>
+          <w:sz w:val="18"/>
+          <w:szCs w:val="18"/>
+        </w:rPr>
+        <w:t xml:space="preserve">__init__ is the initializer that runs when an object is created, and self is the object itself.</w:t>
+      </w:r>
+    </w:p>
+    <w:p>
+      <w:pPr>
+        <w:ind w:left="260" w:hanging="200"/>
+        <w:spacing w:before="0" w:after="25" w:line="230" w:lineRule="auto"/>
+      </w:pPr>
+      <w:r>
+        <w:rPr>
+          <w:sz w:val="18"/>
+          <w:szCs w:val="18"/>
+        </w:rPr>
+        <w:t xml:space="preserve">•   </w:t>
+      </w:r>
+      <w:r>
+        <w:rPr>
+          <w:sz w:val="18"/>
+          <w:szCs w:val="18"/>
+        </w:rPr>
+        <w:t xml:space="preserve">When we call User("Sam"), Python first creates the object, then calls __init__ on it to set the starting data.</w:t>
+      </w:r>
+    </w:p>
+    <w:p>
+      <w:pPr>
+        <w:ind w:left="260" w:hanging="200"/>
+        <w:spacing w:before="0" w:after="25" w:line="230" w:lineRule="auto"/>
+      </w:pPr>
+      <w:r>
+        <w:rPr>
+          <w:sz w:val="18"/>
+          <w:szCs w:val="18"/>
+        </w:rPr>
+        <w:t xml:space="preserve">•   </w:t>
+      </w:r>
+      <w:r>
+        <w:rPr>
+          <w:sz w:val="18"/>
+          <w:szCs w:val="18"/>
+        </w:rPr>
+        <w:t xml:space="preserve">__init__ is not really a constructor - the object is created by __new__. __init__ only fills it. (Interviewers like this detail.)</w:t>
+      </w:r>
+    </w:p>
+    <w:p>
+      <w:pPr>
+        <w:ind w:left="260" w:hanging="200"/>
+        <w:spacing w:before="0" w:after="25" w:line="230" w:lineRule="auto"/>
+      </w:pPr>
+      <w:r>
+        <w:rPr>
+          <w:sz w:val="18"/>
+          <w:szCs w:val="18"/>
+        </w:rPr>
+        <w:t xml:space="preserve">•   </w:t>
+      </w:r>
+      <w:r>
+        <w:rPr>
+          <w:sz w:val="18"/>
+          <w:szCs w:val="18"/>
+        </w:rPr>
+        <w:t xml:space="preserve">self is the first parameter of every instance method. It is the object the method was called on.</w:t>
+      </w:r>
+    </w:p>
+    <w:p>
+      <w:pPr>
+        <w:ind w:left="260" w:hanging="200"/>
+        <w:spacing w:before="0" w:after="25" w:line="230" w:lineRule="auto"/>
+      </w:pPr>
+      <w:r>
+        <w:rPr>
+          <w:sz w:val="18"/>
+          <w:szCs w:val="18"/>
+        </w:rPr>
+        <w:t xml:space="preserve">•   </w:t>
+      </w:r>
+      <w:r>
+        <w:rPr>
+          <w:sz w:val="18"/>
+          <w:szCs w:val="18"/>
+        </w:rPr>
+        <w:t xml:space="preserve">user.greet() is really User.greet(user) - Python passes the object as self automatically.</w:t>
+      </w:r>
+    </w:p>
+    <w:p>
+      <w:pPr>
+        <w:ind w:left="260" w:hanging="200"/>
+        <w:spacing w:before="0" w:after="25" w:line="230" w:lineRule="auto"/>
+      </w:pPr>
+      <w:r>
+        <w:rPr>
+          <w:sz w:val="18"/>
+          <w:szCs w:val="18"/>
+        </w:rPr>
+        <w:t xml:space="preserve">•   </w:t>
+      </w:r>
+      <w:r>
+        <w:rPr>
+          <w:sz w:val="18"/>
+          <w:szCs w:val="18"/>
+        </w:rPr>
+        <w:t xml:space="preserve">self is only a naming habit, not a keyword, but everyone uses it - do not rename it.</w:t>
+      </w:r>
+    </w:p>
+    <w:p>
+      <w:pPr>
+        <w:ind w:left="260" w:hanging="200"/>
+        <w:spacing w:before="0" w:after="25" w:line="230" w:lineRule="auto"/>
+      </w:pPr>
+      <w:r>
+        <w:rPr>
+          <w:sz w:val="18"/>
+          <w:szCs w:val="18"/>
+        </w:rPr>
+        <w:t xml:space="preserve">•   </w:t>
+      </w:r>
+      <w:r>
+        <w:rPr>
+          <w:sz w:val="18"/>
+          <w:szCs w:val="18"/>
+        </w:rPr>
+        <w:t xml:space="preserve">__init__ must return None. Returning something else is an error.</w:t>
+      </w:r>
+    </w:p>
+    <w:p>
+      <w:pPr>
+        <w:ind w:left="120" w:hanging="0"/>
+        <w:spacing w:before="50" w:after="110" w:line="230" w:lineRule="auto"/>
+        <w:pBdr>
+          <w:left w:val="single" w:sz="12" w:space="4" w:color="2E5E1F"/>
+        </w:pBdr>
+      </w:pPr>
+      <w:r>
+        <w:rPr>
+          <w:b/>
+          <w:color w:val="2E5E1F"/>
+          <w:sz w:val="18"/>
+          <w:szCs w:val="18"/>
+        </w:rPr>
+        <w:t xml:space="preserve">Interview answer:  </w:t>
+      </w:r>
+      <w:r>
+        <w:rPr>
+          <w:i/>
+          <w:sz w:val="18"/>
+          <w:szCs w:val="18"/>
+        </w:rPr>
+        <w:t xml:space="preserve">__init__ initializes a new object's data and self is the instance a method is working on - user.greet() is really User.greet(user). Strictly, __new__ creates the object and __init__ fills it.</w:t>
+      </w:r>
+    </w:p>
+    <w:p>
+      <w:pPr>
+        <w:spacing w:before="140" w:after="40" w:line="230" w:lineRule="auto"/>
+      </w:pPr>
+      <w:r>
+        <w:rPr>
+          <w:b/>
+          <w:sz w:val="21"/>
+          <w:szCs w:val="21"/>
+        </w:rPr>
+        <w:t xml:space="preserve">4.3  Four Pillars of OOP</w:t>
+      </w:r>
+    </w:p>
+    <w:p>
+      <w:pPr>
+        <w:spacing w:before="0" w:after="40" w:line="230" w:lineRule="auto"/>
+      </w:pPr>
+      <w:r>
+        <w:rPr>
+          <w:b/>
+          <w:sz w:val="18"/>
+          <w:szCs w:val="18"/>
+        </w:rPr>
+        <w:t xml:space="preserve">What it is:  </w:t>
+      </w:r>
+      <w:r>
+        <w:rPr>
+          <w:sz w:val="18"/>
+          <w:szCs w:val="18"/>
+        </w:rPr>
+        <w:t xml:space="preserve">The four pillars are Encapsulation, Abstraction, Inheritance and Polymorphism.</w:t>
+      </w:r>
+    </w:p>
+    <w:p>
+      <w:pPr>
+        <w:ind w:left="260" w:hanging="200"/>
+        <w:spacing w:before="0" w:after="25" w:line="230" w:lineRule="auto"/>
+      </w:pPr>
+      <w:r>
+        <w:rPr>
+          <w:sz w:val="18"/>
+          <w:szCs w:val="18"/>
+        </w:rPr>
+        <w:t xml:space="preserve">•   </w:t>
+      </w:r>
+      <w:r>
+        <w:rPr>
+          <w:sz w:val="18"/>
+          <w:szCs w:val="18"/>
+        </w:rPr>
+        <w:t xml:space="preserve">Encapsulation: keep data and its methods together, and control outside access. In Python: _name means "internal, please do not touch" and __name gets name-mangled to _Class__name. Nothing is truly private.</w:t>
+      </w:r>
+    </w:p>
+    <w:p>
+      <w:pPr>
+        <w:ind w:left="260" w:hanging="200"/>
+        <w:spacing w:before="0" w:after="25" w:line="230" w:lineRule="auto"/>
+      </w:pPr>
+      <w:r>
+        <w:rPr>
+          <w:sz w:val="18"/>
+          <w:szCs w:val="18"/>
+        </w:rPr>
+        <w:t xml:space="preserve">•   </w:t>
+      </w:r>
+      <w:r>
+        <w:rPr>
+          <w:sz w:val="18"/>
+          <w:szCs w:val="18"/>
+        </w:rPr>
+        <w:t xml:space="preserve">Abstraction: show a simple interface, hide the complex inside. Users call save(); they do not care how the SQL works. Abstract base classes (abc module) define the interface.</w:t>
+      </w:r>
+    </w:p>
+    <w:p>
+      <w:pPr>
+        <w:ind w:left="260" w:hanging="200"/>
+        <w:spacing w:before="0" w:after="25" w:line="230" w:lineRule="auto"/>
+      </w:pPr>
+      <w:r>
+        <w:rPr>
+          <w:sz w:val="18"/>
+          <w:szCs w:val="18"/>
+        </w:rPr>
+        <w:t xml:space="preserve">•   </w:t>
+      </w:r>
+      <w:r>
+        <w:rPr>
+          <w:sz w:val="18"/>
+          <w:szCs w:val="18"/>
+        </w:rPr>
+        <w:t xml:space="preserve">Inheritance: a child class gets the attributes and methods of its parent, and can add or change them. class Dog(Animal).</w:t>
+      </w:r>
+    </w:p>
+    <w:p>
+      <w:pPr>
+        <w:ind w:left="260" w:hanging="200"/>
+        <w:spacing w:before="0" w:after="25" w:line="230" w:lineRule="auto"/>
+      </w:pPr>
+      <w:r>
+        <w:rPr>
+          <w:sz w:val="18"/>
+          <w:szCs w:val="18"/>
+        </w:rPr>
+        <w:t xml:space="preserve">•   </w:t>
+      </w:r>
+      <w:r>
+        <w:rPr>
+          <w:sz w:val="18"/>
+          <w:szCs w:val="18"/>
+        </w:rPr>
+        <w:t xml:space="preserve">Polymorphism: the same method name works on different types. len() works on str and list; speak() can differ in Dog and Cat; the caller does not care which one it has.</w:t>
+      </w:r>
+    </w:p>
+    <w:p>
+      <w:pPr>
+        <w:ind w:left="260" w:hanging="200"/>
+        <w:spacing w:before="0" w:after="25" w:line="230" w:lineRule="auto"/>
+      </w:pPr>
+      <w:r>
+        <w:rPr>
+          <w:sz w:val="18"/>
+          <w:szCs w:val="18"/>
+        </w:rPr>
+        <w:t xml:space="preserve">•   </w:t>
+      </w:r>
+      <w:r>
+        <w:rPr>
+          <w:sz w:val="18"/>
+          <w:szCs w:val="18"/>
+        </w:rPr>
+        <w:t xml:space="preserve">Together they give: safe data, simple interfaces, code reuse, and flexible code.</w:t>
+      </w:r>
+    </w:p>
+    <w:p>
+      <w:pPr>
+        <w:ind w:left="120" w:hanging="0"/>
+        <w:spacing w:before="50" w:after="110" w:line="230" w:lineRule="auto"/>
+        <w:pBdr>
+          <w:left w:val="single" w:sz="12" w:space="4" w:color="2E5E1F"/>
+        </w:pBdr>
+      </w:pPr>
+      <w:r>
+        <w:rPr>
+          <w:b/>
+          <w:color w:val="2E5E1F"/>
+          <w:sz w:val="18"/>
+          <w:szCs w:val="18"/>
+        </w:rPr>
+        <w:t xml:space="preserve">Interview answer:  </w:t>
+      </w:r>
+      <w:r>
+        <w:rPr>
+          <w:i/>
+          <w:sz w:val="18"/>
+          <w:szCs w:val="18"/>
+        </w:rPr>
+        <w:t xml:space="preserve">Encapsulation bundles data with methods and limits access (in Python by _ and __ convention), abstraction hides complexity behind a simple interface, inheritance lets a child reuse and extend a parent, and polymorphism lets the same call work on different types.</w:t>
+      </w:r>
+    </w:p>
+    <w:p>
+      <w:pPr>
+        <w:spacing w:before="140" w:after="40" w:line="230" w:lineRule="auto"/>
+      </w:pPr>
+      <w:r>
+        <w:rPr>
+          <w:b/>
+          <w:sz w:val="21"/>
+          <w:szCs w:val="21"/>
+        </w:rPr>
+        <w:t xml:space="preserve">4.4  Types of Inheritance and MRO</w:t>
+      </w:r>
+    </w:p>
+    <w:p>
+      <w:pPr>
+        <w:spacing w:before="0" w:after="40" w:line="230" w:lineRule="auto"/>
+      </w:pPr>
+      <w:r>
+        <w:rPr>
+          <w:b/>
+          <w:sz w:val="18"/>
+          <w:szCs w:val="18"/>
+        </w:rPr>
+        <w:t xml:space="preserve">What it is:  </w:t>
+      </w:r>
+      <w:r>
+        <w:rPr>
+          <w:sz w:val="18"/>
+          <w:szCs w:val="18"/>
+        </w:rPr>
+        <w:t xml:space="preserve">Inheritance has several shapes, and MRO (Method Resolution Order) is the order Python searches classes for a method.</w:t>
+      </w:r>
+    </w:p>
+    <w:p>
+      <w:pPr>
+        <w:ind w:left="260" w:hanging="200"/>
+        <w:spacing w:before="0" w:after="25" w:line="230" w:lineRule="auto"/>
+      </w:pPr>
+      <w:r>
+        <w:rPr>
+          <w:sz w:val="18"/>
+          <w:szCs w:val="18"/>
+        </w:rPr>
+        <w:t xml:space="preserve">•   </w:t>
+      </w:r>
+      <w:r>
+        <w:rPr>
+          <w:sz w:val="18"/>
+          <w:szCs w:val="18"/>
+        </w:rPr>
+        <w:t xml:space="preserve">Single: one parent, one child. Multilevel: A -&gt; B -&gt; C chain. Hierarchical: one parent, many children.</w:t>
+      </w:r>
+    </w:p>
+    <w:p>
+      <w:pPr>
+        <w:ind w:left="260" w:hanging="200"/>
+        <w:spacing w:before="0" w:after="25" w:line="230" w:lineRule="auto"/>
+      </w:pPr>
+      <w:r>
+        <w:rPr>
+          <w:sz w:val="18"/>
+          <w:szCs w:val="18"/>
+        </w:rPr>
+        <w:t xml:space="preserve">•   </w:t>
+      </w:r>
+      <w:r>
+        <w:rPr>
+          <w:sz w:val="18"/>
+          <w:szCs w:val="18"/>
+        </w:rPr>
+        <w:t xml:space="preserve">Multiple: one child, many parents - class C(A, B). Python allows this, unlike Java.</w:t>
+      </w:r>
+    </w:p>
+    <w:p>
+      <w:pPr>
+        <w:ind w:left="260" w:hanging="200"/>
+        <w:spacing w:before="0" w:after="25" w:line="230" w:lineRule="auto"/>
+      </w:pPr>
+      <w:r>
+        <w:rPr>
+          <w:sz w:val="18"/>
+          <w:szCs w:val="18"/>
+        </w:rPr>
+        <w:t xml:space="preserve">•   </w:t>
+      </w:r>
+      <w:r>
+        <w:rPr>
+          <w:sz w:val="18"/>
+          <w:szCs w:val="18"/>
+        </w:rPr>
+        <w:t xml:space="preserve">Hybrid: a mix of the above, like the diamond shape.</w:t>
+      </w:r>
+    </w:p>
+    <w:p>
+      <w:pPr>
+        <w:ind w:left="260" w:hanging="200"/>
+        <w:spacing w:before="0" w:after="25" w:line="230" w:lineRule="auto"/>
+      </w:pPr>
+      <w:r>
+        <w:rPr>
+          <w:sz w:val="18"/>
+          <w:szCs w:val="18"/>
+        </w:rPr>
+        <w:t xml:space="preserve">•   </w:t>
+      </w:r>
+      <w:r>
+        <w:rPr>
+          <w:sz w:val="18"/>
+          <w:szCs w:val="18"/>
+        </w:rPr>
+        <w:t xml:space="preserve">MRO answers: with many parents, whose method wins? Python uses the C3 linearization - roughly left to right, child before parent, each class once.</w:t>
+      </w:r>
+    </w:p>
+    <w:p>
+      <w:pPr>
+        <w:ind w:left="260" w:hanging="200"/>
+        <w:spacing w:before="0" w:after="25" w:line="230" w:lineRule="auto"/>
+      </w:pPr>
+      <w:r>
+        <w:rPr>
+          <w:sz w:val="18"/>
+          <w:szCs w:val="18"/>
+        </w:rPr>
+        <w:t xml:space="preserve">•   </w:t>
+      </w:r>
+      <w:r>
+        <w:rPr>
+          <w:sz w:val="18"/>
+          <w:szCs w:val="18"/>
+        </w:rPr>
+        <w:t xml:space="preserve">See it with ClassName.__mro__ or ClassName.mro().</w:t>
+      </w:r>
+    </w:p>
+    <w:p>
+      <w:pPr>
+        <w:ind w:left="260" w:hanging="200"/>
+        <w:spacing w:before="0" w:after="25" w:line="230" w:lineRule="auto"/>
+      </w:pPr>
+      <w:r>
+        <w:rPr>
+          <w:sz w:val="18"/>
+          <w:szCs w:val="18"/>
+        </w:rPr>
+        <w:t xml:space="preserve">•   </w:t>
+      </w:r>
+      <w:r>
+        <w:rPr>
+          <w:sz w:val="18"/>
+          <w:szCs w:val="18"/>
+        </w:rPr>
+        <w:t xml:space="preserve">super() follows the MRO, not simply "the parent" - that is why it works correctly even in diamond inheritance.</w:t>
+      </w:r>
+    </w:p>
+    <w:p>
+      <w:pPr>
+        <w:ind w:left="260" w:hanging="200"/>
+        <w:spacing w:before="0" w:after="25" w:line="230" w:lineRule="auto"/>
+      </w:pPr>
+      <w:r>
+        <w:rPr>
+          <w:sz w:val="18"/>
+          <w:szCs w:val="18"/>
+        </w:rPr>
+        <w:t xml:space="preserve">•   </w:t>
+      </w:r>
+      <w:r>
+        <w:rPr>
+          <w:sz w:val="18"/>
+          <w:szCs w:val="18"/>
+        </w:rPr>
+        <w:t xml:space="preserve">Diamond problem example: class D(B, C), both override greet() from A - D uses B's version, because B comes first in the MRO.</w:t>
+      </w:r>
+    </w:p>
+    <w:p>
+      <w:pPr>
+        <w:ind w:left="120" w:hanging="0"/>
+        <w:spacing w:before="50" w:after="110" w:line="230" w:lineRule="auto"/>
+        <w:pBdr>
+          <w:left w:val="single" w:sz="12" w:space="4" w:color="2E5E1F"/>
+        </w:pBdr>
+      </w:pPr>
+      <w:r>
+        <w:rPr>
+          <w:b/>
+          <w:color w:val="2E5E1F"/>
+          <w:sz w:val="18"/>
+          <w:szCs w:val="18"/>
+        </w:rPr>
+        <w:t xml:space="preserve">Interview answer:  </w:t>
+      </w:r>
+      <w:r>
+        <w:rPr>
+          <w:i/>
+          <w:sz w:val="18"/>
+          <w:szCs w:val="18"/>
+        </w:rPr>
+        <w:t xml:space="preserve">Python supports single, multilevel, hierarchical, multiple and hybrid inheritance. With multiple parents, the MRO - C3 linearization, roughly left to right - decides which method runs, and super() follows that order, which safely solves the diamond problem.</w:t>
+      </w:r>
+    </w:p>
+    <w:p>
+      <w:pPr>
+        <w:spacing w:before="140" w:after="40" w:line="230" w:lineRule="auto"/>
+      </w:pPr>
+      <w:r>
+        <w:rPr>
+          <w:b/>
+          <w:sz w:val="21"/>
+          <w:szCs w:val="21"/>
+        </w:rPr>
+        <w:t xml:space="preserve">4.5  Method Overloading vs Overriding</w:t>
+      </w:r>
+    </w:p>
+    <w:p>
+      <w:pPr>
+        <w:spacing w:before="0" w:after="40" w:line="230" w:lineRule="auto"/>
+      </w:pPr>
+      <w:r>
+        <w:rPr>
+          <w:b/>
+          <w:sz w:val="18"/>
+          <w:szCs w:val="18"/>
+        </w:rPr>
+        <w:t xml:space="preserve">What it is:  </w:t>
+      </w:r>
+      <w:r>
+        <w:rPr>
+          <w:sz w:val="18"/>
+          <w:szCs w:val="18"/>
+        </w:rPr>
+        <w:t xml:space="preserve">Overloading is same name with different parameters in one class. Overriding is a child class replacing a parent's method.</w:t>
+      </w:r>
+    </w:p>
+    <w:p>
+      <w:pPr>
+        <w:ind w:left="260" w:hanging="200"/>
+        <w:spacing w:before="0" w:after="25" w:line="230" w:lineRule="auto"/>
+      </w:pPr>
+      <w:r>
+        <w:rPr>
+          <w:sz w:val="18"/>
+          <w:szCs w:val="18"/>
+        </w:rPr>
+        <w:t xml:space="preserve">•   </w:t>
+      </w:r>
+      <w:r>
+        <w:rPr>
+          <w:sz w:val="18"/>
+          <w:szCs w:val="18"/>
+        </w:rPr>
+        <w:t xml:space="preserve">Python does NOT have true overloading - a second def with the same name simply replaces the first.</w:t>
+      </w:r>
+    </w:p>
+    <w:p>
+      <w:pPr>
+        <w:ind w:left="260" w:hanging="200"/>
+        <w:spacing w:before="0" w:after="25" w:line="230" w:lineRule="auto"/>
+      </w:pPr>
+      <w:r>
+        <w:rPr>
+          <w:sz w:val="18"/>
+          <w:szCs w:val="18"/>
+        </w:rPr>
+        <w:t xml:space="preserve">•   </w:t>
+      </w:r>
+      <w:r>
+        <w:rPr>
+          <w:sz w:val="18"/>
+          <w:szCs w:val="18"/>
+        </w:rPr>
+        <w:t xml:space="preserve">We get the same effect with default arguments (def area(self, w, h=None)) or *args/**kwargs, checking what was passed.</w:t>
+      </w:r>
+    </w:p>
+    <w:p>
+      <w:pPr>
+        <w:ind w:left="260" w:hanging="200"/>
+        <w:spacing w:before="0" w:after="25" w:line="230" w:lineRule="auto"/>
+      </w:pPr>
+      <w:r>
+        <w:rPr>
+          <w:sz w:val="18"/>
+          <w:szCs w:val="18"/>
+        </w:rPr>
+        <w:t xml:space="preserve">•   </w:t>
+      </w:r>
+      <w:r>
+        <w:rPr>
+          <w:sz w:val="18"/>
+          <w:szCs w:val="18"/>
+        </w:rPr>
+        <w:t xml:space="preserve">functools.singledispatch gives real dispatch by argument type when needed.</w:t>
+      </w:r>
+    </w:p>
+    <w:p>
+      <w:pPr>
+        <w:ind w:left="260" w:hanging="200"/>
+        <w:spacing w:before="0" w:after="25" w:line="230" w:lineRule="auto"/>
+      </w:pPr>
+      <w:r>
+        <w:rPr>
+          <w:sz w:val="18"/>
+          <w:szCs w:val="18"/>
+        </w:rPr>
+        <w:t xml:space="preserve">•   </w:t>
+      </w:r>
+      <w:r>
+        <w:rPr>
+          <w:sz w:val="18"/>
+          <w:szCs w:val="18"/>
+        </w:rPr>
+        <w:t xml:space="preserve">Overriding fully works: the child defines the same method name and its version wins for child objects.</w:t>
+      </w:r>
+    </w:p>
+    <w:p>
+      <w:pPr>
+        <w:ind w:left="260" w:hanging="200"/>
+        <w:spacing w:before="0" w:after="25" w:line="230" w:lineRule="auto"/>
+      </w:pPr>
+      <w:r>
+        <w:rPr>
+          <w:sz w:val="18"/>
+          <w:szCs w:val="18"/>
+        </w:rPr>
+        <w:t xml:space="preserve">•   </w:t>
+      </w:r>
+      <w:r>
+        <w:rPr>
+          <w:sz w:val="18"/>
+          <w:szCs w:val="18"/>
+        </w:rPr>
+        <w:t xml:space="preserve">super().method() inside the override calls the parent version, so we can extend instead of fully replace.</w:t>
+      </w:r>
+    </w:p>
+    <w:p>
+      <w:pPr>
+        <w:ind w:left="260" w:hanging="200"/>
+        <w:spacing w:before="0" w:after="25" w:line="230" w:lineRule="auto"/>
+      </w:pPr>
+      <w:r>
+        <w:rPr>
+          <w:sz w:val="18"/>
+          <w:szCs w:val="18"/>
+        </w:rPr>
+        <w:t xml:space="preserve">•   </w:t>
+      </w:r>
+      <w:r>
+        <w:rPr>
+          <w:sz w:val="18"/>
+          <w:szCs w:val="18"/>
+        </w:rPr>
+        <w:t xml:space="preserve">Operator overloading is separate and supported: __add__ makes + work, __eq__ makes == work on our class.</w:t>
+      </w:r>
+    </w:p>
+    <w:p>
+      <w:pPr>
+        <w:ind w:left="120" w:hanging="0"/>
+        <w:spacing w:before="50" w:after="110" w:line="230" w:lineRule="auto"/>
+        <w:pBdr>
+          <w:left w:val="single" w:sz="12" w:space="4" w:color="2E5E1F"/>
+        </w:pBdr>
+      </w:pPr>
+      <w:r>
+        <w:rPr>
+          <w:b/>
+          <w:color w:val="2E5E1F"/>
+          <w:sz w:val="18"/>
+          <w:szCs w:val="18"/>
+        </w:rPr>
+        <w:t xml:space="preserve">Interview answer:  </w:t>
+      </w:r>
+      <w:r>
+        <w:rPr>
+          <w:i/>
+          <w:sz w:val="18"/>
+          <w:szCs w:val="18"/>
+        </w:rPr>
+        <w:t xml:space="preserve">Python has no true method overloading - a same-name def replaces the earlier one - so we use default arguments or *args instead. Overriding works normally: the child redefines a parent method and can still call super() to reuse the parent logic. Operator overloading is done with dunder methods like __add__.</w:t>
+      </w:r>
+    </w:p>
+    <w:p>
+      <w:pPr>
+        <w:spacing w:before="140" w:after="40" w:line="230" w:lineRule="auto"/>
+      </w:pPr>
+      <w:r>
+        <w:rPr>
+          <w:b/>
+          <w:sz w:val="21"/>
+          <w:szCs w:val="21"/>
+        </w:rPr>
+        <w:t xml:space="preserve">4.6  Instance vs Class vs Static Method</w:t>
+      </w:r>
+    </w:p>
+    <w:p>
+      <w:pPr>
+        <w:spacing w:before="0" w:after="40" w:line="230" w:lineRule="auto"/>
+      </w:pPr>
+      <w:r>
+        <w:rPr>
+          <w:b/>
+          <w:sz w:val="18"/>
+          <w:szCs w:val="18"/>
+        </w:rPr>
+        <w:t xml:space="preserve">What it is:  </w:t>
+      </w:r>
+      <w:r>
+        <w:rPr>
+          <w:sz w:val="18"/>
+          <w:szCs w:val="18"/>
+        </w:rPr>
+        <w:t xml:space="preserve">Three method types differ in what they receive: the object (self), the class (cls), or nothing.</w:t>
+      </w:r>
+    </w:p>
+    <w:p>
+      <w:pPr>
+        <w:ind w:left="260" w:hanging="200"/>
+        <w:spacing w:before="0" w:after="25" w:line="230" w:lineRule="auto"/>
+      </w:pPr>
+      <w:r>
+        <w:rPr>
+          <w:sz w:val="18"/>
+          <w:szCs w:val="18"/>
+        </w:rPr>
+        <w:t xml:space="preserve">•   </w:t>
+      </w:r>
+      <w:r>
+        <w:rPr>
+          <w:sz w:val="18"/>
+          <w:szCs w:val="18"/>
+        </w:rPr>
+        <w:t xml:space="preserve">Instance method: default type, takes self, can read and change object data. Most methods are this.</w:t>
+      </w:r>
+    </w:p>
+    <w:p>
+      <w:pPr>
+        <w:ind w:left="260" w:hanging="200"/>
+        <w:spacing w:before="0" w:after="25" w:line="230" w:lineRule="auto"/>
+      </w:pPr>
+      <w:r>
+        <w:rPr>
+          <w:sz w:val="18"/>
+          <w:szCs w:val="18"/>
+        </w:rPr>
+        <w:t xml:space="preserve">•   </w:t>
+      </w:r>
+      <w:r>
+        <w:rPr>
+          <w:sz w:val="18"/>
+          <w:szCs w:val="18"/>
+        </w:rPr>
+        <w:t xml:space="preserve">Class method: @classmethod, takes cls (the class). Works without an object.</w:t>
+      </w:r>
+    </w:p>
+    <w:p>
+      <w:pPr>
+        <w:ind w:left="260" w:hanging="200"/>
+        <w:spacing w:before="0" w:after="25" w:line="230" w:lineRule="auto"/>
+      </w:pPr>
+      <w:r>
+        <w:rPr>
+          <w:sz w:val="18"/>
+          <w:szCs w:val="18"/>
+        </w:rPr>
+        <w:t xml:space="preserve">•   </w:t>
+      </w:r>
+      <w:r>
+        <w:rPr>
+          <w:sz w:val="18"/>
+          <w:szCs w:val="18"/>
+        </w:rPr>
+        <w:t xml:space="preserve">Main classmethod use: alternative constructors, like User.from_dict(data) or datetime.fromtimestamp().</w:t>
+      </w:r>
+    </w:p>
+    <w:p>
+      <w:pPr>
+        <w:ind w:left="260" w:hanging="200"/>
+        <w:spacing w:before="0" w:after="25" w:line="230" w:lineRule="auto"/>
+      </w:pPr>
+      <w:r>
+        <w:rPr>
+          <w:sz w:val="18"/>
+          <w:szCs w:val="18"/>
+        </w:rPr>
+        <w:t xml:space="preserve">•   </w:t>
+      </w:r>
+      <w:r>
+        <w:rPr>
+          <w:sz w:val="18"/>
+          <w:szCs w:val="18"/>
+        </w:rPr>
+        <w:t xml:space="preserve">Static method: @staticmethod, takes neither self nor cls. It is a plain function placed in the class because it belongs there logically, like a helper or validator.</w:t>
+      </w:r>
+    </w:p>
+    <w:p>
+      <w:pPr>
+        <w:ind w:left="260" w:hanging="200"/>
+        <w:spacing w:before="0" w:after="25" w:line="230" w:lineRule="auto"/>
+      </w:pPr>
+      <w:r>
+        <w:rPr>
+          <w:sz w:val="18"/>
+          <w:szCs w:val="18"/>
+        </w:rPr>
+        <w:t xml:space="preserve">•   </w:t>
+      </w:r>
+      <w:r>
+        <w:rPr>
+          <w:sz w:val="18"/>
+          <w:szCs w:val="18"/>
+        </w:rPr>
+        <w:t xml:space="preserve">Call any of them on the class or the object; behavior stays the same.</w:t>
+      </w:r>
+    </w:p>
+    <w:p>
+      <w:pPr>
+        <w:ind w:left="260" w:hanging="200"/>
+        <w:spacing w:before="0" w:after="25" w:line="230" w:lineRule="auto"/>
+      </w:pPr>
+      <w:r>
+        <w:rPr>
+          <w:sz w:val="18"/>
+          <w:szCs w:val="18"/>
+        </w:rPr>
+        <w:t xml:space="preserve">•   </w:t>
+      </w:r>
+      <w:r>
+        <w:rPr>
+          <w:sz w:val="18"/>
+          <w:szCs w:val="18"/>
+        </w:rPr>
+        <w:t xml:space="preserve">Quick rule: needs object data -&gt; instance; needs the class itself -&gt; classmethod; needs neither -&gt; staticmethod.</w:t>
+      </w:r>
+    </w:p>
+    <w:p>
+      <w:pPr>
+        <w:ind w:left="120" w:hanging="0"/>
+        <w:spacing w:before="50" w:after="110" w:line="230" w:lineRule="auto"/>
+        <w:pBdr>
+          <w:left w:val="single" w:sz="12" w:space="4" w:color="2E5E1F"/>
+        </w:pBdr>
+      </w:pPr>
+      <w:r>
+        <w:rPr>
+          <w:b/>
+          <w:color w:val="2E5E1F"/>
+          <w:sz w:val="18"/>
+          <w:szCs w:val="18"/>
+        </w:rPr>
+        <w:t xml:space="preserve">Interview answer:  </w:t>
+      </w:r>
+      <w:r>
+        <w:rPr>
+          <w:i/>
+          <w:sz w:val="18"/>
+          <w:szCs w:val="18"/>
+        </w:rPr>
+        <w:t xml:space="preserve">Instance methods take self and work on object data. Class methods take cls and are often alternative constructors like from_dict. Static methods take neither - they are helpers grouped in the class for organization.</w:t>
+      </w:r>
+    </w:p>
+    <w:p>
+      <w:pPr>
+        <w:spacing w:before="140" w:after="40" w:line="230" w:lineRule="auto"/>
+      </w:pPr>
+      <w:r>
+        <w:rPr>
+          <w:b/>
+          <w:sz w:val="21"/>
+          <w:szCs w:val="21"/>
+        </w:rPr>
+        <w:t xml:space="preserve">4.7  Dunder (Magic) Methods</w:t>
+      </w:r>
+    </w:p>
+    <w:p>
+      <w:pPr>
+        <w:spacing w:before="0" w:after="40" w:line="230" w:lineRule="auto"/>
+      </w:pPr>
+      <w:r>
+        <w:rPr>
+          <w:b/>
+          <w:sz w:val="18"/>
+          <w:szCs w:val="18"/>
+        </w:rPr>
+        <w:t xml:space="preserve">What it is:  </w:t>
+      </w:r>
+      <w:r>
+        <w:rPr>
+          <w:sz w:val="18"/>
+          <w:szCs w:val="18"/>
+        </w:rPr>
+        <w:t xml:space="preserve">Dunder methods are special __name__ methods that let our objects work with Python's built-in syntax and functions.</w:t>
+      </w:r>
+    </w:p>
+    <w:p>
+      <w:pPr>
+        <w:ind w:left="260" w:hanging="200"/>
+        <w:spacing w:before="0" w:after="25" w:line="230" w:lineRule="auto"/>
+      </w:pPr>
+      <w:r>
+        <w:rPr>
+          <w:sz w:val="18"/>
+          <w:szCs w:val="18"/>
+        </w:rPr>
+        <w:t xml:space="preserve">•   </w:t>
+      </w:r>
+      <w:r>
+        <w:rPr>
+          <w:sz w:val="18"/>
+          <w:szCs w:val="18"/>
+        </w:rPr>
+        <w:t xml:space="preserve">__str__: what print(obj) shows - friendly text for users.</w:t>
+      </w:r>
+    </w:p>
+    <w:p>
+      <w:pPr>
+        <w:ind w:left="260" w:hanging="200"/>
+        <w:spacing w:before="0" w:after="25" w:line="230" w:lineRule="auto"/>
+      </w:pPr>
+      <w:r>
+        <w:rPr>
+          <w:sz w:val="18"/>
+          <w:szCs w:val="18"/>
+        </w:rPr>
+        <w:t xml:space="preserve">•   </w:t>
+      </w:r>
+      <w:r>
+        <w:rPr>
+          <w:sz w:val="18"/>
+          <w:szCs w:val="18"/>
+        </w:rPr>
+        <w:t xml:space="preserve">__repr__: developer text shown in the REPL and lists - should be exact and clear. If __str__ is missing, __repr__ is used.</w:t>
+      </w:r>
+    </w:p>
+    <w:p>
+      <w:pPr>
+        <w:ind w:left="260" w:hanging="200"/>
+        <w:spacing w:before="0" w:after="25" w:line="230" w:lineRule="auto"/>
+      </w:pPr>
+      <w:r>
+        <w:rPr>
+          <w:sz w:val="18"/>
+          <w:szCs w:val="18"/>
+        </w:rPr>
+        <w:t xml:space="preserve">•   </w:t>
+      </w:r>
+      <w:r>
+        <w:rPr>
+          <w:sz w:val="18"/>
+          <w:szCs w:val="18"/>
+        </w:rPr>
+        <w:t xml:space="preserve">__len__: makes len(obj) work. __getitem__: makes obj[i] and slicing work, and even for-loops.</w:t>
+      </w:r>
+    </w:p>
+    <w:p>
+      <w:pPr>
+        <w:ind w:left="260" w:hanging="200"/>
+        <w:spacing w:before="0" w:after="25" w:line="230" w:lineRule="auto"/>
+      </w:pPr>
+      <w:r>
+        <w:rPr>
+          <w:sz w:val="18"/>
+          <w:szCs w:val="18"/>
+        </w:rPr>
+        <w:t xml:space="preserve">•   </w:t>
+      </w:r>
+      <w:r>
+        <w:rPr>
+          <w:sz w:val="18"/>
+          <w:szCs w:val="18"/>
+        </w:rPr>
+        <w:t xml:space="preserve">__eq__ defines ==, __lt__ defines &lt;, and with these sorted() can sort our objects. Defining __eq__ well matters for comparing.</w:t>
+      </w:r>
+    </w:p>
+    <w:p>
+      <w:pPr>
+        <w:ind w:left="260" w:hanging="200"/>
+        <w:spacing w:before="0" w:after="25" w:line="230" w:lineRule="auto"/>
+      </w:pPr>
+      <w:r>
+        <w:rPr>
+          <w:sz w:val="18"/>
+          <w:szCs w:val="18"/>
+        </w:rPr>
+        <w:t xml:space="preserve">•   </w:t>
+      </w:r>
+      <w:r>
+        <w:rPr>
+          <w:sz w:val="18"/>
+          <w:szCs w:val="18"/>
+        </w:rPr>
+        <w:t xml:space="preserve">__add__ defines +, so vector1 + vector2 can work naturally.</w:t>
+      </w:r>
+    </w:p>
+    <w:p>
+      <w:pPr>
+        <w:ind w:left="260" w:hanging="200"/>
+        <w:spacing w:before="0" w:after="25" w:line="230" w:lineRule="auto"/>
+      </w:pPr>
+      <w:r>
+        <w:rPr>
+          <w:sz w:val="18"/>
+          <w:szCs w:val="18"/>
+        </w:rPr>
+        <w:t xml:space="preserve">•   </w:t>
+      </w:r>
+      <w:r>
+        <w:rPr>
+          <w:sz w:val="18"/>
+          <w:szCs w:val="18"/>
+        </w:rPr>
+        <w:t xml:space="preserve">__call__ makes an object callable like a function: obj().</w:t>
+      </w:r>
+    </w:p>
+    <w:p>
+      <w:pPr>
+        <w:ind w:left="260" w:hanging="200"/>
+        <w:spacing w:before="0" w:after="25" w:line="230" w:lineRule="auto"/>
+      </w:pPr>
+      <w:r>
+        <w:rPr>
+          <w:sz w:val="18"/>
+          <w:szCs w:val="18"/>
+        </w:rPr>
+        <w:t xml:space="preserve">•   </w:t>
+      </w:r>
+      <w:r>
+        <w:rPr>
+          <w:sz w:val="18"/>
+          <w:szCs w:val="18"/>
+        </w:rPr>
+        <w:t xml:space="preserve">__enter__ and __exit__ make an object usable in a with-block (context manager).</w:t>
+      </w:r>
+    </w:p>
+    <w:p>
+      <w:pPr>
+        <w:ind w:left="260" w:hanging="200"/>
+        <w:spacing w:before="0" w:after="25" w:line="230" w:lineRule="auto"/>
+      </w:pPr>
+      <w:r>
+        <w:rPr>
+          <w:sz w:val="18"/>
+          <w:szCs w:val="18"/>
+        </w:rPr>
+        <w:t xml:space="preserve">•   </w:t>
+      </w:r>
+      <w:r>
+        <w:rPr>
+          <w:sz w:val="18"/>
+          <w:szCs w:val="18"/>
+        </w:rPr>
+        <w:t xml:space="preserve">They power "duck typing": any class with the right dunders can act like a list, a number, or a context manager.</w:t>
+      </w:r>
+    </w:p>
+    <w:p>
+      <w:pPr>
+        <w:ind w:left="120" w:hanging="0"/>
+        <w:spacing w:before="50" w:after="110" w:line="230" w:lineRule="auto"/>
+        <w:pBdr>
+          <w:left w:val="single" w:sz="12" w:space="4" w:color="2E5E1F"/>
+        </w:pBdr>
+      </w:pPr>
+      <w:r>
+        <w:rPr>
+          <w:b/>
+          <w:color w:val="2E5E1F"/>
+          <w:sz w:val="18"/>
+          <w:szCs w:val="18"/>
+        </w:rPr>
+        <w:t xml:space="preserve">Interview answer:  </w:t>
+      </w:r>
+      <w:r>
+        <w:rPr>
+          <w:i/>
+          <w:sz w:val="18"/>
+          <w:szCs w:val="18"/>
+        </w:rPr>
+        <w:t xml:space="preserve">Dunder methods hook our classes into Python syntax: __str__/__repr__ for printing, __len__ and __getitem__ for len() and indexing, __eq__ for ==, __add__ for +, __call__ to make objects callable, __enter__/__exit__ for with-blocks. They are how built-in behavior is customized.</w:t>
+      </w:r>
+    </w:p>
+    <w:p>
+      <w:pPr>
+        <w:spacing w:before="140" w:after="40" w:line="230" w:lineRule="auto"/>
+      </w:pPr>
+      <w:r>
+        <w:rPr>
+          <w:b/>
+          <w:sz w:val="21"/>
+          <w:szCs w:val="21"/>
+        </w:rPr>
+        <w:t xml:space="preserve">4.8  @property - Getters and Setters</w:t>
+      </w:r>
+    </w:p>
+    <w:p>
+      <w:pPr>
+        <w:spacing w:before="0" w:after="40" w:line="230" w:lineRule="auto"/>
+      </w:pPr>
+      <w:r>
+        <w:rPr>
+          <w:b/>
+          <w:sz w:val="18"/>
+          <w:szCs w:val="18"/>
+        </w:rPr>
+        <w:t xml:space="preserve">What it is:  </w:t>
+      </w:r>
+      <w:r>
+        <w:rPr>
+          <w:sz w:val="18"/>
+          <w:szCs w:val="18"/>
+        </w:rPr>
+        <w:t xml:space="preserve">@property lets a method be accessed like an attribute, giving controlled get and set without changing the calling code.</w:t>
+      </w:r>
+    </w:p>
+    <w:p>
+      <w:pPr>
+        <w:ind w:left="260" w:hanging="200"/>
+        <w:spacing w:before="0" w:after="25" w:line="230" w:lineRule="auto"/>
+      </w:pPr>
+      <w:r>
+        <w:rPr>
+          <w:sz w:val="18"/>
+          <w:szCs w:val="18"/>
+        </w:rPr>
+        <w:t xml:space="preserve">•   </w:t>
+      </w:r>
+      <w:r>
+        <w:rPr>
+          <w:sz w:val="18"/>
+          <w:szCs w:val="18"/>
+        </w:rPr>
+        <w:t xml:space="preserve">Python does not use Java-style getName()/setName(). We start with plain attributes and add control later with @property - callers never change.</w:t>
+      </w:r>
+    </w:p>
+    <w:p>
+      <w:pPr>
+        <w:ind w:left="260" w:hanging="200"/>
+        <w:spacing w:before="0" w:after="25" w:line="230" w:lineRule="auto"/>
+      </w:pPr>
+      <w:r>
+        <w:rPr>
+          <w:sz w:val="18"/>
+          <w:szCs w:val="18"/>
+        </w:rPr>
+        <w:t xml:space="preserve">•   </w:t>
+      </w:r>
+      <w:r>
+        <w:rPr>
+          <w:sz w:val="18"/>
+          <w:szCs w:val="18"/>
+        </w:rPr>
+        <w:t xml:space="preserve">@property above a method makes obj.price call the method without brackets.</w:t>
+      </w:r>
+    </w:p>
+    <w:p>
+      <w:pPr>
+        <w:ind w:left="260" w:hanging="200"/>
+        <w:spacing w:before="0" w:after="25" w:line="230" w:lineRule="auto"/>
+      </w:pPr>
+      <w:r>
+        <w:rPr>
+          <w:sz w:val="18"/>
+          <w:szCs w:val="18"/>
+        </w:rPr>
+        <w:t xml:space="preserve">•   </w:t>
+      </w:r>
+      <w:r>
+        <w:rPr>
+          <w:sz w:val="18"/>
+          <w:szCs w:val="18"/>
+        </w:rPr>
+        <w:t xml:space="preserve">@price.setter defines what happens on obj.price = value - a perfect place for validation, like rejecting negative prices.</w:t>
+      </w:r>
+    </w:p>
+    <w:p>
+      <w:pPr>
+        <w:ind w:left="260" w:hanging="200"/>
+        <w:spacing w:before="0" w:after="25" w:line="230" w:lineRule="auto"/>
+      </w:pPr>
+      <w:r>
+        <w:rPr>
+          <w:sz w:val="18"/>
+          <w:szCs w:val="18"/>
+        </w:rPr>
+        <w:t xml:space="preserve">•   </w:t>
+      </w:r>
+      <w:r>
+        <w:rPr>
+          <w:sz w:val="18"/>
+          <w:szCs w:val="18"/>
+        </w:rPr>
+        <w:t xml:space="preserve">The real value is stored in an internal name like self._price.</w:t>
+      </w:r>
+    </w:p>
+    <w:p>
+      <w:pPr>
+        <w:ind w:left="260" w:hanging="200"/>
+        <w:spacing w:before="0" w:after="25" w:line="230" w:lineRule="auto"/>
+      </w:pPr>
+      <w:r>
+        <w:rPr>
+          <w:sz w:val="18"/>
+          <w:szCs w:val="18"/>
+        </w:rPr>
+        <w:t xml:space="preserve">•   </w:t>
+      </w:r>
+      <w:r>
+        <w:rPr>
+          <w:sz w:val="18"/>
+          <w:szCs w:val="18"/>
+        </w:rPr>
+        <w:t xml:space="preserve">A property with no setter is effectively read-only.</w:t>
+      </w:r>
+    </w:p>
+    <w:p>
+      <w:pPr>
+        <w:ind w:left="260" w:hanging="200"/>
+        <w:spacing w:before="0" w:after="25" w:line="230" w:lineRule="auto"/>
+      </w:pPr>
+      <w:r>
+        <w:rPr>
+          <w:sz w:val="18"/>
+          <w:szCs w:val="18"/>
+        </w:rPr>
+        <w:t xml:space="preserve">•   </w:t>
+      </w:r>
+      <w:r>
+        <w:rPr>
+          <w:sz w:val="18"/>
+          <w:szCs w:val="18"/>
+        </w:rPr>
+        <w:t xml:space="preserve">Computed values also fit well: full_name built from first and last name on each access.</w:t>
+      </w:r>
+    </w:p>
+    <w:p>
+      <w:pPr>
+        <w:ind w:left="120" w:hanging="0"/>
+        <w:spacing w:before="50" w:after="110" w:line="230" w:lineRule="auto"/>
+        <w:pBdr>
+          <w:left w:val="single" w:sz="12" w:space="4" w:color="2E5E1F"/>
+        </w:pBdr>
+      </w:pPr>
+      <w:r>
+        <w:rPr>
+          <w:b/>
+          <w:color w:val="2E5E1F"/>
+          <w:sz w:val="18"/>
+          <w:szCs w:val="18"/>
+        </w:rPr>
+        <w:t xml:space="preserve">Interview answer:  </w:t>
+      </w:r>
+      <w:r>
+        <w:rPr>
+          <w:i/>
+          <w:sz w:val="18"/>
+          <w:szCs w:val="18"/>
+        </w:rPr>
+        <w:t xml:space="preserve">@property turns a method into an attribute-style access, and @x.setter adds validation on assignment. It gives encapsulation without breaking callers - we can start with a plain attribute and add logic later, which is why Python skips Java-style get/set methods.</w:t>
+      </w:r>
+    </w:p>
+    <w:p>
+      <w:pPr>
+        <w:spacing w:before="140" w:after="40" w:line="230" w:lineRule="auto"/>
+      </w:pPr>
+      <w:r>
+        <w:rPr>
+          <w:b/>
+          <w:sz w:val="21"/>
+          <w:szCs w:val="21"/>
+        </w:rPr>
+        <w:t xml:space="preserve">4.9  Abstract Class and Interface</w:t>
+      </w:r>
+    </w:p>
+    <w:p>
+      <w:pPr>
+        <w:spacing w:before="0" w:after="40" w:line="230" w:lineRule="auto"/>
+      </w:pPr>
+      <w:r>
+        <w:rPr>
+          <w:b/>
+          <w:sz w:val="18"/>
+          <w:szCs w:val="18"/>
+        </w:rPr>
+        <w:t xml:space="preserve">What it is:  </w:t>
+      </w:r>
+      <w:r>
+        <w:rPr>
+          <w:sz w:val="18"/>
+          <w:szCs w:val="18"/>
+        </w:rPr>
+        <w:t xml:space="preserve">An abstract class defines required methods but cannot be instantiated itself - children must implement those methods.</w:t>
+      </w:r>
+    </w:p>
+    <w:p>
+      <w:pPr>
+        <w:ind w:left="260" w:hanging="200"/>
+        <w:spacing w:before="0" w:after="25" w:line="230" w:lineRule="auto"/>
+      </w:pPr>
+      <w:r>
+        <w:rPr>
+          <w:sz w:val="18"/>
+          <w:szCs w:val="18"/>
+        </w:rPr>
+        <w:t xml:space="preserve">•   </w:t>
+      </w:r>
+      <w:r>
+        <w:rPr>
+          <w:sz w:val="18"/>
+          <w:szCs w:val="18"/>
+        </w:rPr>
+        <w:t xml:space="preserve">Made with the abc module: class Shape(ABC) plus @abstractmethod on required methods.</w:t>
+      </w:r>
+    </w:p>
+    <w:p>
+      <w:pPr>
+        <w:ind w:left="260" w:hanging="200"/>
+        <w:spacing w:before="0" w:after="25" w:line="230" w:lineRule="auto"/>
+      </w:pPr>
+      <w:r>
+        <w:rPr>
+          <w:sz w:val="18"/>
+          <w:szCs w:val="18"/>
+        </w:rPr>
+        <w:t xml:space="preserve">•   </w:t>
+      </w:r>
+      <w:r>
+        <w:rPr>
+          <w:sz w:val="18"/>
+          <w:szCs w:val="18"/>
+        </w:rPr>
+        <w:t xml:space="preserve">Shape() raises TypeError; a child like Circle must implement every abstract method before it can be created.</w:t>
+      </w:r>
+    </w:p>
+    <w:p>
+      <w:pPr>
+        <w:ind w:left="260" w:hanging="200"/>
+        <w:spacing w:before="0" w:after="25" w:line="230" w:lineRule="auto"/>
+      </w:pPr>
+      <w:r>
+        <w:rPr>
+          <w:sz w:val="18"/>
+          <w:szCs w:val="18"/>
+        </w:rPr>
+        <w:t xml:space="preserve">•   </w:t>
+      </w:r>
+      <w:r>
+        <w:rPr>
+          <w:sz w:val="18"/>
+          <w:szCs w:val="18"/>
+        </w:rPr>
+        <w:t xml:space="preserve">It is a contract: every payment gateway class MUST have pay() and refund().</w:t>
+      </w:r>
+    </w:p>
+    <w:p>
+      <w:pPr>
+        <w:ind w:left="260" w:hanging="200"/>
+        <w:spacing w:before="0" w:after="25" w:line="230" w:lineRule="auto"/>
+      </w:pPr>
+      <w:r>
+        <w:rPr>
+          <w:sz w:val="18"/>
+          <w:szCs w:val="18"/>
+        </w:rPr>
+        <w:t xml:space="preserve">•   </w:t>
+      </w:r>
+      <w:r>
+        <w:rPr>
+          <w:sz w:val="18"/>
+          <w:szCs w:val="18"/>
+        </w:rPr>
+        <w:t xml:space="preserve">An abstract class can also carry normal implemented methods that children share - part contract, part reuse.</w:t>
+      </w:r>
+    </w:p>
+    <w:p>
+      <w:pPr>
+        <w:ind w:left="260" w:hanging="200"/>
+        <w:spacing w:before="0" w:after="25" w:line="230" w:lineRule="auto"/>
+      </w:pPr>
+      <w:r>
+        <w:rPr>
+          <w:sz w:val="18"/>
+          <w:szCs w:val="18"/>
+        </w:rPr>
+        <w:t xml:space="preserve">•   </w:t>
+      </w:r>
+      <w:r>
+        <w:rPr>
+          <w:sz w:val="18"/>
+          <w:szCs w:val="18"/>
+        </w:rPr>
+        <w:t xml:space="preserve">Python has no separate interface keyword - an abstract class with only abstract methods works as an interface.</w:t>
+      </w:r>
+    </w:p>
+    <w:p>
+      <w:pPr>
+        <w:ind w:left="260" w:hanging="200"/>
+        <w:spacing w:before="0" w:after="25" w:line="230" w:lineRule="auto"/>
+      </w:pPr>
+      <w:r>
+        <w:rPr>
+          <w:sz w:val="18"/>
+          <w:szCs w:val="18"/>
+        </w:rPr>
+        <w:t xml:space="preserve">•   </w:t>
+      </w:r>
+      <w:r>
+        <w:rPr>
+          <w:sz w:val="18"/>
+          <w:szCs w:val="18"/>
+        </w:rPr>
+        <w:t xml:space="preserve">Python also accepts duck typing and Protocols (typing module) as looser alternatives - "if it has the right methods, it fits".</w:t>
+      </w:r>
+    </w:p>
+    <w:p>
+      <w:pPr>
+        <w:ind w:left="120" w:hanging="0"/>
+        <w:spacing w:before="50" w:after="110" w:line="230" w:lineRule="auto"/>
+        <w:pBdr>
+          <w:left w:val="single" w:sz="12" w:space="4" w:color="2E5E1F"/>
+        </w:pBdr>
+      </w:pPr>
+      <w:r>
+        <w:rPr>
+          <w:b/>
+          <w:color w:val="2E5E1F"/>
+          <w:sz w:val="18"/>
+          <w:szCs w:val="18"/>
+        </w:rPr>
+        <w:t xml:space="preserve">Interview answer:  </w:t>
+      </w:r>
+      <w:r>
+        <w:rPr>
+          <w:i/>
+          <w:sz w:val="18"/>
+          <w:szCs w:val="18"/>
+        </w:rPr>
+        <w:t xml:space="preserve">An abstract class, made with ABC and @abstractmethod, cannot be instantiated and forces children to implement its methods - a contract. Python has no interface keyword; a fully-abstract class or a typing Protocol plays that role.</w:t>
+      </w:r>
+    </w:p>
+    <w:p>
+      <w:pPr>
+        <w:spacing w:before="140" w:after="40" w:line="230" w:lineRule="auto"/>
+      </w:pPr>
+      <w:r>
+        <w:rPr>
+          <w:b/>
+          <w:sz w:val="21"/>
+          <w:szCs w:val="21"/>
+        </w:rPr>
+        <w:t xml:space="preserve">4.10  Composition vs Inheritance</w:t>
+      </w:r>
+    </w:p>
+    <w:p>
+      <w:pPr>
+        <w:spacing w:before="0" w:after="40" w:line="230" w:lineRule="auto"/>
+      </w:pPr>
+      <w:r>
+        <w:rPr>
+          <w:b/>
+          <w:sz w:val="18"/>
+          <w:szCs w:val="18"/>
+        </w:rPr>
+        <w:t xml:space="preserve">What it is:  </w:t>
+      </w:r>
+      <w:r>
+        <w:rPr>
+          <w:sz w:val="18"/>
+          <w:szCs w:val="18"/>
+        </w:rPr>
+        <w:t xml:space="preserve">Inheritance is an "is-a" relationship; composition is a "has-a" relationship where one object holds another and delegates work to it.</w:t>
+      </w:r>
+    </w:p>
+    <w:p>
+      <w:pPr>
+        <w:ind w:left="260" w:hanging="200"/>
+        <w:spacing w:before="0" w:after="25" w:line="230" w:lineRule="auto"/>
+      </w:pPr>
+      <w:r>
+        <w:rPr>
+          <w:sz w:val="18"/>
+          <w:szCs w:val="18"/>
+        </w:rPr>
+        <w:t xml:space="preserve">•   </w:t>
+      </w:r>
+      <w:r>
+        <w:rPr>
+          <w:sz w:val="18"/>
+          <w:szCs w:val="18"/>
+        </w:rPr>
+        <w:t xml:space="preserve">Inheritance: Dog is an Animal -&gt; class Dog(Animal).</w:t>
+      </w:r>
+    </w:p>
+    <w:p>
+      <w:pPr>
+        <w:ind w:left="260" w:hanging="200"/>
+        <w:spacing w:before="0" w:after="25" w:line="230" w:lineRule="auto"/>
+      </w:pPr>
+      <w:r>
+        <w:rPr>
+          <w:sz w:val="18"/>
+          <w:szCs w:val="18"/>
+        </w:rPr>
+        <w:t xml:space="preserve">•   </w:t>
+      </w:r>
+      <w:r>
+        <w:rPr>
+          <w:sz w:val="18"/>
+          <w:szCs w:val="18"/>
+        </w:rPr>
+        <w:t xml:space="preserve">Composition: Car has an Engine -&gt; the Car object keeps self.engine = Engine() and calls self.engine.start().</w:t>
+      </w:r>
+    </w:p>
+    <w:p>
+      <w:pPr>
+        <w:ind w:left="260" w:hanging="200"/>
+        <w:spacing w:before="0" w:after="25" w:line="230" w:lineRule="auto"/>
+      </w:pPr>
+      <w:r>
+        <w:rPr>
+          <w:sz w:val="18"/>
+          <w:szCs w:val="18"/>
+        </w:rPr>
+        <w:t xml:space="preserve">•   </w:t>
+      </w:r>
+      <w:r>
+        <w:rPr>
+          <w:sz w:val="18"/>
+          <w:szCs w:val="18"/>
+        </w:rPr>
+        <w:t xml:space="preserve">Inheritance is tight coupling - a parent change hits every child. Composition is looser and easier to change.</w:t>
+      </w:r>
+    </w:p>
+    <w:p>
+      <w:pPr>
+        <w:ind w:left="260" w:hanging="200"/>
+        <w:spacing w:before="0" w:after="25" w:line="230" w:lineRule="auto"/>
+      </w:pPr>
+      <w:r>
+        <w:rPr>
+          <w:sz w:val="18"/>
+          <w:szCs w:val="18"/>
+        </w:rPr>
+        <w:t xml:space="preserve">•   </w:t>
+      </w:r>
+      <w:r>
+        <w:rPr>
+          <w:sz w:val="18"/>
+          <w:szCs w:val="18"/>
+        </w:rPr>
+        <w:t xml:space="preserve">Composition can swap parts at runtime: give the car a different engine object. Inheritance is fixed at class definition.</w:t>
+      </w:r>
+    </w:p>
+    <w:p>
+      <w:pPr>
+        <w:ind w:left="260" w:hanging="200"/>
+        <w:spacing w:before="0" w:after="25" w:line="230" w:lineRule="auto"/>
+      </w:pPr>
+      <w:r>
+        <w:rPr>
+          <w:sz w:val="18"/>
+          <w:szCs w:val="18"/>
+        </w:rPr>
+        <w:t xml:space="preserve">•   </w:t>
+      </w:r>
+      <w:r>
+        <w:rPr>
+          <w:sz w:val="18"/>
+          <w:szCs w:val="18"/>
+        </w:rPr>
+        <w:t xml:space="preserve">Deep inheritance trees become fragile and hard to follow; composition keeps pieces small and testable.</w:t>
+      </w:r>
+    </w:p>
+    <w:p>
+      <w:pPr>
+        <w:ind w:left="260" w:hanging="200"/>
+        <w:spacing w:before="0" w:after="25" w:line="230" w:lineRule="auto"/>
+      </w:pPr>
+      <w:r>
+        <w:rPr>
+          <w:sz w:val="18"/>
+          <w:szCs w:val="18"/>
+        </w:rPr>
+        <w:t xml:space="preserve">•   </w:t>
+      </w:r>
+      <w:r>
+        <w:rPr>
+          <w:sz w:val="18"/>
+          <w:szCs w:val="18"/>
+        </w:rPr>
+        <w:t xml:space="preserve">Guideline: "favor composition over inheritance". Use inheritance for true is-a with shared behavior, composition for building from parts.</w:t>
+      </w:r>
+    </w:p>
+    <w:p>
+      <w:pPr>
+        <w:ind w:left="120" w:hanging="0"/>
+        <w:spacing w:before="50" w:after="110" w:line="230" w:lineRule="auto"/>
+        <w:pBdr>
+          <w:left w:val="single" w:sz="12" w:space="4" w:color="2E5E1F"/>
+        </w:pBdr>
+      </w:pPr>
+      <w:r>
+        <w:rPr>
+          <w:b/>
+          <w:color w:val="2E5E1F"/>
+          <w:sz w:val="18"/>
+          <w:szCs w:val="18"/>
+        </w:rPr>
+        <w:t xml:space="preserve">Interview answer:  </w:t>
+      </w:r>
+      <w:r>
+        <w:rPr>
+          <w:i/>
+          <w:sz w:val="18"/>
+          <w:szCs w:val="18"/>
+        </w:rPr>
+        <w:t xml:space="preserve">Inheritance models is-a (Dog is an Animal), composition models has-a (Car has an Engine and delegates to it). Composition couples loosely and allows runtime swapping, so the common advice is to favor composition and keep inheritance for genuine is-a relationships.</w:t>
       </w:r>
     </w:p>
     <w:sectPr>

</xml_diff>

<commit_message>
Phase 5: Advanced Python (12 topics)
Iterator/iterable, generators, comprehensions, context managers, exceptions,
custom exceptions, GC, GIL, threading vs multiprocessing, asyncio, modules, venv

Co-Authored-By: Claude Fable 5 <noreply@anthropic.com>
Claude-Session: https://claude.ai/code/session_01Vm8nqoCZNTvUn3BNmW1Tgz
</commit_message>
<xml_diff>
--- a/Python_Interview_Theory.docx
+++ b/Python_Interview_Theory.docx
@@ -6193,6 +6193,2328 @@
           <w:szCs w:val="18"/>
         </w:rPr>
         <w:t xml:space="preserve">Inheritance models is-a (Dog is an Animal), composition models has-a (Car has an Engine and delegates to it). Composition couples loosely and allows runtime swapping, so the common advice is to favor composition and keep inheritance for genuine is-a relationships.</w:t>
+      </w:r>
+    </w:p>
+    <w:p>
+      <w:pPr>
+        <w:spacing w:before="200" w:after="60" w:line="230" w:lineRule="auto"/>
+      </w:pPr>
+      <w:r>
+        <w:rPr>
+          <w:b/>
+          <w:color w:val="1F4E79"/>
+          <w:sz w:val="26"/>
+          <w:szCs w:val="26"/>
+        </w:rPr>
+        <w:t xml:space="preserve">Phase 5 - Advanced Python</w:t>
+      </w:r>
+    </w:p>
+    <w:p>
+      <w:pPr>
+        <w:spacing w:before="140" w:after="40" w:line="230" w:lineRule="auto"/>
+      </w:pPr>
+      <w:r>
+        <w:rPr>
+          <w:b/>
+          <w:sz w:val="21"/>
+          <w:szCs w:val="21"/>
+        </w:rPr>
+        <w:t xml:space="preserve">5.1  Iterator vs Iterable</w:t>
+      </w:r>
+    </w:p>
+    <w:p>
+      <w:pPr>
+        <w:spacing w:before="0" w:after="40" w:line="230" w:lineRule="auto"/>
+      </w:pPr>
+      <w:r>
+        <w:rPr>
+          <w:b/>
+          <w:sz w:val="18"/>
+          <w:szCs w:val="18"/>
+        </w:rPr>
+        <w:t xml:space="preserve">What it is:  </w:t>
+      </w:r>
+      <w:r>
+        <w:rPr>
+          <w:sz w:val="18"/>
+          <w:szCs w:val="18"/>
+        </w:rPr>
+        <w:t xml:space="preserve">An iterable is something we can loop over. An iterator is the object that actually produces the items one by one.</w:t>
+      </w:r>
+    </w:p>
+    <w:p>
+      <w:pPr>
+        <w:ind w:left="260" w:hanging="200"/>
+        <w:spacing w:before="0" w:after="25" w:line="230" w:lineRule="auto"/>
+      </w:pPr>
+      <w:r>
+        <w:rPr>
+          <w:sz w:val="18"/>
+          <w:szCs w:val="18"/>
+        </w:rPr>
+        <w:t xml:space="preserve">•   </w:t>
+      </w:r>
+      <w:r>
+        <w:rPr>
+          <w:sz w:val="18"/>
+          <w:szCs w:val="18"/>
+        </w:rPr>
+        <w:t xml:space="preserve">Iterable: has __iter__, which returns an iterator. Examples: list, str, dict, set, range, file objects.</w:t>
+      </w:r>
+    </w:p>
+    <w:p>
+      <w:pPr>
+        <w:ind w:left="260" w:hanging="200"/>
+        <w:spacing w:before="0" w:after="25" w:line="230" w:lineRule="auto"/>
+      </w:pPr>
+      <w:r>
+        <w:rPr>
+          <w:sz w:val="18"/>
+          <w:szCs w:val="18"/>
+        </w:rPr>
+        <w:t xml:space="preserve">•   </w:t>
+      </w:r>
+      <w:r>
+        <w:rPr>
+          <w:sz w:val="18"/>
+          <w:szCs w:val="18"/>
+        </w:rPr>
+        <w:t xml:space="preserve">Iterator: has __next__, which returns the next item, and raises StopIteration when items end. It also has __iter__ returning itself.</w:t>
+      </w:r>
+    </w:p>
+    <w:p>
+      <w:pPr>
+        <w:ind w:left="260" w:hanging="200"/>
+        <w:spacing w:before="0" w:after="25" w:line="230" w:lineRule="auto"/>
+      </w:pPr>
+      <w:r>
+        <w:rPr>
+          <w:sz w:val="18"/>
+          <w:szCs w:val="18"/>
+        </w:rPr>
+        <w:t xml:space="preserve">•   </w:t>
+      </w:r>
+      <w:r>
+        <w:rPr>
+          <w:sz w:val="18"/>
+          <w:szCs w:val="18"/>
+        </w:rPr>
+        <w:t xml:space="preserve">A for-loop does this under the hood: it calls iter() on the iterable, then next() again and again, and stops cleanly on StopIteration.</w:t>
+      </w:r>
+    </w:p>
+    <w:p>
+      <w:pPr>
+        <w:ind w:left="260" w:hanging="200"/>
+        <w:spacing w:before="0" w:after="25" w:line="230" w:lineRule="auto"/>
+      </w:pPr>
+      <w:r>
+        <w:rPr>
+          <w:sz w:val="18"/>
+          <w:szCs w:val="18"/>
+        </w:rPr>
+        <w:t xml:space="preserve">•   </w:t>
+      </w:r>
+      <w:r>
+        <w:rPr>
+          <w:sz w:val="18"/>
+          <w:szCs w:val="18"/>
+        </w:rPr>
+        <w:t xml:space="preserve">iter(my_list) gives an iterator; next(it) pulls one item at a time.</w:t>
+      </w:r>
+    </w:p>
+    <w:p>
+      <w:pPr>
+        <w:ind w:left="260" w:hanging="200"/>
+        <w:spacing w:before="0" w:after="25" w:line="230" w:lineRule="auto"/>
+      </w:pPr>
+      <w:r>
+        <w:rPr>
+          <w:sz w:val="18"/>
+          <w:szCs w:val="18"/>
+        </w:rPr>
+        <w:t xml:space="preserve">•   </w:t>
+      </w:r>
+      <w:r>
+        <w:rPr>
+          <w:sz w:val="18"/>
+          <w:szCs w:val="18"/>
+        </w:rPr>
+        <w:t xml:space="preserve">An iterator is one-way and one-time: once finished, it is empty. The iterable (like the list) can give a fresh iterator any time.</w:t>
+      </w:r>
+    </w:p>
+    <w:p>
+      <w:pPr>
+        <w:ind w:left="260" w:hanging="200"/>
+        <w:spacing w:before="0" w:after="25" w:line="230" w:lineRule="auto"/>
+      </w:pPr>
+      <w:r>
+        <w:rPr>
+          <w:sz w:val="18"/>
+          <w:szCs w:val="18"/>
+        </w:rPr>
+        <w:t xml:space="preserve">•   </w:t>
+      </w:r>
+      <w:r>
+        <w:rPr>
+          <w:sz w:val="18"/>
+          <w:szCs w:val="18"/>
+        </w:rPr>
+        <w:t xml:space="preserve">This protocol is why so many tools - loops, sum, sorted, unpacking - work on any iterable object.</w:t>
+      </w:r>
+    </w:p>
+    <w:p>
+      <w:pPr>
+        <w:ind w:left="120" w:hanging="0"/>
+        <w:spacing w:before="50" w:after="110" w:line="230" w:lineRule="auto"/>
+        <w:pBdr>
+          <w:left w:val="single" w:sz="12" w:space="4" w:color="2E5E1F"/>
+        </w:pBdr>
+      </w:pPr>
+      <w:r>
+        <w:rPr>
+          <w:b/>
+          <w:color w:val="2E5E1F"/>
+          <w:sz w:val="18"/>
+          <w:szCs w:val="18"/>
+        </w:rPr>
+        <w:t xml:space="preserve">Interview answer:  </w:t>
+      </w:r>
+      <w:r>
+        <w:rPr>
+          <w:i/>
+          <w:sz w:val="18"/>
+          <w:szCs w:val="18"/>
+        </w:rPr>
+        <w:t xml:space="preserve">An iterable has __iter__ and can be looped; an iterator has __next__ and produces values until StopIteration. A for-loop calls iter() then next() repeatedly. Iterators are single-use, iterables can hand out fresh iterators.</w:t>
+      </w:r>
+    </w:p>
+    <w:p>
+      <w:pPr>
+        <w:spacing w:before="140" w:after="40" w:line="230" w:lineRule="auto"/>
+      </w:pPr>
+      <w:r>
+        <w:rPr>
+          <w:b/>
+          <w:sz w:val="21"/>
+          <w:szCs w:val="21"/>
+        </w:rPr>
+        <w:t xml:space="preserve">5.2  Generator and yield</w:t>
+      </w:r>
+    </w:p>
+    <w:p>
+      <w:pPr>
+        <w:spacing w:before="0" w:after="40" w:line="230" w:lineRule="auto"/>
+      </w:pPr>
+      <w:r>
+        <w:rPr>
+          <w:b/>
+          <w:sz w:val="18"/>
+          <w:szCs w:val="18"/>
+        </w:rPr>
+        <w:t xml:space="preserve">What it is:  </w:t>
+      </w:r>
+      <w:r>
+        <w:rPr>
+          <w:sz w:val="18"/>
+          <w:szCs w:val="18"/>
+        </w:rPr>
+        <w:t xml:space="preserve">A generator is a function that uses yield to produce values one at a time, lazily, instead of building everything in memory.</w:t>
+      </w:r>
+    </w:p>
+    <w:p>
+      <w:pPr>
+        <w:ind w:left="260" w:hanging="200"/>
+        <w:spacing w:before="0" w:after="25" w:line="230" w:lineRule="auto"/>
+      </w:pPr>
+      <w:r>
+        <w:rPr>
+          <w:sz w:val="18"/>
+          <w:szCs w:val="18"/>
+        </w:rPr>
+        <w:t xml:space="preserve">•   </w:t>
+      </w:r>
+      <w:r>
+        <w:rPr>
+          <w:sz w:val="18"/>
+          <w:szCs w:val="18"/>
+        </w:rPr>
+        <w:t xml:space="preserve">Any function with yield becomes a generator function. Calling it does not run the body - it returns a generator object.</w:t>
+      </w:r>
+    </w:p>
+    <w:p>
+      <w:pPr>
+        <w:ind w:left="260" w:hanging="200"/>
+        <w:spacing w:before="0" w:after="25" w:line="230" w:lineRule="auto"/>
+      </w:pPr>
+      <w:r>
+        <w:rPr>
+          <w:sz w:val="18"/>
+          <w:szCs w:val="18"/>
+        </w:rPr>
+        <w:t xml:space="preserve">•   </w:t>
+      </w:r>
+      <w:r>
+        <w:rPr>
+          <w:sz w:val="18"/>
+          <w:szCs w:val="18"/>
+        </w:rPr>
+        <w:t xml:space="preserve">Each next() runs to the next yield, hands out that value, and pauses, keeping all local state.</w:t>
+      </w:r>
+    </w:p>
+    <w:p>
+      <w:pPr>
+        <w:ind w:left="260" w:hanging="200"/>
+        <w:spacing w:before="0" w:after="25" w:line="230" w:lineRule="auto"/>
+      </w:pPr>
+      <w:r>
+        <w:rPr>
+          <w:sz w:val="18"/>
+          <w:szCs w:val="18"/>
+        </w:rPr>
+        <w:t xml:space="preserve">•   </w:t>
+      </w:r>
+      <w:r>
+        <w:rPr>
+          <w:sz w:val="18"/>
+          <w:szCs w:val="18"/>
+        </w:rPr>
+        <w:t xml:space="preserve">When the function ends, StopIteration is raised - the loop ends naturally.</w:t>
+      </w:r>
+    </w:p>
+    <w:p>
+      <w:pPr>
+        <w:ind w:left="260" w:hanging="200"/>
+        <w:spacing w:before="0" w:after="25" w:line="230" w:lineRule="auto"/>
+      </w:pPr>
+      <w:r>
+        <w:rPr>
+          <w:sz w:val="18"/>
+          <w:szCs w:val="18"/>
+        </w:rPr>
+        <w:t xml:space="preserve">•   </w:t>
+      </w:r>
+      <w:r>
+        <w:rPr>
+          <w:sz w:val="18"/>
+          <w:szCs w:val="18"/>
+        </w:rPr>
+        <w:t xml:space="preserve">Big win: memory. Processing a 10 GB file line by line uses almost no RAM, because only one item exists at a time.</w:t>
+      </w:r>
+    </w:p>
+    <w:p>
+      <w:pPr>
+        <w:ind w:left="260" w:hanging="200"/>
+        <w:spacing w:before="0" w:after="25" w:line="230" w:lineRule="auto"/>
+      </w:pPr>
+      <w:r>
+        <w:rPr>
+          <w:sz w:val="18"/>
+          <w:szCs w:val="18"/>
+        </w:rPr>
+        <w:t xml:space="preserve">•   </w:t>
+      </w:r>
+      <w:r>
+        <w:rPr>
+          <w:sz w:val="18"/>
+          <w:szCs w:val="18"/>
+        </w:rPr>
+        <w:t xml:space="preserve">A generator is an iterator, so it fits for-loops, sum(), any tool that takes an iterable.</w:t>
+      </w:r>
+    </w:p>
+    <w:p>
+      <w:pPr>
+        <w:ind w:left="260" w:hanging="200"/>
+        <w:spacing w:before="0" w:after="25" w:line="230" w:lineRule="auto"/>
+      </w:pPr>
+      <w:r>
+        <w:rPr>
+          <w:sz w:val="18"/>
+          <w:szCs w:val="18"/>
+        </w:rPr>
+        <w:t xml:space="preserve">•   </w:t>
+      </w:r>
+      <w:r>
+        <w:rPr>
+          <w:sz w:val="18"/>
+          <w:szCs w:val="18"/>
+        </w:rPr>
+        <w:t xml:space="preserve">Lazy also means fast start and the ability to model infinite streams (an endless counter).</w:t>
+      </w:r>
+    </w:p>
+    <w:p>
+      <w:pPr>
+        <w:ind w:left="260" w:hanging="200"/>
+        <w:spacing w:before="0" w:after="25" w:line="230" w:lineRule="auto"/>
+      </w:pPr>
+      <w:r>
+        <w:rPr>
+          <w:sz w:val="18"/>
+          <w:szCs w:val="18"/>
+        </w:rPr>
+        <w:t xml:space="preserve">•   </w:t>
+      </w:r>
+      <w:r>
+        <w:rPr>
+          <w:sz w:val="18"/>
+          <w:szCs w:val="18"/>
+        </w:rPr>
+        <w:t xml:space="preserve">One-time use: after it is exhausted, iterate again by calling the function again.</w:t>
+      </w:r>
+    </w:p>
+    <w:p>
+      <w:pPr>
+        <w:ind w:left="260" w:hanging="200"/>
+        <w:spacing w:before="0" w:after="25" w:line="230" w:lineRule="auto"/>
+      </w:pPr>
+      <w:r>
+        <w:rPr>
+          <w:sz w:val="18"/>
+          <w:szCs w:val="18"/>
+        </w:rPr>
+        <w:t xml:space="preserve">•   </w:t>
+      </w:r>
+      <w:r>
+        <w:rPr>
+          <w:sz w:val="18"/>
+          <w:szCs w:val="18"/>
+        </w:rPr>
+        <w:t xml:space="preserve">I used this pattern in scraping pipelines - yielding records one by one instead of collecting huge lists.</w:t>
+      </w:r>
+    </w:p>
+    <w:p>
+      <w:pPr>
+        <w:ind w:left="120" w:hanging="0"/>
+        <w:spacing w:before="50" w:after="110" w:line="230" w:lineRule="auto"/>
+        <w:pBdr>
+          <w:left w:val="single" w:sz="12" w:space="4" w:color="2E5E1F"/>
+        </w:pBdr>
+      </w:pPr>
+      <w:r>
+        <w:rPr>
+          <w:b/>
+          <w:color w:val="2E5E1F"/>
+          <w:sz w:val="18"/>
+          <w:szCs w:val="18"/>
+        </w:rPr>
+        <w:t xml:space="preserve">Interview answer:  </w:t>
+      </w:r>
+      <w:r>
+        <w:rPr>
+          <w:i/>
+          <w:sz w:val="18"/>
+          <w:szCs w:val="18"/>
+        </w:rPr>
+        <w:t xml:space="preserve">A generator function uses yield to return values lazily, pausing and resuming with its state kept. It saves memory - one item in RAM at a time - which is ideal for big files and streams. It is a normal iterator, so loops and sum() work directly on it.</w:t>
+      </w:r>
+    </w:p>
+    <w:p>
+      <w:pPr>
+        <w:spacing w:before="140" w:after="40" w:line="230" w:lineRule="auto"/>
+      </w:pPr>
+      <w:r>
+        <w:rPr>
+          <w:b/>
+          <w:sz w:val="21"/>
+          <w:szCs w:val="21"/>
+        </w:rPr>
+        <w:t xml:space="preserve">5.3  List Comprehension vs Generator Expression</w:t>
+      </w:r>
+    </w:p>
+    <w:p>
+      <w:pPr>
+        <w:spacing w:before="0" w:after="40" w:line="230" w:lineRule="auto"/>
+      </w:pPr>
+      <w:r>
+        <w:rPr>
+          <w:b/>
+          <w:sz w:val="18"/>
+          <w:szCs w:val="18"/>
+        </w:rPr>
+        <w:t xml:space="preserve">What it is:  </w:t>
+      </w:r>
+      <w:r>
+        <w:rPr>
+          <w:sz w:val="18"/>
+          <w:szCs w:val="18"/>
+        </w:rPr>
+        <w:t xml:space="preserve">Both build sequences in one line; the comprehension makes a full list now, the generator expression makes items lazily.</w:t>
+      </w:r>
+    </w:p>
+    <w:p>
+      <w:pPr>
+        <w:ind w:left="260" w:hanging="200"/>
+        <w:spacing w:before="0" w:after="25" w:line="230" w:lineRule="auto"/>
+      </w:pPr>
+      <w:r>
+        <w:rPr>
+          <w:sz w:val="18"/>
+          <w:szCs w:val="18"/>
+        </w:rPr>
+        <w:t xml:space="preserve">•   </w:t>
+      </w:r>
+      <w:r>
+        <w:rPr>
+          <w:sz w:val="18"/>
+          <w:szCs w:val="18"/>
+        </w:rPr>
+        <w:t xml:space="preserve">List comprehension: [x * 2 for x in nums if x &gt; 0] - square brackets, whole list in memory at once.</w:t>
+      </w:r>
+    </w:p>
+    <w:p>
+      <w:pPr>
+        <w:ind w:left="260" w:hanging="200"/>
+        <w:spacing w:before="0" w:after="25" w:line="230" w:lineRule="auto"/>
+      </w:pPr>
+      <w:r>
+        <w:rPr>
+          <w:sz w:val="18"/>
+          <w:szCs w:val="18"/>
+        </w:rPr>
+        <w:t xml:space="preserve">•   </w:t>
+      </w:r>
+      <w:r>
+        <w:rPr>
+          <w:sz w:val="18"/>
+          <w:szCs w:val="18"/>
+        </w:rPr>
+        <w:t xml:space="preserve">Generator expression: (x * 2 for x in nums if x &gt; 0) - round brackets, items produced only when asked.</w:t>
+      </w:r>
+    </w:p>
+    <w:p>
+      <w:pPr>
+        <w:ind w:left="260" w:hanging="200"/>
+        <w:spacing w:before="0" w:after="25" w:line="230" w:lineRule="auto"/>
+      </w:pPr>
+      <w:r>
+        <w:rPr>
+          <w:sz w:val="18"/>
+          <w:szCs w:val="18"/>
+        </w:rPr>
+        <w:t xml:space="preserve">•   </w:t>
+      </w:r>
+      <w:r>
+        <w:rPr>
+          <w:sz w:val="18"/>
+          <w:szCs w:val="18"/>
+        </w:rPr>
+        <w:t xml:space="preserve">Use the list when we need it many times, need len(), slicing, or random access.</w:t>
+      </w:r>
+    </w:p>
+    <w:p>
+      <w:pPr>
+        <w:ind w:left="260" w:hanging="200"/>
+        <w:spacing w:before="0" w:after="25" w:line="230" w:lineRule="auto"/>
+      </w:pPr>
+      <w:r>
+        <w:rPr>
+          <w:sz w:val="18"/>
+          <w:szCs w:val="18"/>
+        </w:rPr>
+        <w:t xml:space="preserve">•   </w:t>
+      </w:r>
+      <w:r>
+        <w:rPr>
+          <w:sz w:val="18"/>
+          <w:szCs w:val="18"/>
+        </w:rPr>
+        <w:t xml:space="preserve">Use the generator for one pass over large data: sum(x * x for x in range(10**7)) never builds a list.</w:t>
+      </w:r>
+    </w:p>
+    <w:p>
+      <w:pPr>
+        <w:ind w:left="260" w:hanging="200"/>
+        <w:spacing w:before="0" w:after="25" w:line="230" w:lineRule="auto"/>
+      </w:pPr>
+      <w:r>
+        <w:rPr>
+          <w:sz w:val="18"/>
+          <w:szCs w:val="18"/>
+        </w:rPr>
+        <w:t xml:space="preserve">•   </w:t>
+      </w:r>
+      <w:r>
+        <w:rPr>
+          <w:sz w:val="18"/>
+          <w:szCs w:val="18"/>
+        </w:rPr>
+        <w:t xml:space="preserve">Inside a function call, the extra brackets can be dropped: sum(x for x in nums).</w:t>
+      </w:r>
+    </w:p>
+    <w:p>
+      <w:pPr>
+        <w:ind w:left="260" w:hanging="200"/>
+        <w:spacing w:before="0" w:after="25" w:line="230" w:lineRule="auto"/>
+      </w:pPr>
+      <w:r>
+        <w:rPr>
+          <w:sz w:val="18"/>
+          <w:szCs w:val="18"/>
+        </w:rPr>
+        <w:t xml:space="preserve">•   </w:t>
+      </w:r>
+      <w:r>
+        <w:rPr>
+          <w:sz w:val="18"/>
+          <w:szCs w:val="18"/>
+        </w:rPr>
+        <w:t xml:space="preserve">Dict and set comprehensions also exist: {k: v for ...} and {x for ...}.</w:t>
+      </w:r>
+    </w:p>
+    <w:p>
+      <w:pPr>
+        <w:ind w:left="260" w:hanging="200"/>
+        <w:spacing w:before="0" w:after="25" w:line="230" w:lineRule="auto"/>
+      </w:pPr>
+      <w:r>
+        <w:rPr>
+          <w:sz w:val="18"/>
+          <w:szCs w:val="18"/>
+        </w:rPr>
+        <w:t xml:space="preserve">•   </w:t>
+      </w:r>
+      <w:r>
+        <w:rPr>
+          <w:sz w:val="18"/>
+          <w:szCs w:val="18"/>
+        </w:rPr>
+        <w:t xml:space="preserve">Readability rule: one condition and one transform is fine; nested and complex logic belongs in a normal loop.</w:t>
+      </w:r>
+    </w:p>
+    <w:p>
+      <w:pPr>
+        <w:ind w:left="120" w:hanging="0"/>
+        <w:spacing w:before="50" w:after="110" w:line="230" w:lineRule="auto"/>
+        <w:pBdr>
+          <w:left w:val="single" w:sz="12" w:space="4" w:color="2E5E1F"/>
+        </w:pBdr>
+      </w:pPr>
+      <w:r>
+        <w:rPr>
+          <w:b/>
+          <w:color w:val="2E5E1F"/>
+          <w:sz w:val="18"/>
+          <w:szCs w:val="18"/>
+        </w:rPr>
+        <w:t xml:space="preserve">Interview answer:  </w:t>
+      </w:r>
+      <w:r>
+        <w:rPr>
+          <w:i/>
+          <w:sz w:val="18"/>
+          <w:szCs w:val="18"/>
+        </w:rPr>
+        <w:t xml:space="preserve">[x for x in data] builds the whole list in memory; (x for x in data) is a lazy generator that yields items on demand. For one-pass work on big data I use the generator form, and I keep comprehensions simple for readability.</w:t>
+      </w:r>
+    </w:p>
+    <w:p>
+      <w:pPr>
+        <w:spacing w:before="140" w:after="40" w:line="230" w:lineRule="auto"/>
+      </w:pPr>
+      <w:r>
+        <w:rPr>
+          <w:b/>
+          <w:sz w:val="21"/>
+          <w:szCs w:val="21"/>
+        </w:rPr>
+        <w:t xml:space="preserve">5.4  Context Manager and with</w:t>
+      </w:r>
+    </w:p>
+    <w:p>
+      <w:pPr>
+        <w:spacing w:before="0" w:after="40" w:line="230" w:lineRule="auto"/>
+      </w:pPr>
+      <w:r>
+        <w:rPr>
+          <w:b/>
+          <w:sz w:val="18"/>
+          <w:szCs w:val="18"/>
+        </w:rPr>
+        <w:t xml:space="preserve">What it is:  </w:t>
+      </w:r>
+      <w:r>
+        <w:rPr>
+          <w:sz w:val="18"/>
+          <w:szCs w:val="18"/>
+        </w:rPr>
+        <w:t xml:space="preserve">A context manager guarantees setup and cleanup around a block - with runs the cleanup even if an error happens inside.</w:t>
+      </w:r>
+    </w:p>
+    <w:p>
+      <w:pPr>
+        <w:ind w:left="260" w:hanging="200"/>
+        <w:spacing w:before="0" w:after="25" w:line="230" w:lineRule="auto"/>
+      </w:pPr>
+      <w:r>
+        <w:rPr>
+          <w:sz w:val="18"/>
+          <w:szCs w:val="18"/>
+        </w:rPr>
+        <w:t xml:space="preserve">•   </w:t>
+      </w:r>
+      <w:r>
+        <w:rPr>
+          <w:sz w:val="18"/>
+          <w:szCs w:val="18"/>
+        </w:rPr>
+        <w:t xml:space="preserve">Classic use: with open("f.txt") as f: - the file closes automatically, even on an exception.</w:t>
+      </w:r>
+    </w:p>
+    <w:p>
+      <w:pPr>
+        <w:ind w:left="260" w:hanging="200"/>
+        <w:spacing w:before="0" w:after="25" w:line="230" w:lineRule="auto"/>
+      </w:pPr>
+      <w:r>
+        <w:rPr>
+          <w:sz w:val="18"/>
+          <w:szCs w:val="18"/>
+        </w:rPr>
+        <w:t xml:space="preserve">•   </w:t>
+      </w:r>
+      <w:r>
+        <w:rPr>
+          <w:sz w:val="18"/>
+          <w:szCs w:val="18"/>
+        </w:rPr>
+        <w:t xml:space="preserve">Without with, an exception between open() and close() leaks the file handle.</w:t>
+      </w:r>
+    </w:p>
+    <w:p>
+      <w:pPr>
+        <w:ind w:left="260" w:hanging="200"/>
+        <w:spacing w:before="0" w:after="25" w:line="230" w:lineRule="auto"/>
+      </w:pPr>
+      <w:r>
+        <w:rPr>
+          <w:sz w:val="18"/>
+          <w:szCs w:val="18"/>
+        </w:rPr>
+        <w:t xml:space="preserve">•   </w:t>
+      </w:r>
+      <w:r>
+        <w:rPr>
+          <w:sz w:val="18"/>
+          <w:szCs w:val="18"/>
+        </w:rPr>
+        <w:t xml:space="preserve">The protocol is two dunders: __enter__ (runs at the start, its return value goes after as) and __exit__ (always runs at the end, receives exception info).</w:t>
+      </w:r>
+    </w:p>
+    <w:p>
+      <w:pPr>
+        <w:ind w:left="260" w:hanging="200"/>
+        <w:spacing w:before="0" w:after="25" w:line="230" w:lineRule="auto"/>
+      </w:pPr>
+      <w:r>
+        <w:rPr>
+          <w:sz w:val="18"/>
+          <w:szCs w:val="18"/>
+        </w:rPr>
+        <w:t xml:space="preserve">•   </w:t>
+      </w:r>
+      <w:r>
+        <w:rPr>
+          <w:sz w:val="18"/>
+          <w:szCs w:val="18"/>
+        </w:rPr>
+        <w:t xml:space="preserve">If __exit__ returns True, the exception is swallowed; normally we return None or False so it propagates.</w:t>
+      </w:r>
+    </w:p>
+    <w:p>
+      <w:pPr>
+        <w:ind w:left="260" w:hanging="200"/>
+        <w:spacing w:before="0" w:after="25" w:line="230" w:lineRule="auto"/>
+      </w:pPr>
+      <w:r>
+        <w:rPr>
+          <w:sz w:val="18"/>
+          <w:szCs w:val="18"/>
+        </w:rPr>
+        <w:t xml:space="preserve">•   </w:t>
+      </w:r>
+      <w:r>
+        <w:rPr>
+          <w:sz w:val="18"/>
+          <w:szCs w:val="18"/>
+        </w:rPr>
+        <w:t xml:space="preserve">Easier way to write one: @contextlib.contextmanager on a generator - code before yield is setup, after yield is cleanup.</w:t>
+      </w:r>
+    </w:p>
+    <w:p>
+      <w:pPr>
+        <w:ind w:left="260" w:hanging="200"/>
+        <w:spacing w:before="0" w:after="25" w:line="230" w:lineRule="auto"/>
+      </w:pPr>
+      <w:r>
+        <w:rPr>
+          <w:sz w:val="18"/>
+          <w:szCs w:val="18"/>
+        </w:rPr>
+        <w:t xml:space="preserve">•   </w:t>
+      </w:r>
+      <w:r>
+        <w:rPr>
+          <w:sz w:val="18"/>
+          <w:szCs w:val="18"/>
+        </w:rPr>
+        <w:t xml:space="preserve">Real uses: files, DB connections and transactions (commit/rollback), locks in threading, temporary settings.</w:t>
+      </w:r>
+    </w:p>
+    <w:p>
+      <w:pPr>
+        <w:ind w:left="120" w:hanging="0"/>
+        <w:spacing w:before="50" w:after="110" w:line="230" w:lineRule="auto"/>
+        <w:pBdr>
+          <w:left w:val="single" w:sz="12" w:space="4" w:color="2E5E1F"/>
+        </w:pBdr>
+      </w:pPr>
+      <w:r>
+        <w:rPr>
+          <w:b/>
+          <w:color w:val="2E5E1F"/>
+          <w:sz w:val="18"/>
+          <w:szCs w:val="18"/>
+        </w:rPr>
+        <w:t xml:space="preserve">Interview answer:  </w:t>
+      </w:r>
+      <w:r>
+        <w:rPr>
+          <w:i/>
+          <w:sz w:val="18"/>
+          <w:szCs w:val="18"/>
+        </w:rPr>
+        <w:t xml:space="preserve">A context manager pairs setup with guaranteed cleanup: with calls __enter__ before the block and __exit__ after, even on exceptions. Files, DB transactions and locks are typical uses, and contextlib.contextmanager lets me write one from a generator quickly.</w:t>
+      </w:r>
+    </w:p>
+    <w:p>
+      <w:pPr>
+        <w:spacing w:before="140" w:after="40" w:line="230" w:lineRule="auto"/>
+      </w:pPr>
+      <w:r>
+        <w:rPr>
+          <w:b/>
+          <w:sz w:val="21"/>
+          <w:szCs w:val="21"/>
+        </w:rPr>
+        <w:t xml:space="preserve">5.5  Exception Handling</w:t>
+      </w:r>
+    </w:p>
+    <w:p>
+      <w:pPr>
+        <w:spacing w:before="0" w:after="40" w:line="230" w:lineRule="auto"/>
+      </w:pPr>
+      <w:r>
+        <w:rPr>
+          <w:b/>
+          <w:sz w:val="18"/>
+          <w:szCs w:val="18"/>
+        </w:rPr>
+        <w:t xml:space="preserve">What it is:  </w:t>
+      </w:r>
+      <w:r>
+        <w:rPr>
+          <w:sz w:val="18"/>
+          <w:szCs w:val="18"/>
+        </w:rPr>
+        <w:t xml:space="preserve">Exception handling with try/except lets the program deal with errors gracefully instead of crashing.</w:t>
+      </w:r>
+    </w:p>
+    <w:p>
+      <w:pPr>
+        <w:ind w:left="260" w:hanging="200"/>
+        <w:spacing w:before="0" w:after="25" w:line="230" w:lineRule="auto"/>
+      </w:pPr>
+      <w:r>
+        <w:rPr>
+          <w:sz w:val="18"/>
+          <w:szCs w:val="18"/>
+        </w:rPr>
+        <w:t xml:space="preserve">•   </w:t>
+      </w:r>
+      <w:r>
+        <w:rPr>
+          <w:sz w:val="18"/>
+          <w:szCs w:val="18"/>
+        </w:rPr>
+        <w:t xml:space="preserve">try: risky code. except SomeError: what to do if it fails. Always catch the specific error, not bare except.</w:t>
+      </w:r>
+    </w:p>
+    <w:p>
+      <w:pPr>
+        <w:ind w:left="260" w:hanging="200"/>
+        <w:spacing w:before="0" w:after="25" w:line="230" w:lineRule="auto"/>
+      </w:pPr>
+      <w:r>
+        <w:rPr>
+          <w:sz w:val="18"/>
+          <w:szCs w:val="18"/>
+        </w:rPr>
+        <w:t xml:space="preserve">•   </w:t>
+      </w:r>
+      <w:r>
+        <w:rPr>
+          <w:sz w:val="18"/>
+          <w:szCs w:val="18"/>
+        </w:rPr>
+        <w:t xml:space="preserve">except (ValueError, KeyError) catches several; except Exception as e captures the object for logging.</w:t>
+      </w:r>
+    </w:p>
+    <w:p>
+      <w:pPr>
+        <w:ind w:left="260" w:hanging="200"/>
+        <w:spacing w:before="0" w:after="25" w:line="230" w:lineRule="auto"/>
+      </w:pPr>
+      <w:r>
+        <w:rPr>
+          <w:sz w:val="18"/>
+          <w:szCs w:val="18"/>
+        </w:rPr>
+        <w:t xml:space="preserve">•   </w:t>
+      </w:r>
+      <w:r>
+        <w:rPr>
+          <w:sz w:val="18"/>
+          <w:szCs w:val="18"/>
+        </w:rPr>
+        <w:t xml:space="preserve">else: runs only when no exception happened - keeps the happy path separate.</w:t>
+      </w:r>
+    </w:p>
+    <w:p>
+      <w:pPr>
+        <w:ind w:left="260" w:hanging="200"/>
+        <w:spacing w:before="0" w:after="25" w:line="230" w:lineRule="auto"/>
+      </w:pPr>
+      <w:r>
+        <w:rPr>
+          <w:sz w:val="18"/>
+          <w:szCs w:val="18"/>
+        </w:rPr>
+        <w:t xml:space="preserve">•   </w:t>
+      </w:r>
+      <w:r>
+        <w:rPr>
+          <w:sz w:val="18"/>
+          <w:szCs w:val="18"/>
+        </w:rPr>
+        <w:t xml:space="preserve">finally: always runs, error or not - the place for cleanup.</w:t>
+      </w:r>
+    </w:p>
+    <w:p>
+      <w:pPr>
+        <w:ind w:left="260" w:hanging="200"/>
+        <w:spacing w:before="0" w:after="25" w:line="230" w:lineRule="auto"/>
+      </w:pPr>
+      <w:r>
+        <w:rPr>
+          <w:sz w:val="18"/>
+          <w:szCs w:val="18"/>
+        </w:rPr>
+        <w:t xml:space="preserve">•   </w:t>
+      </w:r>
+      <w:r>
+        <w:rPr>
+          <w:sz w:val="18"/>
+          <w:szCs w:val="18"/>
+        </w:rPr>
+        <w:t xml:space="preserve">raise throws an exception; a bare raise inside except re-throws the same one after logging.</w:t>
+      </w:r>
+    </w:p>
+    <w:p>
+      <w:pPr>
+        <w:ind w:left="260" w:hanging="200"/>
+        <w:spacing w:before="0" w:after="25" w:line="230" w:lineRule="auto"/>
+      </w:pPr>
+      <w:r>
+        <w:rPr>
+          <w:sz w:val="18"/>
+          <w:szCs w:val="18"/>
+        </w:rPr>
+        <w:t xml:space="preserve">•   </w:t>
+      </w:r>
+      <w:r>
+        <w:rPr>
+          <w:sz w:val="18"/>
+          <w:szCs w:val="18"/>
+        </w:rPr>
+        <w:t xml:space="preserve">raise NewError(...) from e keeps the original cause chained - better debugging.</w:t>
+      </w:r>
+    </w:p>
+    <w:p>
+      <w:pPr>
+        <w:ind w:left="260" w:hanging="200"/>
+        <w:spacing w:before="0" w:after="25" w:line="230" w:lineRule="auto"/>
+      </w:pPr>
+      <w:r>
+        <w:rPr>
+          <w:sz w:val="18"/>
+          <w:szCs w:val="18"/>
+        </w:rPr>
+        <w:t xml:space="preserve">•   </w:t>
+      </w:r>
+      <w:r>
+        <w:rPr>
+          <w:sz w:val="18"/>
+          <w:szCs w:val="18"/>
+        </w:rPr>
+        <w:t xml:space="preserve">Bare except is dangerous: it also swallows KeyboardInterrupt and hides real bugs.</w:t>
+      </w:r>
+    </w:p>
+    <w:p>
+      <w:pPr>
+        <w:ind w:left="260" w:hanging="200"/>
+        <w:spacing w:before="0" w:after="25" w:line="230" w:lineRule="auto"/>
+      </w:pPr>
+      <w:r>
+        <w:rPr>
+          <w:sz w:val="18"/>
+          <w:szCs w:val="18"/>
+        </w:rPr>
+        <w:t xml:space="preserve">•   </w:t>
+      </w:r>
+      <w:r>
+        <w:rPr>
+          <w:sz w:val="18"/>
+          <w:szCs w:val="18"/>
+        </w:rPr>
+        <w:t xml:space="preserve">Common built-ins: ValueError, TypeError, KeyError, IndexError, FileNotFoundError, ZeroDivisionError.</w:t>
+      </w:r>
+    </w:p>
+    <w:p>
+      <w:pPr>
+        <w:ind w:left="120" w:hanging="0"/>
+        <w:spacing w:before="50" w:after="110" w:line="230" w:lineRule="auto"/>
+        <w:pBdr>
+          <w:left w:val="single" w:sz="12" w:space="4" w:color="2E5E1F"/>
+        </w:pBdr>
+      </w:pPr>
+      <w:r>
+        <w:rPr>
+          <w:b/>
+          <w:color w:val="2E5E1F"/>
+          <w:sz w:val="18"/>
+          <w:szCs w:val="18"/>
+        </w:rPr>
+        <w:t xml:space="preserve">Interview answer:  </w:t>
+      </w:r>
+      <w:r>
+        <w:rPr>
+          <w:i/>
+          <w:sz w:val="18"/>
+          <w:szCs w:val="18"/>
+        </w:rPr>
+        <w:t xml:space="preserve">try runs risky code, except handles named errors, else runs on success, finally always runs for cleanup. I catch specific exceptions, log with except Exception as e only at boundaries, and re-raise with raise ... from e to keep the cause chain.</w:t>
+      </w:r>
+    </w:p>
+    <w:p>
+      <w:pPr>
+        <w:spacing w:before="140" w:after="40" w:line="230" w:lineRule="auto"/>
+      </w:pPr>
+      <w:r>
+        <w:rPr>
+          <w:b/>
+          <w:sz w:val="21"/>
+          <w:szCs w:val="21"/>
+        </w:rPr>
+        <w:t xml:space="preserve">5.6  Custom Exceptions</w:t>
+      </w:r>
+    </w:p>
+    <w:p>
+      <w:pPr>
+        <w:spacing w:before="0" w:after="40" w:line="230" w:lineRule="auto"/>
+      </w:pPr>
+      <w:r>
+        <w:rPr>
+          <w:b/>
+          <w:sz w:val="18"/>
+          <w:szCs w:val="18"/>
+        </w:rPr>
+        <w:t xml:space="preserve">What it is:  </w:t>
+      </w:r>
+      <w:r>
+        <w:rPr>
+          <w:sz w:val="18"/>
+          <w:szCs w:val="18"/>
+        </w:rPr>
+        <w:t xml:space="preserve">A custom exception is our own error class, made by inheriting from Exception.</w:t>
+      </w:r>
+    </w:p>
+    <w:p>
+      <w:pPr>
+        <w:ind w:left="260" w:hanging="200"/>
+        <w:spacing w:before="0" w:after="25" w:line="230" w:lineRule="auto"/>
+      </w:pPr>
+      <w:r>
+        <w:rPr>
+          <w:sz w:val="18"/>
+          <w:szCs w:val="18"/>
+        </w:rPr>
+        <w:t xml:space="preserve">•   </w:t>
+      </w:r>
+      <w:r>
+        <w:rPr>
+          <w:sz w:val="18"/>
+          <w:szCs w:val="18"/>
+        </w:rPr>
+        <w:t xml:space="preserve">Minimal form: class PaymentFailedError(Exception): pass - the name itself is the documentation.</w:t>
+      </w:r>
+    </w:p>
+    <w:p>
+      <w:pPr>
+        <w:ind w:left="260" w:hanging="200"/>
+        <w:spacing w:before="0" w:after="25" w:line="230" w:lineRule="auto"/>
+      </w:pPr>
+      <w:r>
+        <w:rPr>
+          <w:sz w:val="18"/>
+          <w:szCs w:val="18"/>
+        </w:rPr>
+        <w:t xml:space="preserve">•   </w:t>
+      </w:r>
+      <w:r>
+        <w:rPr>
+          <w:sz w:val="18"/>
+          <w:szCs w:val="18"/>
+        </w:rPr>
+        <w:t xml:space="preserve">Raise it with raise PaymentFailedError("card declined").</w:t>
+      </w:r>
+    </w:p>
+    <w:p>
+      <w:pPr>
+        <w:ind w:left="260" w:hanging="200"/>
+        <w:spacing w:before="0" w:after="25" w:line="230" w:lineRule="auto"/>
+      </w:pPr>
+      <w:r>
+        <w:rPr>
+          <w:sz w:val="18"/>
+          <w:szCs w:val="18"/>
+        </w:rPr>
+        <w:t xml:space="preserve">•   </w:t>
+      </w:r>
+      <w:r>
+        <w:rPr>
+          <w:sz w:val="18"/>
+          <w:szCs w:val="18"/>
+        </w:rPr>
+        <w:t xml:space="preserve">Why: callers can catch our specific error without catching everything else - precise handling.</w:t>
+      </w:r>
+    </w:p>
+    <w:p>
+      <w:pPr>
+        <w:ind w:left="260" w:hanging="200"/>
+        <w:spacing w:before="0" w:after="25" w:line="230" w:lineRule="auto"/>
+      </w:pPr>
+      <w:r>
+        <w:rPr>
+          <w:sz w:val="18"/>
+          <w:szCs w:val="18"/>
+        </w:rPr>
+        <w:t xml:space="preserve">•   </w:t>
+      </w:r>
+      <w:r>
+        <w:rPr>
+          <w:sz w:val="18"/>
+          <w:szCs w:val="18"/>
+        </w:rPr>
+        <w:t xml:space="preserve">A base class per project (class AppError(Exception)) lets callers catch the whole family at once, with specific children under it.</w:t>
+      </w:r>
+    </w:p>
+    <w:p>
+      <w:pPr>
+        <w:ind w:left="260" w:hanging="200"/>
+        <w:spacing w:before="0" w:after="25" w:line="230" w:lineRule="auto"/>
+      </w:pPr>
+      <w:r>
+        <w:rPr>
+          <w:sz w:val="18"/>
+          <w:szCs w:val="18"/>
+        </w:rPr>
+        <w:t xml:space="preserve">•   </w:t>
+      </w:r>
+      <w:r>
+        <w:rPr>
+          <w:sz w:val="18"/>
+          <w:szCs w:val="18"/>
+        </w:rPr>
+        <w:t xml:space="preserve">Extra data can ride along: store order_id or status_code as attributes in __init__.</w:t>
+      </w:r>
+    </w:p>
+    <w:p>
+      <w:pPr>
+        <w:ind w:left="260" w:hanging="200"/>
+        <w:spacing w:before="0" w:after="25" w:line="230" w:lineRule="auto"/>
+      </w:pPr>
+      <w:r>
+        <w:rPr>
+          <w:sz w:val="18"/>
+          <w:szCs w:val="18"/>
+        </w:rPr>
+        <w:t xml:space="preserve">•   </w:t>
+      </w:r>
+      <w:r>
+        <w:rPr>
+          <w:sz w:val="18"/>
+          <w:szCs w:val="18"/>
+        </w:rPr>
+        <w:t xml:space="preserve">Frameworks do this everywhere: requests.HTTPError, django ValidationError - same pattern.</w:t>
+      </w:r>
+    </w:p>
+    <w:p>
+      <w:pPr>
+        <w:ind w:left="120" w:hanging="0"/>
+        <w:spacing w:before="50" w:after="110" w:line="230" w:lineRule="auto"/>
+        <w:pBdr>
+          <w:left w:val="single" w:sz="12" w:space="4" w:color="2E5E1F"/>
+        </w:pBdr>
+      </w:pPr>
+      <w:r>
+        <w:rPr>
+          <w:b/>
+          <w:color w:val="2E5E1F"/>
+          <w:sz w:val="18"/>
+          <w:szCs w:val="18"/>
+        </w:rPr>
+        <w:t xml:space="preserve">Interview answer:  </w:t>
+      </w:r>
+      <w:r>
+        <w:rPr>
+          <w:i/>
+          <w:sz w:val="18"/>
+          <w:szCs w:val="18"/>
+        </w:rPr>
+        <w:t xml:space="preserve">I subclass Exception to create meaningful error types, usually a project base class like AppError with specific children. Callers then catch exactly what they can handle, and the exception can carry extra context like an order id.</w:t>
+      </w:r>
+    </w:p>
+    <w:p>
+      <w:pPr>
+        <w:spacing w:before="140" w:after="40" w:line="230" w:lineRule="auto"/>
+      </w:pPr>
+      <w:r>
+        <w:rPr>
+          <w:b/>
+          <w:sz w:val="21"/>
+          <w:szCs w:val="21"/>
+        </w:rPr>
+        <w:t xml:space="preserve">5.7  Garbage Collection and Reference Counting</w:t>
+      </w:r>
+    </w:p>
+    <w:p>
+      <w:pPr>
+        <w:spacing w:before="0" w:after="40" w:line="230" w:lineRule="auto"/>
+      </w:pPr>
+      <w:r>
+        <w:rPr>
+          <w:b/>
+          <w:sz w:val="18"/>
+          <w:szCs w:val="18"/>
+        </w:rPr>
+        <w:t xml:space="preserve">What it is:  </w:t>
+      </w:r>
+      <w:r>
+        <w:rPr>
+          <w:sz w:val="18"/>
+          <w:szCs w:val="18"/>
+        </w:rPr>
+        <w:t xml:space="preserve">Python frees memory automatically using reference counting, helped by a cycle-detecting garbage collector.</w:t>
+      </w:r>
+    </w:p>
+    <w:p>
+      <w:pPr>
+        <w:ind w:left="260" w:hanging="200"/>
+        <w:spacing w:before="0" w:after="25" w:line="230" w:lineRule="auto"/>
+      </w:pPr>
+      <w:r>
+        <w:rPr>
+          <w:sz w:val="18"/>
+          <w:szCs w:val="18"/>
+        </w:rPr>
+        <w:t xml:space="preserve">•   </w:t>
+      </w:r>
+      <w:r>
+        <w:rPr>
+          <w:sz w:val="18"/>
+          <w:szCs w:val="18"/>
+        </w:rPr>
+        <w:t xml:space="preserve">Every object keeps a count of references pointing to it. Assignment raises it; del, reassignment or scope end lowers it.</w:t>
+      </w:r>
+    </w:p>
+    <w:p>
+      <w:pPr>
+        <w:ind w:left="260" w:hanging="200"/>
+        <w:spacing w:before="0" w:after="25" w:line="230" w:lineRule="auto"/>
+      </w:pPr>
+      <w:r>
+        <w:rPr>
+          <w:sz w:val="18"/>
+          <w:szCs w:val="18"/>
+        </w:rPr>
+        <w:t xml:space="preserve">•   </w:t>
+      </w:r>
+      <w:r>
+        <w:rPr>
+          <w:sz w:val="18"/>
+          <w:szCs w:val="18"/>
+        </w:rPr>
+        <w:t xml:space="preserve">When the count hits zero, the object is destroyed immediately and memory returns to Python.</w:t>
+      </w:r>
+    </w:p>
+    <w:p>
+      <w:pPr>
+        <w:ind w:left="260" w:hanging="200"/>
+        <w:spacing w:before="0" w:after="25" w:line="230" w:lineRule="auto"/>
+      </w:pPr>
+      <w:r>
+        <w:rPr>
+          <w:sz w:val="18"/>
+          <w:szCs w:val="18"/>
+        </w:rPr>
+        <w:t xml:space="preserve">•   </w:t>
+      </w:r>
+      <w:r>
+        <w:rPr>
+          <w:sz w:val="18"/>
+          <w:szCs w:val="18"/>
+        </w:rPr>
+        <w:t xml:space="preserve">Problem: two objects pointing at each other (a cycle) never reach zero alone.</w:t>
+      </w:r>
+    </w:p>
+    <w:p>
+      <w:pPr>
+        <w:ind w:left="260" w:hanging="200"/>
+        <w:spacing w:before="0" w:after="25" w:line="230" w:lineRule="auto"/>
+      </w:pPr>
+      <w:r>
+        <w:rPr>
+          <w:sz w:val="18"/>
+          <w:szCs w:val="18"/>
+        </w:rPr>
+        <w:t xml:space="preserve">•   </w:t>
+      </w:r>
+      <w:r>
+        <w:rPr>
+          <w:sz w:val="18"/>
+          <w:szCs w:val="18"/>
+        </w:rPr>
+        <w:t xml:space="preserve">The gc module's collector runs periodically, finds unreachable cycles across three generations (new objects checked often, old ones rarely), and frees them.</w:t>
+      </w:r>
+    </w:p>
+    <w:p>
+      <w:pPr>
+        <w:ind w:left="260" w:hanging="200"/>
+        <w:spacing w:before="0" w:after="25" w:line="230" w:lineRule="auto"/>
+      </w:pPr>
+      <w:r>
+        <w:rPr>
+          <w:sz w:val="18"/>
+          <w:szCs w:val="18"/>
+        </w:rPr>
+        <w:t xml:space="preserve">•   </w:t>
+      </w:r>
+      <w:r>
+        <w:rPr>
+          <w:sz w:val="18"/>
+          <w:szCs w:val="18"/>
+        </w:rPr>
+        <w:t xml:space="preserve">sys.getrefcount(obj) shows the count (one extra for the call itself). gc.collect() forces a collection.</w:t>
+      </w:r>
+    </w:p>
+    <w:p>
+      <w:pPr>
+        <w:ind w:left="260" w:hanging="200"/>
+        <w:spacing w:before="0" w:after="25" w:line="230" w:lineRule="auto"/>
+      </w:pPr>
+      <w:r>
+        <w:rPr>
+          <w:sz w:val="18"/>
+          <w:szCs w:val="18"/>
+        </w:rPr>
+        <w:t xml:space="preserve">•   </w:t>
+      </w:r>
+      <w:r>
+        <w:rPr>
+          <w:sz w:val="18"/>
+          <w:szCs w:val="18"/>
+        </w:rPr>
+        <w:t xml:space="preserve">Practical leak sources: global caches and long-lived references - memory profilers help more than blaming the GC.</w:t>
+      </w:r>
+    </w:p>
+    <w:p>
+      <w:pPr>
+        <w:ind w:left="120" w:hanging="0"/>
+        <w:spacing w:before="50" w:after="110" w:line="230" w:lineRule="auto"/>
+        <w:pBdr>
+          <w:left w:val="single" w:sz="12" w:space="4" w:color="2E5E1F"/>
+        </w:pBdr>
+      </w:pPr>
+      <w:r>
+        <w:rPr>
+          <w:b/>
+          <w:color w:val="2E5E1F"/>
+          <w:sz w:val="18"/>
+          <w:szCs w:val="18"/>
+        </w:rPr>
+        <w:t xml:space="preserve">Interview answer:  </w:t>
+      </w:r>
+      <w:r>
+        <w:rPr>
+          <w:i/>
+          <w:sz w:val="18"/>
+          <w:szCs w:val="18"/>
+        </w:rPr>
+        <w:t xml:space="preserve">CPython mainly uses reference counting - an object dies the moment its count hits zero - plus a generational garbage collector that finds and frees reference cycles which counting cannot handle.</w:t>
+      </w:r>
+    </w:p>
+    <w:p>
+      <w:pPr>
+        <w:spacing w:before="140" w:after="40" w:line="230" w:lineRule="auto"/>
+      </w:pPr>
+      <w:r>
+        <w:rPr>
+          <w:b/>
+          <w:sz w:val="21"/>
+          <w:szCs w:val="21"/>
+        </w:rPr>
+        <w:t xml:space="preserve">5.8  GIL - Global Interpreter Lock</w:t>
+      </w:r>
+    </w:p>
+    <w:p>
+      <w:pPr>
+        <w:spacing w:before="0" w:after="40" w:line="230" w:lineRule="auto"/>
+      </w:pPr>
+      <w:r>
+        <w:rPr>
+          <w:b/>
+          <w:sz w:val="18"/>
+          <w:szCs w:val="18"/>
+        </w:rPr>
+        <w:t xml:space="preserve">What it is:  </w:t>
+      </w:r>
+      <w:r>
+        <w:rPr>
+          <w:sz w:val="18"/>
+          <w:szCs w:val="18"/>
+        </w:rPr>
+        <w:t xml:space="preserve">The GIL is a lock in CPython that lets only one thread execute Python bytecode at a time.</w:t>
+      </w:r>
+    </w:p>
+    <w:p>
+      <w:pPr>
+        <w:ind w:left="260" w:hanging="200"/>
+        <w:spacing w:before="0" w:after="25" w:line="230" w:lineRule="auto"/>
+      </w:pPr>
+      <w:r>
+        <w:rPr>
+          <w:sz w:val="18"/>
+          <w:szCs w:val="18"/>
+        </w:rPr>
+        <w:t xml:space="preserve">•   </w:t>
+      </w:r>
+      <w:r>
+        <w:rPr>
+          <w:sz w:val="18"/>
+          <w:szCs w:val="18"/>
+        </w:rPr>
+        <w:t xml:space="preserve">Why it exists: it protects Python's memory management (reference counts) from race conditions, and keeps single-thread code fast and C extensions simple.</w:t>
+      </w:r>
+    </w:p>
+    <w:p>
+      <w:pPr>
+        <w:ind w:left="260" w:hanging="200"/>
+        <w:spacing w:before="0" w:after="25" w:line="230" w:lineRule="auto"/>
+      </w:pPr>
+      <w:r>
+        <w:rPr>
+          <w:sz w:val="18"/>
+          <w:szCs w:val="18"/>
+        </w:rPr>
+        <w:t xml:space="preserve">•   </w:t>
+      </w:r>
+      <w:r>
+        <w:rPr>
+          <w:sz w:val="18"/>
+          <w:szCs w:val="18"/>
+        </w:rPr>
+        <w:t xml:space="preserve">Effect: CPU-bound threads do not run in parallel - 4 threads doing maths still use one core, sometimes slower than one thread due to switching.</w:t>
+      </w:r>
+    </w:p>
+    <w:p>
+      <w:pPr>
+        <w:ind w:left="260" w:hanging="200"/>
+        <w:spacing w:before="0" w:after="25" w:line="230" w:lineRule="auto"/>
+      </w:pPr>
+      <w:r>
+        <w:rPr>
+          <w:sz w:val="18"/>
+          <w:szCs w:val="18"/>
+        </w:rPr>
+        <w:t xml:space="preserve">•   </w:t>
+      </w:r>
+      <w:r>
+        <w:rPr>
+          <w:sz w:val="18"/>
+          <w:szCs w:val="18"/>
+        </w:rPr>
+        <w:t xml:space="preserve">I/O is fine: when a thread waits on network, disk or sleep, it releases the GIL, so other threads run. Threads are genuinely useful for I/O-bound work.</w:t>
+      </w:r>
+    </w:p>
+    <w:p>
+      <w:pPr>
+        <w:ind w:left="260" w:hanging="200"/>
+        <w:spacing w:before="0" w:after="25" w:line="230" w:lineRule="auto"/>
+      </w:pPr>
+      <w:r>
+        <w:rPr>
+          <w:sz w:val="18"/>
+          <w:szCs w:val="18"/>
+        </w:rPr>
+        <w:t xml:space="preserve">•   </w:t>
+      </w:r>
+      <w:r>
+        <w:rPr>
+          <w:sz w:val="18"/>
+          <w:szCs w:val="18"/>
+        </w:rPr>
+        <w:t xml:space="preserve">For real CPU parallelism: multiprocessing (separate processes, each with its own GIL) or C-extension libraries like NumPy that release the GIL internally.</w:t>
+      </w:r>
+    </w:p>
+    <w:p>
+      <w:pPr>
+        <w:ind w:left="260" w:hanging="200"/>
+        <w:spacing w:before="0" w:after="25" w:line="230" w:lineRule="auto"/>
+      </w:pPr>
+      <w:r>
+        <w:rPr>
+          <w:sz w:val="18"/>
+          <w:szCs w:val="18"/>
+        </w:rPr>
+        <w:t xml:space="preserve">•   </w:t>
+      </w:r>
+      <w:r>
+        <w:rPr>
+          <w:sz w:val="18"/>
+          <w:szCs w:val="18"/>
+        </w:rPr>
+        <w:t xml:space="preserve">asyncio is another answer for I/O concurrency - one thread, no GIL fight at all.</w:t>
+      </w:r>
+    </w:p>
+    <w:p>
+      <w:pPr>
+        <w:ind w:left="260" w:hanging="200"/>
+        <w:spacing w:before="0" w:after="25" w:line="230" w:lineRule="auto"/>
+      </w:pPr>
+      <w:r>
+        <w:rPr>
+          <w:sz w:val="18"/>
+          <w:szCs w:val="18"/>
+        </w:rPr>
+        <w:t xml:space="preserve">•   </w:t>
+      </w:r>
+      <w:r>
+        <w:rPr>
+          <w:sz w:val="18"/>
+          <w:szCs w:val="18"/>
+        </w:rPr>
+        <w:t xml:space="preserve">Newer CPython versions are experimenting with an optional no-GIL build (free-threading), but standard builds still have the GIL.</w:t>
+      </w:r>
+    </w:p>
+    <w:p>
+      <w:pPr>
+        <w:ind w:left="120" w:hanging="0"/>
+        <w:spacing w:before="50" w:after="110" w:line="230" w:lineRule="auto"/>
+        <w:pBdr>
+          <w:left w:val="single" w:sz="12" w:space="4" w:color="2E5E1F"/>
+        </w:pBdr>
+      </w:pPr>
+      <w:r>
+        <w:rPr>
+          <w:b/>
+          <w:color w:val="2E5E1F"/>
+          <w:sz w:val="18"/>
+          <w:szCs w:val="18"/>
+        </w:rPr>
+        <w:t xml:space="preserve">Interview answer:  </w:t>
+      </w:r>
+      <w:r>
+        <w:rPr>
+          <w:i/>
+          <w:sz w:val="18"/>
+          <w:szCs w:val="18"/>
+        </w:rPr>
+        <w:t xml:space="preserve">The GIL lets only one thread run Python bytecode at a time, protecting memory management. Threads still help for I/O because the GIL is released while waiting, but CPU-heavy work needs multiprocessing or native libraries like NumPy to use multiple cores.</w:t>
+      </w:r>
+    </w:p>
+    <w:p>
+      <w:pPr>
+        <w:spacing w:before="140" w:after="40" w:line="230" w:lineRule="auto"/>
+      </w:pPr>
+      <w:r>
+        <w:rPr>
+          <w:b/>
+          <w:sz w:val="21"/>
+          <w:szCs w:val="21"/>
+        </w:rPr>
+        <w:t xml:space="preserve">5.9  Multithreading vs Multiprocessing</w:t>
+      </w:r>
+    </w:p>
+    <w:p>
+      <w:pPr>
+        <w:spacing w:before="0" w:after="40" w:line="230" w:lineRule="auto"/>
+      </w:pPr>
+      <w:r>
+        <w:rPr>
+          <w:b/>
+          <w:sz w:val="18"/>
+          <w:szCs w:val="18"/>
+        </w:rPr>
+        <w:t xml:space="preserve">What it is:  </w:t>
+      </w:r>
+      <w:r>
+        <w:rPr>
+          <w:sz w:val="18"/>
+          <w:szCs w:val="18"/>
+        </w:rPr>
+        <w:t xml:space="preserve">Threads share one process and memory; processes are independent with separate memory. In Python the GIL decides which to use.</w:t>
+      </w:r>
+    </w:p>
+    <w:p>
+      <w:pPr>
+        <w:ind w:left="260" w:hanging="200"/>
+        <w:spacing w:before="0" w:after="25" w:line="230" w:lineRule="auto"/>
+      </w:pPr>
+      <w:r>
+        <w:rPr>
+          <w:sz w:val="18"/>
+          <w:szCs w:val="18"/>
+        </w:rPr>
+        <w:t xml:space="preserve">•   </w:t>
+      </w:r>
+      <w:r>
+        <w:rPr>
+          <w:sz w:val="18"/>
+          <w:szCs w:val="18"/>
+        </w:rPr>
+        <w:t xml:space="preserve">Threading: light, shared memory, fast to start - but the GIL means no parallel Python bytecode. Best for I/O-bound work: API calls, DB queries, file downloads.</w:t>
+      </w:r>
+    </w:p>
+    <w:p>
+      <w:pPr>
+        <w:ind w:left="260" w:hanging="200"/>
+        <w:spacing w:before="0" w:after="25" w:line="230" w:lineRule="auto"/>
+      </w:pPr>
+      <w:r>
+        <w:rPr>
+          <w:sz w:val="18"/>
+          <w:szCs w:val="18"/>
+        </w:rPr>
+        <w:t xml:space="preserve">•   </w:t>
+      </w:r>
+      <w:r>
+        <w:rPr>
+          <w:sz w:val="18"/>
+          <w:szCs w:val="18"/>
+        </w:rPr>
+        <w:t xml:space="preserve">Multiprocessing: each process has its own interpreter and GIL, so real parallel CPU work across cores. Best for CPU-bound work: image processing, big calculations, ML preprocessing.</w:t>
+      </w:r>
+    </w:p>
+    <w:p>
+      <w:pPr>
+        <w:ind w:left="260" w:hanging="200"/>
+        <w:spacing w:before="0" w:after="25" w:line="230" w:lineRule="auto"/>
+      </w:pPr>
+      <w:r>
+        <w:rPr>
+          <w:sz w:val="18"/>
+          <w:szCs w:val="18"/>
+        </w:rPr>
+        <w:t xml:space="preserve">•   </w:t>
+      </w:r>
+      <w:r>
+        <w:rPr>
+          <w:sz w:val="18"/>
+          <w:szCs w:val="18"/>
+        </w:rPr>
+        <w:t xml:space="preserve">Process cost: slower start, more memory, and data must be pickled to pass between processes.</w:t>
+      </w:r>
+    </w:p>
+    <w:p>
+      <w:pPr>
+        <w:ind w:left="260" w:hanging="200"/>
+        <w:spacing w:before="0" w:after="25" w:line="230" w:lineRule="auto"/>
+      </w:pPr>
+      <w:r>
+        <w:rPr>
+          <w:sz w:val="18"/>
+          <w:szCs w:val="18"/>
+        </w:rPr>
+        <w:t xml:space="preserve">•   </w:t>
+      </w:r>
+      <w:r>
+        <w:rPr>
+          <w:sz w:val="18"/>
+          <w:szCs w:val="18"/>
+        </w:rPr>
+        <w:t xml:space="preserve">Shared-memory threading needs care: locks (threading.Lock) prevent race conditions.</w:t>
+      </w:r>
+    </w:p>
+    <w:p>
+      <w:pPr>
+        <w:ind w:left="260" w:hanging="200"/>
+        <w:spacing w:before="0" w:after="25" w:line="230" w:lineRule="auto"/>
+      </w:pPr>
+      <w:r>
+        <w:rPr>
+          <w:sz w:val="18"/>
+          <w:szCs w:val="18"/>
+        </w:rPr>
+        <w:t xml:space="preserve">•   </w:t>
+      </w:r>
+      <w:r>
+        <w:rPr>
+          <w:sz w:val="18"/>
+          <w:szCs w:val="18"/>
+        </w:rPr>
+        <w:t xml:space="preserve">Easy API for both: concurrent.futures - ThreadPoolExecutor and ProcessPoolExecutor with the same interface.</w:t>
+      </w:r>
+    </w:p>
+    <w:p>
+      <w:pPr>
+        <w:ind w:left="260" w:hanging="200"/>
+        <w:spacing w:before="0" w:after="25" w:line="230" w:lineRule="auto"/>
+      </w:pPr>
+      <w:r>
+        <w:rPr>
+          <w:sz w:val="18"/>
+          <w:szCs w:val="18"/>
+        </w:rPr>
+        <w:t xml:space="preserve">•   </w:t>
+      </w:r>
+      <w:r>
+        <w:rPr>
+          <w:sz w:val="18"/>
+          <w:szCs w:val="18"/>
+        </w:rPr>
+        <w:t xml:space="preserve">Decision rule: waiting on outside things -&gt; threads (or asyncio); burning CPU -&gt; processes.</w:t>
+      </w:r>
+    </w:p>
+    <w:p>
+      <w:pPr>
+        <w:ind w:left="260" w:hanging="200"/>
+        <w:spacing w:before="0" w:after="25" w:line="230" w:lineRule="auto"/>
+      </w:pPr>
+      <w:r>
+        <w:rPr>
+          <w:sz w:val="18"/>
+          <w:szCs w:val="18"/>
+        </w:rPr>
+        <w:t xml:space="preserve">•   </w:t>
+      </w:r>
+      <w:r>
+        <w:rPr>
+          <w:sz w:val="18"/>
+          <w:szCs w:val="18"/>
+        </w:rPr>
+        <w:t xml:space="preserve">In my scraping work I used thread pools for parallel page fetches - network wait dominates, so the GIL was not a problem.</w:t>
+      </w:r>
+    </w:p>
+    <w:p>
+      <w:pPr>
+        <w:ind w:left="120" w:hanging="0"/>
+        <w:spacing w:before="50" w:after="110" w:line="230" w:lineRule="auto"/>
+        <w:pBdr>
+          <w:left w:val="single" w:sz="12" w:space="4" w:color="2E5E1F"/>
+        </w:pBdr>
+      </w:pPr>
+      <w:r>
+        <w:rPr>
+          <w:b/>
+          <w:color w:val="2E5E1F"/>
+          <w:sz w:val="18"/>
+          <w:szCs w:val="18"/>
+        </w:rPr>
+        <w:t xml:space="preserve">Interview answer:  </w:t>
+      </w:r>
+      <w:r>
+        <w:rPr>
+          <w:i/>
+          <w:sz w:val="18"/>
+          <w:szCs w:val="18"/>
+        </w:rPr>
+        <w:t xml:space="preserve">Threads share memory and suit I/O-bound work since the GIL releases during waits; processes have separate memory and their own GIL, so they give true parallelism for CPU-bound work. I use ThreadPoolExecutor for network tasks and ProcessPoolExecutor for heavy computation.</w:t>
+      </w:r>
+    </w:p>
+    <w:p>
+      <w:pPr>
+        <w:spacing w:before="140" w:after="40" w:line="230" w:lineRule="auto"/>
+      </w:pPr>
+      <w:r>
+        <w:rPr>
+          <w:b/>
+          <w:sz w:val="21"/>
+          <w:szCs w:val="21"/>
+        </w:rPr>
+        <w:t xml:space="preserve">5.10  async / await - asyncio</w:t>
+      </w:r>
+    </w:p>
+    <w:p>
+      <w:pPr>
+        <w:spacing w:before="0" w:after="40" w:line="230" w:lineRule="auto"/>
+      </w:pPr>
+      <w:r>
+        <w:rPr>
+          <w:b/>
+          <w:sz w:val="18"/>
+          <w:szCs w:val="18"/>
+        </w:rPr>
+        <w:t xml:space="preserve">What it is:  </w:t>
+      </w:r>
+      <w:r>
+        <w:rPr>
+          <w:sz w:val="18"/>
+          <w:szCs w:val="18"/>
+        </w:rPr>
+        <w:t xml:space="preserve">asyncio gives concurrency in a single thread: tasks pause at await while waiting, and the event loop runs other tasks meanwhile.</w:t>
+      </w:r>
+    </w:p>
+    <w:p>
+      <w:pPr>
+        <w:ind w:left="260" w:hanging="200"/>
+        <w:spacing w:before="0" w:after="25" w:line="230" w:lineRule="auto"/>
+      </w:pPr>
+      <w:r>
+        <w:rPr>
+          <w:sz w:val="18"/>
+          <w:szCs w:val="18"/>
+        </w:rPr>
+        <w:t xml:space="preserve">•   </w:t>
+      </w:r>
+      <w:r>
+        <w:rPr>
+          <w:sz w:val="18"/>
+          <w:szCs w:val="18"/>
+        </w:rPr>
+        <w:t xml:space="preserve">async def makes a coroutine. Calling it gives a coroutine object; it runs only inside the event loop (asyncio.run(main())).</w:t>
+      </w:r>
+    </w:p>
+    <w:p>
+      <w:pPr>
+        <w:ind w:left="260" w:hanging="200"/>
+        <w:spacing w:before="0" w:after="25" w:line="230" w:lineRule="auto"/>
+      </w:pPr>
+      <w:r>
+        <w:rPr>
+          <w:sz w:val="18"/>
+          <w:szCs w:val="18"/>
+        </w:rPr>
+        <w:t xml:space="preserve">•   </w:t>
+      </w:r>
+      <w:r>
+        <w:rPr>
+          <w:sz w:val="18"/>
+          <w:szCs w:val="18"/>
+        </w:rPr>
+        <w:t xml:space="preserve">await pauses this task at a slow point (network, sleep) and lets the loop run other tasks - cooperative multitasking.</w:t>
+      </w:r>
+    </w:p>
+    <w:p>
+      <w:pPr>
+        <w:ind w:left="260" w:hanging="200"/>
+        <w:spacing w:before="0" w:after="25" w:line="230" w:lineRule="auto"/>
+      </w:pPr>
+      <w:r>
+        <w:rPr>
+          <w:sz w:val="18"/>
+          <w:szCs w:val="18"/>
+        </w:rPr>
+        <w:t xml:space="preserve">•   </w:t>
+      </w:r>
+      <w:r>
+        <w:rPr>
+          <w:sz w:val="18"/>
+          <w:szCs w:val="18"/>
+        </w:rPr>
+        <w:t xml:space="preserve">asyncio.gather(f1(), f2(), f3()) runs coroutines concurrently and collects all results.</w:t>
+      </w:r>
+    </w:p>
+    <w:p>
+      <w:pPr>
+        <w:ind w:left="260" w:hanging="200"/>
+        <w:spacing w:before="0" w:after="25" w:line="230" w:lineRule="auto"/>
+      </w:pPr>
+      <w:r>
+        <w:rPr>
+          <w:sz w:val="18"/>
+          <w:szCs w:val="18"/>
+        </w:rPr>
+        <w:t xml:space="preserve">•   </w:t>
+      </w:r>
+      <w:r>
+        <w:rPr>
+          <w:sz w:val="18"/>
+          <w:szCs w:val="18"/>
+        </w:rPr>
+        <w:t xml:space="preserve">One thread only: no locks fight, no GIL issue, very low overhead - thousands of concurrent connections possible.</w:t>
+      </w:r>
+    </w:p>
+    <w:p>
+      <w:pPr>
+        <w:ind w:left="260" w:hanging="200"/>
+        <w:spacing w:before="0" w:after="25" w:line="230" w:lineRule="auto"/>
+      </w:pPr>
+      <w:r>
+        <w:rPr>
+          <w:sz w:val="18"/>
+          <w:szCs w:val="18"/>
+        </w:rPr>
+        <w:t xml:space="preserve">•   </w:t>
+      </w:r>
+      <w:r>
+        <w:rPr>
+          <w:sz w:val="18"/>
+          <w:szCs w:val="18"/>
+        </w:rPr>
+        <w:t xml:space="preserve">Rule: only for I/O-bound work. CPU work inside a coroutine blocks the whole loop.</w:t>
+      </w:r>
+    </w:p>
+    <w:p>
+      <w:pPr>
+        <w:ind w:left="260" w:hanging="200"/>
+        <w:spacing w:before="0" w:after="25" w:line="230" w:lineRule="auto"/>
+      </w:pPr>
+      <w:r>
+        <w:rPr>
+          <w:sz w:val="18"/>
+          <w:szCs w:val="18"/>
+        </w:rPr>
+        <w:t xml:space="preserve">•   </w:t>
+      </w:r>
+      <w:r>
+        <w:rPr>
+          <w:sz w:val="18"/>
+          <w:szCs w:val="18"/>
+        </w:rPr>
+        <w:t xml:space="preserve">Blocking calls are poison: time.sleep or requests block everything - use asyncio.sleep and async libraries (aiohttp, httpx) instead.</w:t>
+      </w:r>
+    </w:p>
+    <w:p>
+      <w:pPr>
+        <w:ind w:left="260" w:hanging="200"/>
+        <w:spacing w:before="0" w:after="25" w:line="230" w:lineRule="auto"/>
+      </w:pPr>
+      <w:r>
+        <w:rPr>
+          <w:sz w:val="18"/>
+          <w:szCs w:val="18"/>
+        </w:rPr>
+        <w:t xml:space="preserve">•   </w:t>
+      </w:r>
+      <w:r>
+        <w:rPr>
+          <w:sz w:val="18"/>
+          <w:szCs w:val="18"/>
+        </w:rPr>
+        <w:t xml:space="preserve">FastAPI is built on this: async def endpoints let one worker serve many requests while each waits on the DB or APIs.</w:t>
+      </w:r>
+    </w:p>
+    <w:p>
+      <w:pPr>
+        <w:ind w:left="120" w:hanging="0"/>
+        <w:spacing w:before="50" w:after="110" w:line="230" w:lineRule="auto"/>
+        <w:pBdr>
+          <w:left w:val="single" w:sz="12" w:space="4" w:color="2E5E1F"/>
+        </w:pBdr>
+      </w:pPr>
+      <w:r>
+        <w:rPr>
+          <w:b/>
+          <w:color w:val="2E5E1F"/>
+          <w:sz w:val="18"/>
+          <w:szCs w:val="18"/>
+        </w:rPr>
+        <w:t xml:space="preserve">Interview answer:  </w:t>
+      </w:r>
+      <w:r>
+        <w:rPr>
+          <w:i/>
+          <w:sz w:val="18"/>
+          <w:szCs w:val="18"/>
+        </w:rPr>
+        <w:t xml:space="preserve">async/await gives single-threaded cooperative concurrency: tasks yield control at await and the event loop interleaves them, which scales I/O work to thousands of connections. FastAPI endpoints work this way. It does nothing for CPU-bound code, and blocking calls must be avoided inside coroutines.</w:t>
+      </w:r>
+    </w:p>
+    <w:p>
+      <w:pPr>
+        <w:spacing w:before="140" w:after="40" w:line="230" w:lineRule="auto"/>
+      </w:pPr>
+      <w:r>
+        <w:rPr>
+          <w:b/>
+          <w:sz w:val="21"/>
+          <w:szCs w:val="21"/>
+        </w:rPr>
+        <w:t xml:space="preserve">5.11  Modules, Packages and __name__</w:t>
+      </w:r>
+    </w:p>
+    <w:p>
+      <w:pPr>
+        <w:spacing w:before="0" w:after="40" w:line="230" w:lineRule="auto"/>
+      </w:pPr>
+      <w:r>
+        <w:rPr>
+          <w:b/>
+          <w:sz w:val="18"/>
+          <w:szCs w:val="18"/>
+        </w:rPr>
+        <w:t xml:space="preserve">What it is:  </w:t>
+      </w:r>
+      <w:r>
+        <w:rPr>
+          <w:sz w:val="18"/>
+          <w:szCs w:val="18"/>
+        </w:rPr>
+        <w:t xml:space="preserve">A module is one .py file, a package is a folder of modules, and __name__ tells whether a file is run directly or imported.</w:t>
+      </w:r>
+    </w:p>
+    <w:p>
+      <w:pPr>
+        <w:ind w:left="260" w:hanging="200"/>
+        <w:spacing w:before="0" w:after="25" w:line="230" w:lineRule="auto"/>
+      </w:pPr>
+      <w:r>
+        <w:rPr>
+          <w:sz w:val="18"/>
+          <w:szCs w:val="18"/>
+        </w:rPr>
+        <w:t xml:space="preserve">•   </w:t>
+      </w:r>
+      <w:r>
+        <w:rPr>
+          <w:sz w:val="18"/>
+          <w:szCs w:val="18"/>
+        </w:rPr>
+        <w:t xml:space="preserve">import math, from math import sqrt, import numpy as np - three import styles. from x import * pollutes the namespace; avoid it.</w:t>
+      </w:r>
+    </w:p>
+    <w:p>
+      <w:pPr>
+        <w:ind w:left="260" w:hanging="200"/>
+        <w:spacing w:before="0" w:after="25" w:line="230" w:lineRule="auto"/>
+      </w:pPr>
+      <w:r>
+        <w:rPr>
+          <w:sz w:val="18"/>
+          <w:szCs w:val="18"/>
+        </w:rPr>
+        <w:t xml:space="preserve">•   </w:t>
+      </w:r>
+      <w:r>
+        <w:rPr>
+          <w:sz w:val="18"/>
+          <w:szCs w:val="18"/>
+        </w:rPr>
+        <w:t xml:space="preserve">A package is a folder, traditionally with __init__.py, imported with dots: from app.utils import helper.</w:t>
+      </w:r>
+    </w:p>
+    <w:p>
+      <w:pPr>
+        <w:ind w:left="260" w:hanging="200"/>
+        <w:spacing w:before="0" w:after="25" w:line="230" w:lineRule="auto"/>
+      </w:pPr>
+      <w:r>
+        <w:rPr>
+          <w:sz w:val="18"/>
+          <w:szCs w:val="18"/>
+        </w:rPr>
+        <w:t xml:space="preserve">•   </w:t>
+      </w:r>
+      <w:r>
+        <w:rPr>
+          <w:sz w:val="18"/>
+          <w:szCs w:val="18"/>
+        </w:rPr>
+        <w:t xml:space="preserve">On first import, the module's code runs once and is cached in sys.modules - a second import is free.</w:t>
+      </w:r>
+    </w:p>
+    <w:p>
+      <w:pPr>
+        <w:ind w:left="260" w:hanging="200"/>
+        <w:spacing w:before="0" w:after="25" w:line="230" w:lineRule="auto"/>
+      </w:pPr>
+      <w:r>
+        <w:rPr>
+          <w:sz w:val="18"/>
+          <w:szCs w:val="18"/>
+        </w:rPr>
+        <w:t xml:space="preserve">•   </w:t>
+      </w:r>
+      <w:r>
+        <w:rPr>
+          <w:sz w:val="18"/>
+          <w:szCs w:val="18"/>
+        </w:rPr>
+        <w:t xml:space="preserve">__name__ equals "__main__" when the file is run directly, and equals the module name when imported.</w:t>
+      </w:r>
+    </w:p>
+    <w:p>
+      <w:pPr>
+        <w:ind w:left="260" w:hanging="200"/>
+        <w:spacing w:before="0" w:after="25" w:line="230" w:lineRule="auto"/>
+      </w:pPr>
+      <w:r>
+        <w:rPr>
+          <w:sz w:val="18"/>
+          <w:szCs w:val="18"/>
+        </w:rPr>
+        <w:t xml:space="preserve">•   </w:t>
+      </w:r>
+      <w:r>
+        <w:rPr>
+          <w:sz w:val="18"/>
+          <w:szCs w:val="18"/>
+        </w:rPr>
+        <w:t xml:space="preserve">if __name__ == "__main__": main() - lets the same file be both an importable library and a runnable script; tests and demos go there.</w:t>
+      </w:r>
+    </w:p>
+    <w:p>
+      <w:pPr>
+        <w:ind w:left="260" w:hanging="200"/>
+        <w:spacing w:before="0" w:after="25" w:line="230" w:lineRule="auto"/>
+      </w:pPr>
+      <w:r>
+        <w:rPr>
+          <w:sz w:val="18"/>
+          <w:szCs w:val="18"/>
+        </w:rPr>
+        <w:t xml:space="preserve">•   </w:t>
+      </w:r>
+      <w:r>
+        <w:rPr>
+          <w:sz w:val="18"/>
+          <w:szCs w:val="18"/>
+        </w:rPr>
+        <w:t xml:space="preserve">Python finds modules via sys.path: current folder, installed packages, standard library.</w:t>
+      </w:r>
+    </w:p>
+    <w:p>
+      <w:pPr>
+        <w:ind w:left="120" w:hanging="0"/>
+        <w:spacing w:before="50" w:after="110" w:line="230" w:lineRule="auto"/>
+        <w:pBdr>
+          <w:left w:val="single" w:sz="12" w:space="4" w:color="2E5E1F"/>
+        </w:pBdr>
+      </w:pPr>
+      <w:r>
+        <w:rPr>
+          <w:b/>
+          <w:color w:val="2E5E1F"/>
+          <w:sz w:val="18"/>
+          <w:szCs w:val="18"/>
+        </w:rPr>
+        <w:t xml:space="preserve">Interview answer:  </w:t>
+      </w:r>
+      <w:r>
+        <w:rPr>
+          <w:i/>
+          <w:sz w:val="18"/>
+          <w:szCs w:val="18"/>
+        </w:rPr>
+        <w:t xml:space="preserve">A module is a .py file and a package is a folder of them; imports run the module once and cache it. __name__ is "__main__" only when the file runs directly, so the if __name__ == "__main__" guard keeps script code from running on import.</w:t>
+      </w:r>
+    </w:p>
+    <w:p>
+      <w:pPr>
+        <w:spacing w:before="140" w:after="40" w:line="230" w:lineRule="auto"/>
+      </w:pPr>
+      <w:r>
+        <w:rPr>
+          <w:b/>
+          <w:sz w:val="21"/>
+          <w:szCs w:val="21"/>
+        </w:rPr>
+        <w:t xml:space="preserve">5.12  Virtual Environment and pip</w:t>
+      </w:r>
+    </w:p>
+    <w:p>
+      <w:pPr>
+        <w:spacing w:before="0" w:after="40" w:line="230" w:lineRule="auto"/>
+      </w:pPr>
+      <w:r>
+        <w:rPr>
+          <w:b/>
+          <w:sz w:val="18"/>
+          <w:szCs w:val="18"/>
+        </w:rPr>
+        <w:t xml:space="preserve">What it is:  </w:t>
+      </w:r>
+      <w:r>
+        <w:rPr>
+          <w:sz w:val="18"/>
+          <w:szCs w:val="18"/>
+        </w:rPr>
+        <w:t xml:space="preserve">A virtual environment is an isolated Python setup per project, and pip is the tool that installs packages into it.</w:t>
+      </w:r>
+    </w:p>
+    <w:p>
+      <w:pPr>
+        <w:ind w:left="260" w:hanging="200"/>
+        <w:spacing w:before="0" w:after="25" w:line="230" w:lineRule="auto"/>
+      </w:pPr>
+      <w:r>
+        <w:rPr>
+          <w:sz w:val="18"/>
+          <w:szCs w:val="18"/>
+        </w:rPr>
+        <w:t xml:space="preserve">•   </w:t>
+      </w:r>
+      <w:r>
+        <w:rPr>
+          <w:sz w:val="18"/>
+          <w:szCs w:val="18"/>
+        </w:rPr>
+        <w:t xml:space="preserve">Problem it solves: project A needs Django 4, project B needs Django 5 - one global Python cannot hold both.</w:t>
+      </w:r>
+    </w:p>
+    <w:p>
+      <w:pPr>
+        <w:ind w:left="260" w:hanging="200"/>
+        <w:spacing w:before="0" w:after="25" w:line="230" w:lineRule="auto"/>
+      </w:pPr>
+      <w:r>
+        <w:rPr>
+          <w:sz w:val="18"/>
+          <w:szCs w:val="18"/>
+        </w:rPr>
+        <w:t xml:space="preserve">•   </w:t>
+      </w:r>
+      <w:r>
+        <w:rPr>
+          <w:sz w:val="18"/>
+          <w:szCs w:val="18"/>
+        </w:rPr>
+        <w:t xml:space="preserve">Create: python -m venv venv. Activate: venv\Scripts\activate on Windows, source venv/bin/activate on Linux/Mac.</w:t>
+      </w:r>
+    </w:p>
+    <w:p>
+      <w:pPr>
+        <w:ind w:left="260" w:hanging="200"/>
+        <w:spacing w:before="0" w:after="25" w:line="230" w:lineRule="auto"/>
+      </w:pPr>
+      <w:r>
+        <w:rPr>
+          <w:sz w:val="18"/>
+          <w:szCs w:val="18"/>
+        </w:rPr>
+        <w:t xml:space="preserve">•   </w:t>
+      </w:r>
+      <w:r>
+        <w:rPr>
+          <w:sz w:val="18"/>
+          <w:szCs w:val="18"/>
+        </w:rPr>
+        <w:t xml:space="preserve">After activation, python and pip point inside the venv; installs stay local to the project.</w:t>
+      </w:r>
+    </w:p>
+    <w:p>
+      <w:pPr>
+        <w:ind w:left="260" w:hanging="200"/>
+        <w:spacing w:before="0" w:after="25" w:line="230" w:lineRule="auto"/>
+      </w:pPr>
+      <w:r>
+        <w:rPr>
+          <w:sz w:val="18"/>
+          <w:szCs w:val="18"/>
+        </w:rPr>
+        <w:t xml:space="preserve">•   </w:t>
+      </w:r>
+      <w:r>
+        <w:rPr>
+          <w:sz w:val="18"/>
+          <w:szCs w:val="18"/>
+        </w:rPr>
+        <w:t xml:space="preserve">pip install requests, pip install -r requirements.txt, pip uninstall, pip list - daily commands.</w:t>
+      </w:r>
+    </w:p>
+    <w:p>
+      <w:pPr>
+        <w:ind w:left="260" w:hanging="200"/>
+        <w:spacing w:before="0" w:after="25" w:line="230" w:lineRule="auto"/>
+      </w:pPr>
+      <w:r>
+        <w:rPr>
+          <w:sz w:val="18"/>
+          <w:szCs w:val="18"/>
+        </w:rPr>
+        <w:t xml:space="preserve">•   </w:t>
+      </w:r>
+      <w:r>
+        <w:rPr>
+          <w:sz w:val="18"/>
+          <w:szCs w:val="18"/>
+        </w:rPr>
+        <w:t xml:space="preserve">pip freeze &gt; requirements.txt records exact versions so teammates and servers reproduce the same setup.</w:t>
+      </w:r>
+    </w:p>
+    <w:p>
+      <w:pPr>
+        <w:ind w:left="260" w:hanging="200"/>
+        <w:spacing w:before="0" w:after="25" w:line="230" w:lineRule="auto"/>
+      </w:pPr>
+      <w:r>
+        <w:rPr>
+          <w:sz w:val="18"/>
+          <w:szCs w:val="18"/>
+        </w:rPr>
+        <w:t xml:space="preserve">•   </w:t>
+      </w:r>
+      <w:r>
+        <w:rPr>
+          <w:sz w:val="18"/>
+          <w:szCs w:val="18"/>
+        </w:rPr>
+        <w:t xml:space="preserve">The venv folder is never committed to git - only requirements.txt is.</w:t>
+      </w:r>
+    </w:p>
+    <w:p>
+      <w:pPr>
+        <w:ind w:left="260" w:hanging="200"/>
+        <w:spacing w:before="0" w:after="25" w:line="230" w:lineRule="auto"/>
+      </w:pPr>
+      <w:r>
+        <w:rPr>
+          <w:sz w:val="18"/>
+          <w:szCs w:val="18"/>
+        </w:rPr>
+        <w:t xml:space="preserve">•   </w:t>
+      </w:r>
+      <w:r>
+        <w:rPr>
+          <w:sz w:val="18"/>
+          <w:szCs w:val="18"/>
+        </w:rPr>
+        <w:t xml:space="preserve">Docker adds a stronger layer of the same idea - pinning the OS too. Alternatives like poetry and uv also manage lockfiles.</w:t>
+      </w:r>
+    </w:p>
+    <w:p>
+      <w:pPr>
+        <w:ind w:left="120" w:hanging="0"/>
+        <w:spacing w:before="50" w:after="110" w:line="230" w:lineRule="auto"/>
+        <w:pBdr>
+          <w:left w:val="single" w:sz="12" w:space="4" w:color="2E5E1F"/>
+        </w:pBdr>
+      </w:pPr>
+      <w:r>
+        <w:rPr>
+          <w:b/>
+          <w:color w:val="2E5E1F"/>
+          <w:sz w:val="18"/>
+          <w:szCs w:val="18"/>
+        </w:rPr>
+        <w:t xml:space="preserve">Interview answer:  </w:t>
+      </w:r>
+      <w:r>
+        <w:rPr>
+          <w:i/>
+          <w:sz w:val="18"/>
+          <w:szCs w:val="18"/>
+        </w:rPr>
+        <w:t xml:space="preserve">A venv isolates each project's packages so versions never clash: python -m venv venv, activate, then pip install. pip freeze &gt; requirements.txt captures exact versions for reproducible setups, and the venv itself stays out of git.</w:t>
       </w:r>
     </w:p>
     <w:sectPr>

</xml_diff>

<commit_message>
Phase 6: Interview Favourites (8 topics) - Python theory complete, 52/52
is vs ==, memory management, pass by object reference, monkey patching,
__new__ vs __init__, duck typing, performance tips, useful built-ins

Co-Authored-By: Claude Fable 5 <noreply@anthropic.com>
Claude-Session: https://claude.ai/code/session_01Vm8nqoCZNTvUn3BNmW1Tgz
</commit_message>
<xml_diff>
--- a/Python_Interview_Theory.docx
+++ b/Python_Interview_Theory.docx
@@ -8515,6 +8515,1552 @@
           <w:szCs w:val="18"/>
         </w:rPr>
         <w:t xml:space="preserve">A venv isolates each project's packages so versions never clash: python -m venv venv, activate, then pip install. pip freeze &gt; requirements.txt captures exact versions for reproducible setups, and the venv itself stays out of git.</w:t>
+      </w:r>
+    </w:p>
+    <w:p>
+      <w:pPr>
+        <w:spacing w:before="200" w:after="60" w:line="230" w:lineRule="auto"/>
+      </w:pPr>
+      <w:r>
+        <w:rPr>
+          <w:b/>
+          <w:color w:val="1F4E79"/>
+          <w:sz w:val="26"/>
+          <w:szCs w:val="26"/>
+        </w:rPr>
+        <w:t xml:space="preserve">Phase 6 - Interview Favourites</w:t>
+      </w:r>
+    </w:p>
+    <w:p>
+      <w:pPr>
+        <w:spacing w:before="140" w:after="40" w:line="230" w:lineRule="auto"/>
+      </w:pPr>
+      <w:r>
+        <w:rPr>
+          <w:b/>
+          <w:sz w:val="21"/>
+          <w:szCs w:val="21"/>
+        </w:rPr>
+        <w:t xml:space="preserve">6.1  is vs ==</w:t>
+      </w:r>
+    </w:p>
+    <w:p>
+      <w:pPr>
+        <w:spacing w:before="0" w:after="40" w:line="230" w:lineRule="auto"/>
+      </w:pPr>
+      <w:r>
+        <w:rPr>
+          <w:b/>
+          <w:sz w:val="18"/>
+          <w:szCs w:val="18"/>
+        </w:rPr>
+        <w:t xml:space="preserve">What it is:  </w:t>
+      </w:r>
+      <w:r>
+        <w:rPr>
+          <w:sz w:val="18"/>
+          <w:szCs w:val="18"/>
+        </w:rPr>
+        <w:t xml:space="preserve">== compares values; is compares identity - whether both names point to the very same object in memory.</w:t>
+      </w:r>
+    </w:p>
+    <w:p>
+      <w:pPr>
+        <w:ind w:left="260" w:hanging="200"/>
+        <w:spacing w:before="0" w:after="25" w:line="230" w:lineRule="auto"/>
+      </w:pPr>
+      <w:r>
+        <w:rPr>
+          <w:sz w:val="18"/>
+          <w:szCs w:val="18"/>
+        </w:rPr>
+        <w:t xml:space="preserve">•   </w:t>
+      </w:r>
+      <w:r>
+        <w:rPr>
+          <w:sz w:val="18"/>
+          <w:szCs w:val="18"/>
+        </w:rPr>
+        <w:t xml:space="preserve">a == b calls __eq__ and asks "are the values equal?".</w:t>
+      </w:r>
+    </w:p>
+    <w:p>
+      <w:pPr>
+        <w:ind w:left="260" w:hanging="200"/>
+        <w:spacing w:before="0" w:after="25" w:line="230" w:lineRule="auto"/>
+      </w:pPr>
+      <w:r>
+        <w:rPr>
+          <w:sz w:val="18"/>
+          <w:szCs w:val="18"/>
+        </w:rPr>
+        <w:t xml:space="preserve">•   </w:t>
+      </w:r>
+      <w:r>
+        <w:rPr>
+          <w:sz w:val="18"/>
+          <w:szCs w:val="18"/>
+        </w:rPr>
+        <w:t xml:space="preserve">a is b asks "same object? same id()?" - no method call, just an address check.</w:t>
+      </w:r>
+    </w:p>
+    <w:p>
+      <w:pPr>
+        <w:ind w:left="260" w:hanging="200"/>
+        <w:spacing w:before="0" w:after="25" w:line="230" w:lineRule="auto"/>
+      </w:pPr>
+      <w:r>
+        <w:rPr>
+          <w:sz w:val="18"/>
+          <w:szCs w:val="18"/>
+        </w:rPr>
+        <w:t xml:space="preserve">•   </w:t>
+      </w:r>
+      <w:r>
+        <w:rPr>
+          <w:sz w:val="18"/>
+          <w:szCs w:val="18"/>
+        </w:rPr>
+        <w:t xml:space="preserve">[1, 2] == [1, 2] is True, but [1, 2] is [1, 2] is False - two separate lists.</w:t>
+      </w:r>
+    </w:p>
+    <w:p>
+      <w:pPr>
+        <w:ind w:left="260" w:hanging="200"/>
+        <w:spacing w:before="0" w:after="25" w:line="230" w:lineRule="auto"/>
+      </w:pPr>
+      <w:r>
+        <w:rPr>
+          <w:sz w:val="18"/>
+          <w:szCs w:val="18"/>
+        </w:rPr>
+        <w:t xml:space="preserve">•   </w:t>
+      </w:r>
+      <w:r>
+        <w:rPr>
+          <w:sz w:val="18"/>
+          <w:szCs w:val="18"/>
+        </w:rPr>
+        <w:t xml:space="preserve">Correct use of is: checking None - if x is None. None is a singleton, and PEP 8 says use is, not ==.</w:t>
+      </w:r>
+    </w:p>
+    <w:p>
+      <w:pPr>
+        <w:ind w:left="260" w:hanging="200"/>
+        <w:spacing w:before="0" w:after="25" w:line="230" w:lineRule="auto"/>
+      </w:pPr>
+      <w:r>
+        <w:rPr>
+          <w:sz w:val="18"/>
+          <w:szCs w:val="18"/>
+        </w:rPr>
+        <w:t xml:space="preserve">•   </w:t>
+      </w:r>
+      <w:r>
+        <w:rPr>
+          <w:sz w:val="18"/>
+          <w:szCs w:val="18"/>
+        </w:rPr>
+        <w:t xml:space="preserve">Also right for True/False singletons and sentinel objects.</w:t>
+      </w:r>
+    </w:p>
+    <w:p>
+      <w:pPr>
+        <w:ind w:left="260" w:hanging="200"/>
+        <w:spacing w:before="0" w:after="25" w:line="230" w:lineRule="auto"/>
+      </w:pPr>
+      <w:r>
+        <w:rPr>
+          <w:sz w:val="18"/>
+          <w:szCs w:val="18"/>
+        </w:rPr>
+        <w:t xml:space="preserve">•   </w:t>
+      </w:r>
+      <w:r>
+        <w:rPr>
+          <w:sz w:val="18"/>
+          <w:szCs w:val="18"/>
+        </w:rPr>
+        <w:t xml:space="preserve">Trap: small integers (-5 to 256) and short strings are interned, so 5 is 5 happens to be True - never rely on this; it fails for bigger numbers.</w:t>
+      </w:r>
+    </w:p>
+    <w:p>
+      <w:pPr>
+        <w:ind w:left="120" w:hanging="0"/>
+        <w:spacing w:before="50" w:after="110" w:line="230" w:lineRule="auto"/>
+        <w:pBdr>
+          <w:left w:val="single" w:sz="12" w:space="4" w:color="2E5E1F"/>
+        </w:pBdr>
+      </w:pPr>
+      <w:r>
+        <w:rPr>
+          <w:b/>
+          <w:color w:val="2E5E1F"/>
+          <w:sz w:val="18"/>
+          <w:szCs w:val="18"/>
+        </w:rPr>
+        <w:t xml:space="preserve">Interview answer:  </w:t>
+      </w:r>
+      <w:r>
+        <w:rPr>
+          <w:i/>
+          <w:sz w:val="18"/>
+          <w:szCs w:val="18"/>
+        </w:rPr>
+        <w:t xml:space="preserve">== compares values via __eq__, is compares object identity (same id). Use is only for singletons like None. Small-int interning can make is look like it works for numbers - that is an implementation detail, not a rule.</w:t>
+      </w:r>
+    </w:p>
+    <w:p>
+      <w:pPr>
+        <w:spacing w:before="140" w:after="40" w:line="230" w:lineRule="auto"/>
+      </w:pPr>
+      <w:r>
+        <w:rPr>
+          <w:b/>
+          <w:sz w:val="21"/>
+          <w:szCs w:val="21"/>
+        </w:rPr>
+        <w:t xml:space="preserve">6.2  Memory Management in Python</w:t>
+      </w:r>
+    </w:p>
+    <w:p>
+      <w:pPr>
+        <w:spacing w:before="0" w:after="40" w:line="230" w:lineRule="auto"/>
+      </w:pPr>
+      <w:r>
+        <w:rPr>
+          <w:b/>
+          <w:sz w:val="18"/>
+          <w:szCs w:val="18"/>
+        </w:rPr>
+        <w:t xml:space="preserve">What it is:  </w:t>
+      </w:r>
+      <w:r>
+        <w:rPr>
+          <w:sz w:val="18"/>
+          <w:szCs w:val="18"/>
+        </w:rPr>
+        <w:t xml:space="preserve">Python manages memory automatically: a private heap, reference counting for instant cleanup, and a GC for cycles.</w:t>
+      </w:r>
+    </w:p>
+    <w:p>
+      <w:pPr>
+        <w:ind w:left="260" w:hanging="200"/>
+        <w:spacing w:before="0" w:after="25" w:line="230" w:lineRule="auto"/>
+      </w:pPr>
+      <w:r>
+        <w:rPr>
+          <w:sz w:val="18"/>
+          <w:szCs w:val="18"/>
+        </w:rPr>
+        <w:t xml:space="preserve">•   </w:t>
+      </w:r>
+      <w:r>
+        <w:rPr>
+          <w:sz w:val="18"/>
+          <w:szCs w:val="18"/>
+        </w:rPr>
+        <w:t xml:space="preserve">All objects live on a private heap run by the Python memory manager - we never free memory by hand.</w:t>
+      </w:r>
+    </w:p>
+    <w:p>
+      <w:pPr>
+        <w:ind w:left="260" w:hanging="200"/>
+        <w:spacing w:before="0" w:after="25" w:line="230" w:lineRule="auto"/>
+      </w:pPr>
+      <w:r>
+        <w:rPr>
+          <w:sz w:val="18"/>
+          <w:szCs w:val="18"/>
+        </w:rPr>
+        <w:t xml:space="preserve">•   </w:t>
+      </w:r>
+      <w:r>
+        <w:rPr>
+          <w:sz w:val="18"/>
+          <w:szCs w:val="18"/>
+        </w:rPr>
+        <w:t xml:space="preserve">Small objects (under 512 bytes) go through pymalloc, a fast allocator with size-class pools, to cut fragmentation.</w:t>
+      </w:r>
+    </w:p>
+    <w:p>
+      <w:pPr>
+        <w:ind w:left="260" w:hanging="200"/>
+        <w:spacing w:before="0" w:after="25" w:line="230" w:lineRule="auto"/>
+      </w:pPr>
+      <w:r>
+        <w:rPr>
+          <w:sz w:val="18"/>
+          <w:szCs w:val="18"/>
+        </w:rPr>
+        <w:t xml:space="preserve">•   </w:t>
+      </w:r>
+      <w:r>
+        <w:rPr>
+          <w:sz w:val="18"/>
+          <w:szCs w:val="18"/>
+        </w:rPr>
+        <w:t xml:space="preserve">Main cleanup is reference counting: count hits zero, object dies immediately.</w:t>
+      </w:r>
+    </w:p>
+    <w:p>
+      <w:pPr>
+        <w:ind w:left="260" w:hanging="200"/>
+        <w:spacing w:before="0" w:after="25" w:line="230" w:lineRule="auto"/>
+      </w:pPr>
+      <w:r>
+        <w:rPr>
+          <w:sz w:val="18"/>
+          <w:szCs w:val="18"/>
+        </w:rPr>
+        <w:t xml:space="preserve">•   </w:t>
+      </w:r>
+      <w:r>
+        <w:rPr>
+          <w:sz w:val="18"/>
+          <w:szCs w:val="18"/>
+        </w:rPr>
+        <w:t xml:space="preserve">The generational GC (3 generations) handles reference cycles that counting misses. New objects are checked often, survivors less.</w:t>
+      </w:r>
+    </w:p>
+    <w:p>
+      <w:pPr>
+        <w:ind w:left="260" w:hanging="200"/>
+        <w:spacing w:before="0" w:after="25" w:line="230" w:lineRule="auto"/>
+      </w:pPr>
+      <w:r>
+        <w:rPr>
+          <w:sz w:val="18"/>
+          <w:szCs w:val="18"/>
+        </w:rPr>
+        <w:t xml:space="preserve">•   </w:t>
+      </w:r>
+      <w:r>
+        <w:rPr>
+          <w:sz w:val="18"/>
+          <w:szCs w:val="18"/>
+        </w:rPr>
+        <w:t xml:space="preserve">Interning: small ints and many short strings are shared, saving memory.</w:t>
+      </w:r>
+    </w:p>
+    <w:p>
+      <w:pPr>
+        <w:ind w:left="260" w:hanging="200"/>
+        <w:spacing w:before="0" w:after="25" w:line="230" w:lineRule="auto"/>
+      </w:pPr>
+      <w:r>
+        <w:rPr>
+          <w:sz w:val="18"/>
+          <w:szCs w:val="18"/>
+        </w:rPr>
+        <w:t xml:space="preserve">•   </w:t>
+      </w:r>
+      <w:r>
+        <w:rPr>
+          <w:sz w:val="18"/>
+          <w:szCs w:val="18"/>
+        </w:rPr>
+        <w:t xml:space="preserve">__slots__ in a class removes the per-object dict and can cut memory a lot for millions of small objects.</w:t>
+      </w:r>
+    </w:p>
+    <w:p>
+      <w:pPr>
+        <w:ind w:left="260" w:hanging="200"/>
+        <w:spacing w:before="0" w:after="25" w:line="230" w:lineRule="auto"/>
+      </w:pPr>
+      <w:r>
+        <w:rPr>
+          <w:sz w:val="18"/>
+          <w:szCs w:val="18"/>
+        </w:rPr>
+        <w:t xml:space="preserve">•   </w:t>
+      </w:r>
+      <w:r>
+        <w:rPr>
+          <w:sz w:val="18"/>
+          <w:szCs w:val="18"/>
+        </w:rPr>
+        <w:t xml:space="preserve">Tools when hunting leaks: sys.getsizeof, gc module, tracemalloc.</w:t>
+      </w:r>
+    </w:p>
+    <w:p>
+      <w:pPr>
+        <w:ind w:left="120" w:hanging="0"/>
+        <w:spacing w:before="50" w:after="110" w:line="230" w:lineRule="auto"/>
+        <w:pBdr>
+          <w:left w:val="single" w:sz="12" w:space="4" w:color="2E5E1F"/>
+        </w:pBdr>
+      </w:pPr>
+      <w:r>
+        <w:rPr>
+          <w:b/>
+          <w:color w:val="2E5E1F"/>
+          <w:sz w:val="18"/>
+          <w:szCs w:val="18"/>
+        </w:rPr>
+        <w:t xml:space="preserve">Interview answer:  </w:t>
+      </w:r>
+      <w:r>
+        <w:rPr>
+          <w:i/>
+          <w:sz w:val="18"/>
+          <w:szCs w:val="18"/>
+        </w:rPr>
+        <w:t xml:space="preserve">Python keeps objects on a private heap with pymalloc for small allocations, frees them by reference counting the moment they are unreferenced, and runs a generational GC for cycles. For memory tuning I know interning, __slots__ and tracemalloc.</w:t>
+      </w:r>
+    </w:p>
+    <w:p>
+      <w:pPr>
+        <w:spacing w:before="140" w:after="40" w:line="230" w:lineRule="auto"/>
+      </w:pPr>
+      <w:r>
+        <w:rPr>
+          <w:b/>
+          <w:sz w:val="21"/>
+          <w:szCs w:val="21"/>
+        </w:rPr>
+        <w:t xml:space="preserve">6.3  Pass by Value or Pass by Reference?</w:t>
+      </w:r>
+    </w:p>
+    <w:p>
+      <w:pPr>
+        <w:spacing w:before="0" w:after="40" w:line="230" w:lineRule="auto"/>
+      </w:pPr>
+      <w:r>
+        <w:rPr>
+          <w:b/>
+          <w:sz w:val="18"/>
+          <w:szCs w:val="18"/>
+        </w:rPr>
+        <w:t xml:space="preserve">What it is:  </w:t>
+      </w:r>
+      <w:r>
+        <w:rPr>
+          <w:sz w:val="18"/>
+          <w:szCs w:val="18"/>
+        </w:rPr>
+        <w:t xml:space="preserve">Python is neither - it is "pass by object reference": the function receives a reference to the same object, but rebinding the parameter does not affect the caller.</w:t>
+      </w:r>
+    </w:p>
+    <w:p>
+      <w:pPr>
+        <w:ind w:left="260" w:hanging="200"/>
+        <w:spacing w:before="0" w:after="25" w:line="230" w:lineRule="auto"/>
+      </w:pPr>
+      <w:r>
+        <w:rPr>
+          <w:sz w:val="18"/>
+          <w:szCs w:val="18"/>
+        </w:rPr>
+        <w:t xml:space="preserve">•   </w:t>
+      </w:r>
+      <w:r>
+        <w:rPr>
+          <w:sz w:val="18"/>
+          <w:szCs w:val="18"/>
+        </w:rPr>
+        <w:t xml:space="preserve">The function parameter becomes another name for the same object the caller passed.</w:t>
+      </w:r>
+    </w:p>
+    <w:p>
+      <w:pPr>
+        <w:ind w:left="260" w:hanging="200"/>
+        <w:spacing w:before="0" w:after="25" w:line="230" w:lineRule="auto"/>
+      </w:pPr>
+      <w:r>
+        <w:rPr>
+          <w:sz w:val="18"/>
+          <w:szCs w:val="18"/>
+        </w:rPr>
+        <w:t xml:space="preserve">•   </w:t>
+      </w:r>
+      <w:r>
+        <w:rPr>
+          <w:sz w:val="18"/>
+          <w:szCs w:val="18"/>
+        </w:rPr>
+        <w:t xml:space="preserve">If the object is mutable and we mutate it (lst.append(4)), the caller sees the change.</w:t>
+      </w:r>
+    </w:p>
+    <w:p>
+      <w:pPr>
+        <w:ind w:left="260" w:hanging="200"/>
+        <w:spacing w:before="0" w:after="25" w:line="230" w:lineRule="auto"/>
+      </w:pPr>
+      <w:r>
+        <w:rPr>
+          <w:sz w:val="18"/>
+          <w:szCs w:val="18"/>
+        </w:rPr>
+        <w:t xml:space="preserve">•   </w:t>
+      </w:r>
+      <w:r>
+        <w:rPr>
+          <w:sz w:val="18"/>
+          <w:szCs w:val="18"/>
+        </w:rPr>
+        <w:t xml:space="preserve">If we rebind the name (lst = [9]), only the local name moves - the caller's variable is untouched.</w:t>
+      </w:r>
+    </w:p>
+    <w:p>
+      <w:pPr>
+        <w:ind w:left="260" w:hanging="200"/>
+        <w:spacing w:before="0" w:after="25" w:line="230" w:lineRule="auto"/>
+      </w:pPr>
+      <w:r>
+        <w:rPr>
+          <w:sz w:val="18"/>
+          <w:szCs w:val="18"/>
+        </w:rPr>
+        <w:t xml:space="preserve">•   </w:t>
+      </w:r>
+      <w:r>
+        <w:rPr>
+          <w:sz w:val="18"/>
+          <w:szCs w:val="18"/>
+        </w:rPr>
+        <w:t xml:space="preserve">Immutable arguments (int, str, tuple) can never be changed in place, so they feel like pass-by-value.</w:t>
+      </w:r>
+    </w:p>
+    <w:p>
+      <w:pPr>
+        <w:ind w:left="260" w:hanging="200"/>
+        <w:spacing w:before="0" w:after="25" w:line="230" w:lineRule="auto"/>
+      </w:pPr>
+      <w:r>
+        <w:rPr>
+          <w:sz w:val="18"/>
+          <w:szCs w:val="18"/>
+        </w:rPr>
+        <w:t xml:space="preserve">•   </w:t>
+      </w:r>
+      <w:r>
+        <w:rPr>
+          <w:sz w:val="18"/>
+          <w:szCs w:val="18"/>
+        </w:rPr>
+        <w:t xml:space="preserve">So the real rule is: mutation is shared, reassignment is local.</w:t>
+      </w:r>
+    </w:p>
+    <w:p>
+      <w:pPr>
+        <w:ind w:left="260" w:hanging="200"/>
+        <w:spacing w:before="0" w:after="25" w:line="230" w:lineRule="auto"/>
+      </w:pPr>
+      <w:r>
+        <w:rPr>
+          <w:sz w:val="18"/>
+          <w:szCs w:val="18"/>
+        </w:rPr>
+        <w:t xml:space="preserve">•   </w:t>
+      </w:r>
+      <w:r>
+        <w:rPr>
+          <w:sz w:val="18"/>
+          <w:szCs w:val="18"/>
+        </w:rPr>
+        <w:t xml:space="preserve">Safe pattern: return new values instead of mutating inputs, or document the mutation clearly.</w:t>
+      </w:r>
+    </w:p>
+    <w:p>
+      <w:pPr>
+        <w:ind w:left="120" w:hanging="0"/>
+        <w:spacing w:before="50" w:after="110" w:line="230" w:lineRule="auto"/>
+        <w:pBdr>
+          <w:left w:val="single" w:sz="12" w:space="4" w:color="2E5E1F"/>
+        </w:pBdr>
+      </w:pPr>
+      <w:r>
+        <w:rPr>
+          <w:b/>
+          <w:color w:val="2E5E1F"/>
+          <w:sz w:val="18"/>
+          <w:szCs w:val="18"/>
+        </w:rPr>
+        <w:t xml:space="preserve">Interview answer:  </w:t>
+      </w:r>
+      <w:r>
+        <w:rPr>
+          <w:i/>
+          <w:sz w:val="18"/>
+          <w:szCs w:val="18"/>
+        </w:rPr>
+        <w:t xml:space="preserve">Python passes object references by value - "pass by object reference". Mutating a passed mutable object is visible to the caller, but reassigning the parameter is purely local. With immutables nothing can change in place, so they behave like pass-by-value.</w:t>
+      </w:r>
+    </w:p>
+    <w:p>
+      <w:pPr>
+        <w:spacing w:before="140" w:after="40" w:line="230" w:lineRule="auto"/>
+      </w:pPr>
+      <w:r>
+        <w:rPr>
+          <w:b/>
+          <w:sz w:val="21"/>
+          <w:szCs w:val="21"/>
+        </w:rPr>
+        <w:t xml:space="preserve">6.4  Monkey Patching</w:t>
+      </w:r>
+    </w:p>
+    <w:p>
+      <w:pPr>
+        <w:spacing w:before="0" w:after="40" w:line="230" w:lineRule="auto"/>
+      </w:pPr>
+      <w:r>
+        <w:rPr>
+          <w:b/>
+          <w:sz w:val="18"/>
+          <w:szCs w:val="18"/>
+        </w:rPr>
+        <w:t xml:space="preserve">What it is:  </w:t>
+      </w:r>
+      <w:r>
+        <w:rPr>
+          <w:sz w:val="18"/>
+          <w:szCs w:val="18"/>
+        </w:rPr>
+        <w:t xml:space="preserve">Monkey patching means changing a class or module at runtime - replacing methods or functions without touching the source code.</w:t>
+      </w:r>
+    </w:p>
+    <w:p>
+      <w:pPr>
+        <w:ind w:left="260" w:hanging="200"/>
+        <w:spacing w:before="0" w:after="25" w:line="230" w:lineRule="auto"/>
+      </w:pPr>
+      <w:r>
+        <w:rPr>
+          <w:sz w:val="18"/>
+          <w:szCs w:val="18"/>
+        </w:rPr>
+        <w:t xml:space="preserve">•   </w:t>
+      </w:r>
+      <w:r>
+        <w:rPr>
+          <w:sz w:val="18"/>
+          <w:szCs w:val="18"/>
+        </w:rPr>
+        <w:t xml:space="preserve">Possible because classes and modules are mutable objects: SomeClass.method = my_new_function just works.</w:t>
+      </w:r>
+    </w:p>
+    <w:p>
+      <w:pPr>
+        <w:ind w:left="260" w:hanging="200"/>
+        <w:spacing w:before="0" w:after="25" w:line="230" w:lineRule="auto"/>
+      </w:pPr>
+      <w:r>
+        <w:rPr>
+          <w:sz w:val="18"/>
+          <w:szCs w:val="18"/>
+        </w:rPr>
+        <w:t xml:space="preserve">•   </w:t>
+      </w:r>
+      <w:r>
+        <w:rPr>
+          <w:sz w:val="18"/>
+          <w:szCs w:val="18"/>
+        </w:rPr>
+        <w:t xml:space="preserve">Legit use #1: testing - replace a network call with a fake. unittest.mock.patch is structured monkey patching that undoes itself.</w:t>
+      </w:r>
+    </w:p>
+    <w:p>
+      <w:pPr>
+        <w:ind w:left="260" w:hanging="200"/>
+        <w:spacing w:before="0" w:after="25" w:line="230" w:lineRule="auto"/>
+      </w:pPr>
+      <w:r>
+        <w:rPr>
+          <w:sz w:val="18"/>
+          <w:szCs w:val="18"/>
+        </w:rPr>
+        <w:t xml:space="preserve">•   </w:t>
+      </w:r>
+      <w:r>
+        <w:rPr>
+          <w:sz w:val="18"/>
+          <w:szCs w:val="18"/>
+        </w:rPr>
+        <w:t xml:space="preserve">Legit use #2: hot-fixing a bug in a third-party library when we cannot edit or upgrade it.</w:t>
+      </w:r>
+    </w:p>
+    <w:p>
+      <w:pPr>
+        <w:ind w:left="260" w:hanging="200"/>
+        <w:spacing w:before="0" w:after="25" w:line="230" w:lineRule="auto"/>
+      </w:pPr>
+      <w:r>
+        <w:rPr>
+          <w:sz w:val="18"/>
+          <w:szCs w:val="18"/>
+        </w:rPr>
+        <w:t xml:space="preserve">•   </w:t>
+      </w:r>
+      <w:r>
+        <w:rPr>
+          <w:sz w:val="18"/>
+          <w:szCs w:val="18"/>
+        </w:rPr>
+        <w:t xml:space="preserve">Danger: the change is global and invisible - every user of that class is affected, debugging gets confusing.</w:t>
+      </w:r>
+    </w:p>
+    <w:p>
+      <w:pPr>
+        <w:ind w:left="260" w:hanging="200"/>
+        <w:spacing w:before="0" w:after="25" w:line="230" w:lineRule="auto"/>
+      </w:pPr>
+      <w:r>
+        <w:rPr>
+          <w:sz w:val="18"/>
+          <w:szCs w:val="18"/>
+        </w:rPr>
+        <w:t xml:space="preserve">•   </w:t>
+      </w:r>
+      <w:r>
+        <w:rPr>
+          <w:sz w:val="18"/>
+          <w:szCs w:val="18"/>
+        </w:rPr>
+        <w:t xml:space="preserve">Patches can silently break when the library updates its internals.</w:t>
+      </w:r>
+    </w:p>
+    <w:p>
+      <w:pPr>
+        <w:ind w:left="260" w:hanging="200"/>
+        <w:spacing w:before="0" w:after="25" w:line="230" w:lineRule="auto"/>
+      </w:pPr>
+      <w:r>
+        <w:rPr>
+          <w:sz w:val="18"/>
+          <w:szCs w:val="18"/>
+        </w:rPr>
+        <w:t xml:space="preserve">•   </w:t>
+      </w:r>
+      <w:r>
+        <w:rPr>
+          <w:sz w:val="18"/>
+          <w:szCs w:val="18"/>
+        </w:rPr>
+        <w:t xml:space="preserve">Rule of thumb: fine in tests with mock.patch; in production code, prefer subclassing, wrapping or adapters.</w:t>
+      </w:r>
+    </w:p>
+    <w:p>
+      <w:pPr>
+        <w:ind w:left="120" w:hanging="0"/>
+        <w:spacing w:before="50" w:after="110" w:line="230" w:lineRule="auto"/>
+        <w:pBdr>
+          <w:left w:val="single" w:sz="12" w:space="4" w:color="2E5E1F"/>
+        </w:pBdr>
+      </w:pPr>
+      <w:r>
+        <w:rPr>
+          <w:b/>
+          <w:color w:val="2E5E1F"/>
+          <w:sz w:val="18"/>
+          <w:szCs w:val="18"/>
+        </w:rPr>
+        <w:t xml:space="preserve">Interview answer:  </w:t>
+      </w:r>
+      <w:r>
+        <w:rPr>
+          <w:i/>
+          <w:sz w:val="18"/>
+          <w:szCs w:val="18"/>
+        </w:rPr>
+        <w:t xml:space="preserve">Monkey patching is runtime replacement of attributes on classes or modules, possible because they are mutable. It is standard in testing via unittest.mock.patch, but in production it creates hidden global changes, so I prefer wrappers or subclasses.</w:t>
+      </w:r>
+    </w:p>
+    <w:p>
+      <w:pPr>
+        <w:spacing w:before="140" w:after="40" w:line="230" w:lineRule="auto"/>
+      </w:pPr>
+      <w:r>
+        <w:rPr>
+          <w:b/>
+          <w:sz w:val="21"/>
+          <w:szCs w:val="21"/>
+        </w:rPr>
+        <w:t xml:space="preserve">6.5  __new__ vs __init__</w:t>
+      </w:r>
+    </w:p>
+    <w:p>
+      <w:pPr>
+        <w:spacing w:before="0" w:after="40" w:line="230" w:lineRule="auto"/>
+      </w:pPr>
+      <w:r>
+        <w:rPr>
+          <w:b/>
+          <w:sz w:val="18"/>
+          <w:szCs w:val="18"/>
+        </w:rPr>
+        <w:t xml:space="preserve">What it is:  </w:t>
+      </w:r>
+      <w:r>
+        <w:rPr>
+          <w:sz w:val="18"/>
+          <w:szCs w:val="18"/>
+        </w:rPr>
+        <w:t xml:space="preserve">__new__ creates and returns the new object; __init__ then fills it with data. Creation first, initialization second.</w:t>
+      </w:r>
+    </w:p>
+    <w:p>
+      <w:pPr>
+        <w:ind w:left="260" w:hanging="200"/>
+        <w:spacing w:before="0" w:after="25" w:line="230" w:lineRule="auto"/>
+      </w:pPr>
+      <w:r>
+        <w:rPr>
+          <w:sz w:val="18"/>
+          <w:szCs w:val="18"/>
+        </w:rPr>
+        <w:t xml:space="preserve">•   </w:t>
+      </w:r>
+      <w:r>
+        <w:rPr>
+          <w:sz w:val="18"/>
+          <w:szCs w:val="18"/>
+        </w:rPr>
+        <w:t xml:space="preserve">__new__ is a static method receiving the class (cls); it allocates and returns the instance.</w:t>
+      </w:r>
+    </w:p>
+    <w:p>
+      <w:pPr>
+        <w:ind w:left="260" w:hanging="200"/>
+        <w:spacing w:before="0" w:after="25" w:line="230" w:lineRule="auto"/>
+      </w:pPr>
+      <w:r>
+        <w:rPr>
+          <w:sz w:val="18"/>
+          <w:szCs w:val="18"/>
+        </w:rPr>
+        <w:t xml:space="preserve">•   </w:t>
+      </w:r>
+      <w:r>
+        <w:rPr>
+          <w:sz w:val="18"/>
+          <w:szCs w:val="18"/>
+        </w:rPr>
+        <w:t xml:space="preserve">__init__ receives that instance as self and sets attributes. It must return None.</w:t>
+      </w:r>
+    </w:p>
+    <w:p>
+      <w:pPr>
+        <w:ind w:left="260" w:hanging="200"/>
+        <w:spacing w:before="0" w:after="25" w:line="230" w:lineRule="auto"/>
+      </w:pPr>
+      <w:r>
+        <w:rPr>
+          <w:sz w:val="18"/>
+          <w:szCs w:val="18"/>
+        </w:rPr>
+        <w:t xml:space="preserve">•   </w:t>
+      </w:r>
+      <w:r>
+        <w:rPr>
+          <w:sz w:val="18"/>
+          <w:szCs w:val="18"/>
+        </w:rPr>
+        <w:t xml:space="preserve">Call order on User("Sam"): __new__(User) -&gt; instance -&gt; __init__(instance, "Sam").</w:t>
+      </w:r>
+    </w:p>
+    <w:p>
+      <w:pPr>
+        <w:ind w:left="260" w:hanging="200"/>
+        <w:spacing w:before="0" w:after="25" w:line="230" w:lineRule="auto"/>
+      </w:pPr>
+      <w:r>
+        <w:rPr>
+          <w:sz w:val="18"/>
+          <w:szCs w:val="18"/>
+        </w:rPr>
+        <w:t xml:space="preserve">•   </w:t>
+      </w:r>
+      <w:r>
+        <w:rPr>
+          <w:sz w:val="18"/>
+          <w:szCs w:val="18"/>
+        </w:rPr>
+        <w:t xml:space="preserve">If __new__ returns an object of a different class, __init__ is skipped.</w:t>
+      </w:r>
+    </w:p>
+    <w:p>
+      <w:pPr>
+        <w:ind w:left="260" w:hanging="200"/>
+        <w:spacing w:before="0" w:after="25" w:line="230" w:lineRule="auto"/>
+      </w:pPr>
+      <w:r>
+        <w:rPr>
+          <w:sz w:val="18"/>
+          <w:szCs w:val="18"/>
+        </w:rPr>
+        <w:t xml:space="preserve">•   </w:t>
+      </w:r>
+      <w:r>
+        <w:rPr>
+          <w:sz w:val="18"/>
+          <w:szCs w:val="18"/>
+        </w:rPr>
+        <w:t xml:space="preserve">We rarely override __new__ - the classic cases are singletons (always return the same stored instance) and subclassing immutables like str or tuple, where the value must be set at creation time.</w:t>
+      </w:r>
+    </w:p>
+    <w:p>
+      <w:pPr>
+        <w:ind w:left="260" w:hanging="200"/>
+        <w:spacing w:before="0" w:after="25" w:line="230" w:lineRule="auto"/>
+      </w:pPr>
+      <w:r>
+        <w:rPr>
+          <w:sz w:val="18"/>
+          <w:szCs w:val="18"/>
+        </w:rPr>
+        <w:t xml:space="preserve">•   </w:t>
+      </w:r>
+      <w:r>
+        <w:rPr>
+          <w:sz w:val="18"/>
+          <w:szCs w:val="18"/>
+        </w:rPr>
+        <w:t xml:space="preserve">For everyday classes, only __init__ is needed.</w:t>
+      </w:r>
+    </w:p>
+    <w:p>
+      <w:pPr>
+        <w:ind w:left="120" w:hanging="0"/>
+        <w:spacing w:before="50" w:after="110" w:line="230" w:lineRule="auto"/>
+        <w:pBdr>
+          <w:left w:val="single" w:sz="12" w:space="4" w:color="2E5E1F"/>
+        </w:pBdr>
+      </w:pPr>
+      <w:r>
+        <w:rPr>
+          <w:b/>
+          <w:color w:val="2E5E1F"/>
+          <w:sz w:val="18"/>
+          <w:szCs w:val="18"/>
+        </w:rPr>
+        <w:t xml:space="preserve">Interview answer:  </w:t>
+      </w:r>
+      <w:r>
+        <w:rPr>
+          <w:i/>
+          <w:sz w:val="18"/>
+          <w:szCs w:val="18"/>
+        </w:rPr>
+        <w:t xml:space="preserve">__new__ actually creates the instance and __init__ initializes it afterwards. Overriding __new__ is rare - singleton patterns and subclassing immutable types like str, where the value exists before __init__ ever runs.</w:t>
+      </w:r>
+    </w:p>
+    <w:p>
+      <w:pPr>
+        <w:spacing w:before="140" w:after="40" w:line="230" w:lineRule="auto"/>
+      </w:pPr>
+      <w:r>
+        <w:rPr>
+          <w:b/>
+          <w:sz w:val="21"/>
+          <w:szCs w:val="21"/>
+        </w:rPr>
+        <w:t xml:space="preserve">6.6  Duck Typing</w:t>
+      </w:r>
+    </w:p>
+    <w:p>
+      <w:pPr>
+        <w:spacing w:before="0" w:after="40" w:line="230" w:lineRule="auto"/>
+      </w:pPr>
+      <w:r>
+        <w:rPr>
+          <w:b/>
+          <w:sz w:val="18"/>
+          <w:szCs w:val="18"/>
+        </w:rPr>
+        <w:t xml:space="preserve">What it is:  </w:t>
+      </w:r>
+      <w:r>
+        <w:rPr>
+          <w:sz w:val="18"/>
+          <w:szCs w:val="18"/>
+        </w:rPr>
+        <w:t xml:space="preserve">Duck typing means Python cares about what an object can do, not what class it is - "if it walks like a duck and quacks like a duck, it is a duck".</w:t>
+      </w:r>
+    </w:p>
+    <w:p>
+      <w:pPr>
+        <w:ind w:left="260" w:hanging="200"/>
+        <w:spacing w:before="0" w:after="25" w:line="230" w:lineRule="auto"/>
+      </w:pPr>
+      <w:r>
+        <w:rPr>
+          <w:sz w:val="18"/>
+          <w:szCs w:val="18"/>
+        </w:rPr>
+        <w:t xml:space="preserve">•   </w:t>
+      </w:r>
+      <w:r>
+        <w:rPr>
+          <w:sz w:val="18"/>
+          <w:szCs w:val="18"/>
+        </w:rPr>
+        <w:t xml:space="preserve">Code calls obj.read() and works with any object that has read() - file, network stream, StringIO - no inheritance needed.</w:t>
+      </w:r>
+    </w:p>
+    <w:p>
+      <w:pPr>
+        <w:ind w:left="260" w:hanging="200"/>
+        <w:spacing w:before="0" w:after="25" w:line="230" w:lineRule="auto"/>
+      </w:pPr>
+      <w:r>
+        <w:rPr>
+          <w:sz w:val="18"/>
+          <w:szCs w:val="18"/>
+        </w:rPr>
+        <w:t xml:space="preserve">•   </w:t>
+      </w:r>
+      <w:r>
+        <w:rPr>
+          <w:sz w:val="18"/>
+          <w:szCs w:val="18"/>
+        </w:rPr>
+        <w:t xml:space="preserve">This is why len() works on str, list, dict: each just implements __len__.</w:t>
+      </w:r>
+    </w:p>
+    <w:p>
+      <w:pPr>
+        <w:ind w:left="260" w:hanging="200"/>
+        <w:spacing w:before="0" w:after="25" w:line="230" w:lineRule="auto"/>
+      </w:pPr>
+      <w:r>
+        <w:rPr>
+          <w:sz w:val="18"/>
+          <w:szCs w:val="18"/>
+        </w:rPr>
+        <w:t xml:space="preserve">•   </w:t>
+      </w:r>
+      <w:r>
+        <w:rPr>
+          <w:sz w:val="18"/>
+          <w:szCs w:val="18"/>
+        </w:rPr>
+        <w:t xml:space="preserve">Contrast with static languages, where the type must be declared and match at compile time.</w:t>
+      </w:r>
+    </w:p>
+    <w:p>
+      <w:pPr>
+        <w:ind w:left="260" w:hanging="200"/>
+        <w:spacing w:before="0" w:after="25" w:line="230" w:lineRule="auto"/>
+      </w:pPr>
+      <w:r>
+        <w:rPr>
+          <w:sz w:val="18"/>
+          <w:szCs w:val="18"/>
+        </w:rPr>
+        <w:t xml:space="preserve">•   </w:t>
+      </w:r>
+      <w:r>
+        <w:rPr>
+          <w:sz w:val="18"/>
+          <w:szCs w:val="18"/>
+        </w:rPr>
+        <w:t xml:space="preserve">EAFP style fits it: "Easier to Ask Forgiveness than Permission" - try the operation, catch the exception - instead of checking types first (LBYL, "Look Before You Leap").</w:t>
+      </w:r>
+    </w:p>
+    <w:p>
+      <w:pPr>
+        <w:ind w:left="260" w:hanging="200"/>
+        <w:spacing w:before="0" w:after="25" w:line="230" w:lineRule="auto"/>
+      </w:pPr>
+      <w:r>
+        <w:rPr>
+          <w:sz w:val="18"/>
+          <w:szCs w:val="18"/>
+        </w:rPr>
+        <w:t xml:space="preserve">•   </w:t>
+      </w:r>
+      <w:r>
+        <w:rPr>
+          <w:sz w:val="18"/>
+          <w:szCs w:val="18"/>
+        </w:rPr>
+        <w:t xml:space="preserve">Risk: errors appear at runtime. Type hints plus typing.Protocol document expected behavior and let mypy check duck types statically.</w:t>
+      </w:r>
+    </w:p>
+    <w:p>
+      <w:pPr>
+        <w:ind w:left="260" w:hanging="200"/>
+        <w:spacing w:before="0" w:after="25" w:line="230" w:lineRule="auto"/>
+      </w:pPr>
+      <w:r>
+        <w:rPr>
+          <w:sz w:val="18"/>
+          <w:szCs w:val="18"/>
+        </w:rPr>
+        <w:t xml:space="preserve">•   </w:t>
+      </w:r>
+      <w:r>
+        <w:rPr>
+          <w:sz w:val="18"/>
+          <w:szCs w:val="18"/>
+        </w:rPr>
+        <w:t xml:space="preserve">In practice: accept anything file-like or iterable in functions, and the caller decides what to pass.</w:t>
+      </w:r>
+    </w:p>
+    <w:p>
+      <w:pPr>
+        <w:ind w:left="120" w:hanging="0"/>
+        <w:spacing w:before="50" w:after="110" w:line="230" w:lineRule="auto"/>
+        <w:pBdr>
+          <w:left w:val="single" w:sz="12" w:space="4" w:color="2E5E1F"/>
+        </w:pBdr>
+      </w:pPr>
+      <w:r>
+        <w:rPr>
+          <w:b/>
+          <w:color w:val="2E5E1F"/>
+          <w:sz w:val="18"/>
+          <w:szCs w:val="18"/>
+        </w:rPr>
+        <w:t xml:space="preserve">Interview answer:  </w:t>
+      </w:r>
+      <w:r>
+        <w:rPr>
+          <w:i/>
+          <w:sz w:val="18"/>
+          <w:szCs w:val="18"/>
+        </w:rPr>
+        <w:t xml:space="preserve">Duck typing judges objects by their methods, not their class - anything with read() can act as a file. It enables flexible code and the EAFP try/except style, and typing Protocols let me keep that flexibility while still getting static checks.</w:t>
+      </w:r>
+    </w:p>
+    <w:p>
+      <w:pPr>
+        <w:spacing w:before="140" w:after="40" w:line="230" w:lineRule="auto"/>
+      </w:pPr>
+      <w:r>
+        <w:rPr>
+          <w:b/>
+          <w:sz w:val="21"/>
+          <w:szCs w:val="21"/>
+        </w:rPr>
+        <w:t xml:space="preserve">6.7  Python Performance Tips</w:t>
+      </w:r>
+    </w:p>
+    <w:p>
+      <w:pPr>
+        <w:spacing w:before="0" w:after="40" w:line="230" w:lineRule="auto"/>
+      </w:pPr>
+      <w:r>
+        <w:rPr>
+          <w:b/>
+          <w:sz w:val="18"/>
+          <w:szCs w:val="18"/>
+        </w:rPr>
+        <w:t xml:space="preserve">What it is:  </w:t>
+      </w:r>
+      <w:r>
+        <w:rPr>
+          <w:sz w:val="18"/>
+          <w:szCs w:val="18"/>
+        </w:rPr>
+        <w:t xml:space="preserve">Python is slower than compiled languages, but most real speed comes from better algorithms and the right data structures, then from built-in and native tools.</w:t>
+      </w:r>
+    </w:p>
+    <w:p>
+      <w:pPr>
+        <w:ind w:left="260" w:hanging="200"/>
+        <w:spacing w:before="0" w:after="25" w:line="230" w:lineRule="auto"/>
+      </w:pPr>
+      <w:r>
+        <w:rPr>
+          <w:sz w:val="18"/>
+          <w:szCs w:val="18"/>
+        </w:rPr>
+        <w:t xml:space="preserve">•   </w:t>
+      </w:r>
+      <w:r>
+        <w:rPr>
+          <w:sz w:val="18"/>
+          <w:szCs w:val="18"/>
+        </w:rPr>
+        <w:t xml:space="preserve">First rule: measure before optimizing - timeit for snippets, cProfile for programs. Guessing wastes time.</w:t>
+      </w:r>
+    </w:p>
+    <w:p>
+      <w:pPr>
+        <w:ind w:left="260" w:hanging="200"/>
+        <w:spacing w:before="0" w:after="25" w:line="230" w:lineRule="auto"/>
+      </w:pPr>
+      <w:r>
+        <w:rPr>
+          <w:sz w:val="18"/>
+          <w:szCs w:val="18"/>
+        </w:rPr>
+        <w:t xml:space="preserve">•   </w:t>
+      </w:r>
+      <w:r>
+        <w:rPr>
+          <w:sz w:val="18"/>
+          <w:szCs w:val="18"/>
+        </w:rPr>
+        <w:t xml:space="preserve">Right data structure: set/dict membership is O(1) vs list O(n); deque for queue operations.</w:t>
+      </w:r>
+    </w:p>
+    <w:p>
+      <w:pPr>
+        <w:ind w:left="260" w:hanging="200"/>
+        <w:spacing w:before="0" w:after="25" w:line="230" w:lineRule="auto"/>
+      </w:pPr>
+      <w:r>
+        <w:rPr>
+          <w:sz w:val="18"/>
+          <w:szCs w:val="18"/>
+        </w:rPr>
+        <w:t xml:space="preserve">•   </w:t>
+      </w:r>
+      <w:r>
+        <w:rPr>
+          <w:sz w:val="18"/>
+          <w:szCs w:val="18"/>
+        </w:rPr>
+        <w:t xml:space="preserve">Built-ins are C-speed: sum, max, sorted, join beat hand-written loops.</w:t>
+      </w:r>
+    </w:p>
+    <w:p>
+      <w:pPr>
+        <w:ind w:left="260" w:hanging="200"/>
+        <w:spacing w:before="0" w:after="25" w:line="230" w:lineRule="auto"/>
+      </w:pPr>
+      <w:r>
+        <w:rPr>
+          <w:sz w:val="18"/>
+          <w:szCs w:val="18"/>
+        </w:rPr>
+        <w:t xml:space="preserve">•   </w:t>
+      </w:r>
+      <w:r>
+        <w:rPr>
+          <w:sz w:val="18"/>
+          <w:szCs w:val="18"/>
+        </w:rPr>
+        <w:t xml:space="preserve">join for strings: "".join(parts) instead of += in a loop.</w:t>
+      </w:r>
+    </w:p>
+    <w:p>
+      <w:pPr>
+        <w:ind w:left="260" w:hanging="200"/>
+        <w:spacing w:before="0" w:after="25" w:line="230" w:lineRule="auto"/>
+      </w:pPr>
+      <w:r>
+        <w:rPr>
+          <w:sz w:val="18"/>
+          <w:szCs w:val="18"/>
+        </w:rPr>
+        <w:t xml:space="preserve">•   </w:t>
+      </w:r>
+      <w:r>
+        <w:rPr>
+          <w:sz w:val="18"/>
+          <w:szCs w:val="18"/>
+        </w:rPr>
+        <w:t xml:space="preserve">Generators avoid building giant lists when one pass is enough.</w:t>
+      </w:r>
+    </w:p>
+    <w:p>
+      <w:pPr>
+        <w:ind w:left="260" w:hanging="200"/>
+        <w:spacing w:before="0" w:after="25" w:line="230" w:lineRule="auto"/>
+      </w:pPr>
+      <w:r>
+        <w:rPr>
+          <w:sz w:val="18"/>
+          <w:szCs w:val="18"/>
+        </w:rPr>
+        <w:t xml:space="preserve">•   </w:t>
+      </w:r>
+      <w:r>
+        <w:rPr>
+          <w:sz w:val="18"/>
+          <w:szCs w:val="18"/>
+        </w:rPr>
+        <w:t xml:space="preserve">Local variables are faster than global lookups inside hot loops; lru_cache removes repeated computation.</w:t>
+      </w:r>
+    </w:p>
+    <w:p>
+      <w:pPr>
+        <w:ind w:left="260" w:hanging="200"/>
+        <w:spacing w:before="0" w:after="25" w:line="230" w:lineRule="auto"/>
+      </w:pPr>
+      <w:r>
+        <w:rPr>
+          <w:sz w:val="18"/>
+          <w:szCs w:val="18"/>
+        </w:rPr>
+        <w:t xml:space="preserve">•   </w:t>
+      </w:r>
+      <w:r>
+        <w:rPr>
+          <w:sz w:val="18"/>
+          <w:szCs w:val="18"/>
+        </w:rPr>
+        <w:t xml:space="preserve">Heavy number work: NumPy/Pandas vectorization - C loops instead of Python loops.</w:t>
+      </w:r>
+    </w:p>
+    <w:p>
+      <w:pPr>
+        <w:ind w:left="260" w:hanging="200"/>
+        <w:spacing w:before="0" w:after="25" w:line="230" w:lineRule="auto"/>
+      </w:pPr>
+      <w:r>
+        <w:rPr>
+          <w:sz w:val="18"/>
+          <w:szCs w:val="18"/>
+        </w:rPr>
+        <w:t xml:space="preserve">•   </w:t>
+      </w:r>
+      <w:r>
+        <w:rPr>
+          <w:sz w:val="18"/>
+          <w:szCs w:val="18"/>
+        </w:rPr>
+        <w:t xml:space="preserve">Real parallelism: multiprocessing for CPU, threads/asyncio for I/O.</w:t>
+      </w:r>
+    </w:p>
+    <w:p>
+      <w:pPr>
+        <w:ind w:left="120" w:hanging="0"/>
+        <w:spacing w:before="50" w:after="110" w:line="230" w:lineRule="auto"/>
+        <w:pBdr>
+          <w:left w:val="single" w:sz="12" w:space="4" w:color="2E5E1F"/>
+        </w:pBdr>
+      </w:pPr>
+      <w:r>
+        <w:rPr>
+          <w:b/>
+          <w:color w:val="2E5E1F"/>
+          <w:sz w:val="18"/>
+          <w:szCs w:val="18"/>
+        </w:rPr>
+        <w:t xml:space="preserve">Interview answer:  </w:t>
+      </w:r>
+      <w:r>
+        <w:rPr>
+          <w:i/>
+          <w:sz w:val="18"/>
+          <w:szCs w:val="18"/>
+        </w:rPr>
+        <w:t xml:space="preserve">I profile first with cProfile, then fix the algorithm and data structures - set lookups over list scans - use C-speed built-ins and join, generators for memory, lru_cache for repeats, NumPy vectorization for numeric work, and multiprocessing when I truly need more cores.</w:t>
+      </w:r>
+    </w:p>
+    <w:p>
+      <w:pPr>
+        <w:spacing w:before="140" w:after="40" w:line="230" w:lineRule="auto"/>
+      </w:pPr>
+      <w:r>
+        <w:rPr>
+          <w:b/>
+          <w:sz w:val="21"/>
+          <w:szCs w:val="21"/>
+        </w:rPr>
+        <w:t xml:space="preserve">6.8  Useful Built-in Functions</w:t>
+      </w:r>
+    </w:p>
+    <w:p>
+      <w:pPr>
+        <w:spacing w:before="0" w:after="40" w:line="230" w:lineRule="auto"/>
+      </w:pPr>
+      <w:r>
+        <w:rPr>
+          <w:b/>
+          <w:sz w:val="18"/>
+          <w:szCs w:val="18"/>
+        </w:rPr>
+        <w:t xml:space="preserve">What it is:  </w:t>
+      </w:r>
+      <w:r>
+        <w:rPr>
+          <w:sz w:val="18"/>
+          <w:szCs w:val="18"/>
+        </w:rPr>
+        <w:t xml:space="preserve">A handful of built-ins - zip, enumerate, any, all, sorted and friends - solve everyday tasks in one clean line.</w:t>
+      </w:r>
+    </w:p>
+    <w:p>
+      <w:pPr>
+        <w:ind w:left="260" w:hanging="200"/>
+        <w:spacing w:before="0" w:after="25" w:line="230" w:lineRule="auto"/>
+      </w:pPr>
+      <w:r>
+        <w:rPr>
+          <w:sz w:val="18"/>
+          <w:szCs w:val="18"/>
+        </w:rPr>
+        <w:t xml:space="preserve">•   </w:t>
+      </w:r>
+      <w:r>
+        <w:rPr>
+          <w:sz w:val="18"/>
+          <w:szCs w:val="18"/>
+        </w:rPr>
+        <w:t xml:space="preserve">enumerate(items) gives (index, item) pairs - the Pythonic way to loop with a counter; start=1 shifts the base.</w:t>
+      </w:r>
+    </w:p>
+    <w:p>
+      <w:pPr>
+        <w:ind w:left="260" w:hanging="200"/>
+        <w:spacing w:before="0" w:after="25" w:line="230" w:lineRule="auto"/>
+      </w:pPr>
+      <w:r>
+        <w:rPr>
+          <w:sz w:val="18"/>
+          <w:szCs w:val="18"/>
+        </w:rPr>
+        <w:t xml:space="preserve">•   </w:t>
+      </w:r>
+      <w:r>
+        <w:rPr>
+          <w:sz w:val="18"/>
+          <w:szCs w:val="18"/>
+        </w:rPr>
+        <w:t xml:space="preserve">zip(a, b) pairs items from several iterables and stops at the shortest; zip(*pairs) unzips back.</w:t>
+      </w:r>
+    </w:p>
+    <w:p>
+      <w:pPr>
+        <w:ind w:left="260" w:hanging="200"/>
+        <w:spacing w:before="0" w:after="25" w:line="230" w:lineRule="auto"/>
+      </w:pPr>
+      <w:r>
+        <w:rPr>
+          <w:sz w:val="18"/>
+          <w:szCs w:val="18"/>
+        </w:rPr>
+        <w:t xml:space="preserve">•   </w:t>
+      </w:r>
+      <w:r>
+        <w:rPr>
+          <w:sz w:val="18"/>
+          <w:szCs w:val="18"/>
+        </w:rPr>
+        <w:t xml:space="preserve">any(iterable) is True if at least one item is truthy; all(iterable) is True only if every item is truthy - both short-circuit and pair well with generator expressions.</w:t>
+      </w:r>
+    </w:p>
+    <w:p>
+      <w:pPr>
+        <w:ind w:left="260" w:hanging="200"/>
+        <w:spacing w:before="0" w:after="25" w:line="230" w:lineRule="auto"/>
+      </w:pPr>
+      <w:r>
+        <w:rPr>
+          <w:sz w:val="18"/>
+          <w:szCs w:val="18"/>
+        </w:rPr>
+        <w:t xml:space="preserve">•   </w:t>
+      </w:r>
+      <w:r>
+        <w:rPr>
+          <w:sz w:val="18"/>
+          <w:szCs w:val="18"/>
+        </w:rPr>
+        <w:t xml:space="preserve">sorted(data, key=..., reverse=...) returns a new sorted list from any iterable; list.sort() sorts in place. The key function (or lambda) drives custom order, and Python's sort is stable.</w:t>
+      </w:r>
+    </w:p>
+    <w:p>
+      <w:pPr>
+        <w:ind w:left="260" w:hanging="200"/>
+        <w:spacing w:before="0" w:after="25" w:line="230" w:lineRule="auto"/>
+      </w:pPr>
+      <w:r>
+        <w:rPr>
+          <w:sz w:val="18"/>
+          <w:szCs w:val="18"/>
+        </w:rPr>
+        <w:t xml:space="preserve">•   </w:t>
+      </w:r>
+      <w:r>
+        <w:rPr>
+          <w:sz w:val="18"/>
+          <w:szCs w:val="18"/>
+        </w:rPr>
+        <w:t xml:space="preserve">isinstance(x, (int, float)) - type checking that respects subclasses.</w:t>
+      </w:r>
+    </w:p>
+    <w:p>
+      <w:pPr>
+        <w:ind w:left="260" w:hanging="200"/>
+        <w:spacing w:before="0" w:after="25" w:line="230" w:lineRule="auto"/>
+      </w:pPr>
+      <w:r>
+        <w:rPr>
+          <w:sz w:val="18"/>
+          <w:szCs w:val="18"/>
+        </w:rPr>
+        <w:t xml:space="preserve">•   </w:t>
+      </w:r>
+      <w:r>
+        <w:rPr>
+          <w:sz w:val="18"/>
+          <w:szCs w:val="18"/>
+        </w:rPr>
+        <w:t xml:space="preserve">getattr(obj, "name", default), hasattr, setattr - dynamic attribute access.</w:t>
+      </w:r>
+    </w:p>
+    <w:p>
+      <w:pPr>
+        <w:ind w:left="260" w:hanging="200"/>
+        <w:spacing w:before="0" w:after="25" w:line="230" w:lineRule="auto"/>
+      </w:pPr>
+      <w:r>
+        <w:rPr>
+          <w:sz w:val="18"/>
+          <w:szCs w:val="18"/>
+        </w:rPr>
+        <w:t xml:space="preserve">•   </w:t>
+      </w:r>
+      <w:r>
+        <w:rPr>
+          <w:sz w:val="18"/>
+          <w:szCs w:val="18"/>
+        </w:rPr>
+        <w:t xml:space="preserve">id(), type(), dir(), help() - inspection tools handy in debugging and interviews.</w:t>
+      </w:r>
+    </w:p>
+    <w:p>
+      <w:pPr>
+        <w:ind w:left="260" w:hanging="200"/>
+        <w:spacing w:before="0" w:after="25" w:line="230" w:lineRule="auto"/>
+      </w:pPr>
+      <w:r>
+        <w:rPr>
+          <w:sz w:val="18"/>
+          <w:szCs w:val="18"/>
+        </w:rPr>
+        <w:t xml:space="preserve">•   </w:t>
+      </w:r>
+      <w:r>
+        <w:rPr>
+          <w:sz w:val="18"/>
+          <w:szCs w:val="18"/>
+        </w:rPr>
+        <w:t xml:space="preserve">min/max/sum also accept key= and work on any iterable.</w:t>
+      </w:r>
+    </w:p>
+    <w:p>
+      <w:pPr>
+        <w:ind w:left="120" w:hanging="0"/>
+        <w:spacing w:before="50" w:after="110" w:line="230" w:lineRule="auto"/>
+        <w:pBdr>
+          <w:left w:val="single" w:sz="12" w:space="4" w:color="2E5E1F"/>
+        </w:pBdr>
+      </w:pPr>
+      <w:r>
+        <w:rPr>
+          <w:b/>
+          <w:color w:val="2E5E1F"/>
+          <w:sz w:val="18"/>
+          <w:szCs w:val="18"/>
+        </w:rPr>
+        <w:t xml:space="preserve">Interview answer:  </w:t>
+      </w:r>
+      <w:r>
+        <w:rPr>
+          <w:i/>
+          <w:sz w:val="18"/>
+          <w:szCs w:val="18"/>
+        </w:rPr>
+        <w:t xml:space="preserve">I lean on enumerate for index+item loops, zip to pair lists, any/all with generator expressions for one-line checks, and sorted with a key lambda for custom stable ordering - plus isinstance and getattr for type and attribute checks. These make code short and readable.</w:t>
       </w:r>
     </w:p>
     <w:sectPr>

</xml_diff>